<commit_message>
"cleaning_data" was added for preparing the data and giving a first report
</commit_message>
<xml_diff>
--- a/report.docx
+++ b/report.docx
@@ -1,6 +1,6 @@
 
 <file path=word/document.xml><?xml version="1.0" encoding="utf-8"?>
-<w:document xmlns:wpc="http://schemas.microsoft.com/office/word/2010/wordprocessingCanvas" xmlns:cx="http://schemas.microsoft.com/office/drawing/2014/chartex" xmlns:cx1="http://schemas.microsoft.com/office/drawing/2015/9/8/chartex" xmlns:cx2="http://schemas.microsoft.com/office/drawing/2015/10/21/chartex" xmlns:cx3="http://schemas.microsoft.com/office/drawing/2016/5/9/chartex" xmlns:cx4="http://schemas.microsoft.com/office/drawing/2016/5/10/chartex" xmlns:cx5="http://schemas.microsoft.com/office/drawing/2016/5/11/chartex" xmlns:cx6="http://schemas.microsoft.com/office/drawing/2016/5/12/chartex" xmlns:cx7="http://schemas.microsoft.com/office/drawing/2016/5/13/chartex" xmlns:cx8="http://schemas.microsoft.com/office/drawing/2016/5/14/chartex" xmlns:mc="http://schemas.openxmlformats.org/markup-compatibility/2006" xmlns:aink="http://schemas.microsoft.com/office/drawing/2016/ink" xmlns:am3d="http://schemas.microsoft.com/office/drawing/2017/model3d" xmlns:o="urn:schemas-microsoft-com:office:office" xmlns:oel="http://schemas.microsoft.com/office/2019/extlst" xmlns:r="http://schemas.openxmlformats.org/officeDocument/2006/relationships" xmlns:m="http://schemas.openxmlformats.org/officeDocument/2006/math" xmlns:v="urn:schemas-microsoft-com:vml" xmlns:wp14="http://schemas.microsoft.com/office/word/2010/wordprocessingDrawing" xmlns:wp="http://schemas.openxmlformats.org/drawingml/2006/wordprocessingDrawing" xmlns:w10="urn:schemas-microsoft-com:office:word" xmlns:w="http://schemas.openxmlformats.org/wordprocessingml/2006/main" xmlns:w14="http://schemas.microsoft.com/office/word/2010/wordml" xmlns:w15="http://schemas.microsoft.com/office/word/2012/wordml" xmlns:w16cex="http://schemas.microsoft.com/office/word/2018/wordml/cex" xmlns:w16cid="http://schemas.microsoft.com/office/word/2016/wordml/cid" xmlns:w16="http://schemas.microsoft.com/office/word/2018/wordml" xmlns:w16du="http://schemas.microsoft.com/office/word/2023/wordml/word16du" xmlns:w16sdtdh="http://schemas.microsoft.com/office/word/2020/wordml/sdtdatahash" xmlns:w16sdtfl="http://schemas.microsoft.com/office/word/2024/wordml/sdtformatlock" xmlns:w16se="http://schemas.microsoft.com/office/word/2015/wordml/symex" xmlns:wpg="http://schemas.microsoft.com/office/word/2010/wordprocessingGroup" xmlns:wpi="http://schemas.microsoft.com/office/word/2010/wordprocessingInk" xmlns:wne="http://schemas.microsoft.com/office/word/2006/wordml" xmlns:wps="http://schemas.microsoft.com/office/word/2010/wordprocessingShape" mc:Ignorable="w14 w15 w16se w16cid w16 w16cex w16sdtdh w16sdtfl w16du wp14">
+<w:document xmlns:wpc="http://schemas.microsoft.com/office/word/2010/wordprocessingCanvas" xmlns:cx="http://schemas.microsoft.com/office/drawing/2014/chartex" xmlns:cx1="http://schemas.microsoft.com/office/drawing/2015/9/8/chartex" xmlns:cx2="http://schemas.microsoft.com/office/drawing/2015/10/21/chartex" xmlns:cx3="http://schemas.microsoft.com/office/drawing/2016/5/9/chartex" xmlns:cx4="http://schemas.microsoft.com/office/drawing/2016/5/10/chartex" xmlns:cx5="http://schemas.microsoft.com/office/drawing/2016/5/11/chartex" xmlns:cx6="http://schemas.microsoft.com/office/drawing/2016/5/12/chartex" xmlns:cx7="http://schemas.microsoft.com/office/drawing/2016/5/13/chartex" xmlns:cx8="http://schemas.microsoft.com/office/drawing/2016/5/14/chartex" xmlns:mc="http://schemas.openxmlformats.org/markup-compatibility/2006" xmlns:aink="http://schemas.microsoft.com/office/drawing/2016/ink" xmlns:am3d="http://schemas.microsoft.com/office/drawing/2017/model3d" xmlns:o="urn:schemas-microsoft-com:office:office" xmlns:oel="http://schemas.microsoft.com/office/2019/extlst" xmlns:r="http://schemas.openxmlformats.org/officeDocument/2006/relationships" xmlns:m="http://schemas.openxmlformats.org/officeDocument/2006/math" xmlns:v="urn:schemas-microsoft-com:vml" xmlns:wp14="http://schemas.microsoft.com/office/word/2010/wordprocessingDrawing" xmlns:wp="http://schemas.openxmlformats.org/drawingml/2006/wordprocessingDrawing" xmlns:w10="urn:schemas-microsoft-com:office:word" xmlns:w="http://schemas.openxmlformats.org/wordprocessingml/2006/main" xmlns:w14="http://schemas.microsoft.com/office/word/2010/wordml" xmlns:w15="http://schemas.microsoft.com/office/word/2012/wordml" xmlns:w16cei="http://schemas.microsoft.com/office/word/2026/wordml/cei" xmlns:w16cex="http://schemas.microsoft.com/office/word/2018/wordml/cex" xmlns:w16cid="http://schemas.microsoft.com/office/word/2016/wordml/cid" xmlns:w16="http://schemas.microsoft.com/office/word/2018/wordml" xmlns:w16du="http://schemas.microsoft.com/office/word/2023/wordml/word16du" xmlns:w16sdtdh="http://schemas.microsoft.com/office/word/2020/wordml/sdtdatahash" xmlns:w16sdtfl="http://schemas.microsoft.com/office/word/2024/wordml/sdtformatlock" xmlns:w16se="http://schemas.microsoft.com/office/word/2015/wordml/symex" xmlns:wpg="http://schemas.microsoft.com/office/word/2010/wordprocessingGroup" xmlns:wpi="http://schemas.microsoft.com/office/word/2010/wordprocessingInk" xmlns:wne="http://schemas.microsoft.com/office/word/2006/wordml" xmlns:wps="http://schemas.microsoft.com/office/word/2010/wordprocessingShape" mc:Ignorable="w14 w15 w16se w16cid w16 w16cex w16sdtdh w16sdtfl w16du wp14">
   <w:body>
     <w:tbl>
       <w:tblPr>
@@ -22,7 +22,7 @@
           </w:tcPr>
           <w:p>
             <w:pPr>
-              <w:pStyle w:val="NoSpacing"/>
+              <w:pStyle w:val="KeinLeerraum"/>
               <w:rPr>
                 <w:b/>
                 <w:bCs/>
@@ -42,7 +42,7 @@
           </w:tcPr>
           <w:p>
             <w:pPr>
-              <w:pStyle w:val="NoSpacing"/>
+              <w:pStyle w:val="KeinLeerraum"/>
               <w:rPr>
                 <w:b/>
                 <w:bCs/>
@@ -68,7 +68,6 @@
           <w:docPartUnique/>
         </w:docPartObj>
       </w:sdtPr>
-      <w:sdtEndPr/>
       <w:sdtContent>
         <w:p>
           <w:pPr>
@@ -79,7 +78,7 @@
         </w:p>
         <w:tbl>
           <w:tblPr>
-            <w:tblStyle w:val="TableGrid"/>
+            <w:tblStyle w:val="Tabellenraster"/>
             <w:tblW w:w="0" w:type="auto"/>
             <w:tblBorders>
               <w:top w:val="none" w:sz="0" w:space="0" w:color="auto"/>
@@ -833,7 +832,7 @@
               </w:tcPr>
               <w:p>
                 <w:pPr>
-                  <w:pStyle w:val="NoSpacing"/>
+                  <w:pStyle w:val="KeinLeerraum"/>
                   <w:rPr>
                     <w:rFonts w:ascii="Arial" w:hAnsi="Arial" w:cs="Arial"/>
                   </w:rPr>
@@ -887,11 +886,10 @@
           <w:docPartUnique/>
         </w:docPartObj>
       </w:sdtPr>
-      <w:sdtEndPr/>
       <w:sdtContent>
         <w:p>
           <w:pPr>
-            <w:pStyle w:val="TOCHeading"/>
+            <w:pStyle w:val="Inhaltsverzeichnisberschrift"/>
             <w:rPr>
               <w:rFonts w:ascii="Arial" w:eastAsiaTheme="minorEastAsia" w:hAnsi="Arial" w:cs="Arial"/>
               <w:color w:val="000000" w:themeColor="text1"/>
@@ -911,7 +909,7 @@
         </w:p>
         <w:p>
           <w:pPr>
-            <w:pStyle w:val="TOC1"/>
+            <w:pStyle w:val="Verzeichnis1"/>
             <w:tabs>
               <w:tab w:val="right" w:leader="dot" w:pos="8210"/>
             </w:tabs>
@@ -922,7 +920,7 @@
         </w:p>
         <w:p>
           <w:pPr>
-            <w:pStyle w:val="TOC1"/>
+            <w:pStyle w:val="Verzeichnis1"/>
             <w:tabs>
               <w:tab w:val="left" w:pos="440"/>
               <w:tab w:val="right" w:leader="dot" w:pos="8210"/>
@@ -1036,7 +1034,7 @@
         </w:p>
         <w:p>
           <w:pPr>
-            <w:pStyle w:val="TOC1"/>
+            <w:pStyle w:val="Verzeichnis1"/>
             <w:tabs>
               <w:tab w:val="left" w:pos="440"/>
               <w:tab w:val="right" w:leader="dot" w:pos="8210"/>
@@ -1132,7 +1130,7 @@
         </w:p>
         <w:p>
           <w:pPr>
-            <w:pStyle w:val="TOC1"/>
+            <w:pStyle w:val="Verzeichnis1"/>
             <w:tabs>
               <w:tab w:val="left" w:pos="440"/>
               <w:tab w:val="right" w:leader="dot" w:pos="8210"/>
@@ -1228,7 +1226,7 @@
         </w:p>
         <w:p>
           <w:pPr>
-            <w:pStyle w:val="TOC1"/>
+            <w:pStyle w:val="Verzeichnis1"/>
             <w:tabs>
               <w:tab w:val="left" w:pos="440"/>
               <w:tab w:val="right" w:leader="dot" w:pos="8210"/>
@@ -1326,7 +1324,7 @@
         </w:p>
         <w:p>
           <w:pPr>
-            <w:pStyle w:val="TOC1"/>
+            <w:pStyle w:val="Verzeichnis1"/>
             <w:tabs>
               <w:tab w:val="left" w:pos="440"/>
               <w:tab w:val="right" w:leader="dot" w:pos="8210"/>
@@ -1424,7 +1422,7 @@
         </w:p>
         <w:p>
           <w:pPr>
-            <w:pStyle w:val="TOC1"/>
+            <w:pStyle w:val="Verzeichnis1"/>
             <w:tabs>
               <w:tab w:val="left" w:pos="440"/>
               <w:tab w:val="right" w:leader="dot" w:pos="8210"/>
@@ -1545,7 +1543,7 @@
     </w:sdt>
     <w:p>
       <w:pPr>
-        <w:pStyle w:val="ListParagraph"/>
+        <w:pStyle w:val="Listenabsatz"/>
         <w:numPr>
           <w:ilvl w:val="0"/>
           <w:numId w:val="25"/>
@@ -1564,6 +1562,7 @@
           <w:rFonts w:ascii="Arial" w:hAnsi="Arial" w:cs="Arial"/>
           <w:b/>
         </w:rPr>
+        <w:lastRenderedPageBreak/>
         <w:t>Introduction</w:t>
       </w:r>
       <w:bookmarkEnd w:id="0"/>
@@ -1642,7 +1641,7 @@
     </w:p>
     <w:p>
       <w:pPr>
-        <w:pStyle w:val="ListParagraph"/>
+        <w:pStyle w:val="Listenabsatz"/>
         <w:numPr>
           <w:ilvl w:val="0"/>
           <w:numId w:val="25"/>
@@ -1698,13 +1697,33 @@
         <w:rPr>
           <w:rFonts w:ascii="Arial" w:hAnsi="Arial" w:cs="Arial"/>
           <w:bCs/>
-          <w:lang w:val="en-GB"/>
         </w:rPr>
       </w:pPr>
+      <w:r>
+        <w:rPr>
+          <w:rFonts w:ascii="Arial" w:hAnsi="Arial" w:cs="Arial"/>
+          <w:bCs/>
+        </w:rPr>
+        <w:t xml:space="preserve">Sensor 31 am besten entfernen, </w:t>
+      </w:r>
+      <w:r>
+        <w:rPr>
+          <w:rFonts w:ascii="Arial" w:hAnsi="Arial" w:cs="Arial"/>
+          <w:bCs/>
+        </w:rPr>
+        <w:t>d</w:t>
+      </w:r>
+      <w:r>
+        <w:rPr>
+          <w:rFonts w:ascii="Arial" w:hAnsi="Arial" w:cs="Arial"/>
+          <w:bCs/>
+        </w:rPr>
+        <w:t>a die werte dort beim cleaning bzw bei den flags häufig als unplausibel gewertet wurden</w:t>
+      </w:r>
     </w:p>
     <w:p>
       <w:pPr>
-        <w:pStyle w:val="ListParagraph"/>
+        <w:pStyle w:val="Listenabsatz"/>
         <w:numPr>
           <w:ilvl w:val="0"/>
           <w:numId w:val="25"/>
@@ -1759,7 +1778,7 @@
     </w:p>
     <w:p>
       <w:pPr>
-        <w:pStyle w:val="ListParagraph"/>
+        <w:pStyle w:val="Listenabsatz"/>
         <w:numPr>
           <w:ilvl w:val="0"/>
           <w:numId w:val="25"/>
@@ -1816,7 +1835,7 @@
     </w:p>
     <w:p>
       <w:pPr>
-        <w:pStyle w:val="ListParagraph"/>
+        <w:pStyle w:val="Listenabsatz"/>
         <w:numPr>
           <w:ilvl w:val="0"/>
           <w:numId w:val="25"/>
@@ -1903,7 +1922,7 @@
     </w:p>
     <w:p>
       <w:pPr>
-        <w:pStyle w:val="ListParagraph"/>
+        <w:pStyle w:val="Listenabsatz"/>
         <w:numPr>
           <w:ilvl w:val="0"/>
           <w:numId w:val="25"/>
@@ -1923,6 +1942,7 @@
           <w:b/>
           <w:lang w:val="en-GB"/>
         </w:rPr>
+        <w:lastRenderedPageBreak/>
         <w:t>References</w:t>
       </w:r>
       <w:bookmarkEnd w:id="5"/>
@@ -1951,7 +1971,7 @@
 </file>
 
 <file path=word/endnotes.xml><?xml version="1.0" encoding="utf-8"?>
-<w:endnotes xmlns:wpc="http://schemas.microsoft.com/office/word/2010/wordprocessingCanvas" xmlns:cx="http://schemas.microsoft.com/office/drawing/2014/chartex" xmlns:cx1="http://schemas.microsoft.com/office/drawing/2015/9/8/chartex" xmlns:cx2="http://schemas.microsoft.com/office/drawing/2015/10/21/chartex" xmlns:cx3="http://schemas.microsoft.com/office/drawing/2016/5/9/chartex" xmlns:cx4="http://schemas.microsoft.com/office/drawing/2016/5/10/chartex" xmlns:cx5="http://schemas.microsoft.com/office/drawing/2016/5/11/chartex" xmlns:cx6="http://schemas.microsoft.com/office/drawing/2016/5/12/chartex" xmlns:cx7="http://schemas.microsoft.com/office/drawing/2016/5/13/chartex" xmlns:cx8="http://schemas.microsoft.com/office/drawing/2016/5/14/chartex" xmlns:mc="http://schemas.openxmlformats.org/markup-compatibility/2006" xmlns:aink="http://schemas.microsoft.com/office/drawing/2016/ink" xmlns:am3d="http://schemas.microsoft.com/office/drawing/2017/model3d" xmlns:o="urn:schemas-microsoft-com:office:office" xmlns:oel="http://schemas.microsoft.com/office/2019/extlst" xmlns:r="http://schemas.openxmlformats.org/officeDocument/2006/relationships" xmlns:m="http://schemas.openxmlformats.org/officeDocument/2006/math" xmlns:v="urn:schemas-microsoft-com:vml" xmlns:wp14="http://schemas.microsoft.com/office/word/2010/wordprocessingDrawing" xmlns:wp="http://schemas.openxmlformats.org/drawingml/2006/wordprocessingDrawing" xmlns:w10="urn:schemas-microsoft-com:office:word" xmlns:w="http://schemas.openxmlformats.org/wordprocessingml/2006/main" xmlns:w14="http://schemas.microsoft.com/office/word/2010/wordml" xmlns:w15="http://schemas.microsoft.com/office/word/2012/wordml" xmlns:w16cex="http://schemas.microsoft.com/office/word/2018/wordml/cex" xmlns:w16cid="http://schemas.microsoft.com/office/word/2016/wordml/cid" xmlns:w16="http://schemas.microsoft.com/office/word/2018/wordml" xmlns:w16du="http://schemas.microsoft.com/office/word/2023/wordml/word16du" xmlns:w16sdtdh="http://schemas.microsoft.com/office/word/2020/wordml/sdtdatahash" xmlns:w16sdtfl="http://schemas.microsoft.com/office/word/2024/wordml/sdtformatlock" xmlns:w16se="http://schemas.microsoft.com/office/word/2015/wordml/symex" xmlns:wpg="http://schemas.microsoft.com/office/word/2010/wordprocessingGroup" xmlns:wpi="http://schemas.microsoft.com/office/word/2010/wordprocessingInk" xmlns:wne="http://schemas.microsoft.com/office/word/2006/wordml" xmlns:wps="http://schemas.microsoft.com/office/word/2010/wordprocessingShape" mc:Ignorable="w14 w15 w16se w16cid w16 w16cex w16sdtdh w16sdtfl w16du wp14">
+<w:endnotes xmlns:wpc="http://schemas.microsoft.com/office/word/2010/wordprocessingCanvas" xmlns:cx="http://schemas.microsoft.com/office/drawing/2014/chartex" xmlns:cx1="http://schemas.microsoft.com/office/drawing/2015/9/8/chartex" xmlns:cx2="http://schemas.microsoft.com/office/drawing/2015/10/21/chartex" xmlns:cx3="http://schemas.microsoft.com/office/drawing/2016/5/9/chartex" xmlns:cx4="http://schemas.microsoft.com/office/drawing/2016/5/10/chartex" xmlns:cx5="http://schemas.microsoft.com/office/drawing/2016/5/11/chartex" xmlns:cx6="http://schemas.microsoft.com/office/drawing/2016/5/12/chartex" xmlns:cx7="http://schemas.microsoft.com/office/drawing/2016/5/13/chartex" xmlns:cx8="http://schemas.microsoft.com/office/drawing/2016/5/14/chartex" xmlns:mc="http://schemas.openxmlformats.org/markup-compatibility/2006" xmlns:aink="http://schemas.microsoft.com/office/drawing/2016/ink" xmlns:am3d="http://schemas.microsoft.com/office/drawing/2017/model3d" xmlns:o="urn:schemas-microsoft-com:office:office" xmlns:oel="http://schemas.microsoft.com/office/2019/extlst" xmlns:r="http://schemas.openxmlformats.org/officeDocument/2006/relationships" xmlns:m="http://schemas.openxmlformats.org/officeDocument/2006/math" xmlns:v="urn:schemas-microsoft-com:vml" xmlns:wp14="http://schemas.microsoft.com/office/word/2010/wordprocessingDrawing" xmlns:wp="http://schemas.openxmlformats.org/drawingml/2006/wordprocessingDrawing" xmlns:w10="urn:schemas-microsoft-com:office:word" xmlns:w="http://schemas.openxmlformats.org/wordprocessingml/2006/main" xmlns:w14="http://schemas.microsoft.com/office/word/2010/wordml" xmlns:w15="http://schemas.microsoft.com/office/word/2012/wordml" xmlns:w16cei="http://schemas.microsoft.com/office/word/2026/wordml/cei" xmlns:w16cex="http://schemas.microsoft.com/office/word/2018/wordml/cex" xmlns:w16cid="http://schemas.microsoft.com/office/word/2016/wordml/cid" xmlns:w16="http://schemas.microsoft.com/office/word/2018/wordml" xmlns:w16du="http://schemas.microsoft.com/office/word/2023/wordml/word16du" xmlns:w16sdtdh="http://schemas.microsoft.com/office/word/2020/wordml/sdtdatahash" xmlns:w16sdtfl="http://schemas.microsoft.com/office/word/2024/wordml/sdtformatlock" xmlns:w16se="http://schemas.microsoft.com/office/word/2015/wordml/symex" xmlns:wpg="http://schemas.microsoft.com/office/word/2010/wordprocessingGroup" xmlns:wpi="http://schemas.microsoft.com/office/word/2010/wordprocessingInk" xmlns:wne="http://schemas.microsoft.com/office/word/2006/wordml" xmlns:wps="http://schemas.microsoft.com/office/word/2010/wordprocessingShape" mc:Ignorable="w14 w15 w16se w16cid w16 w16cex w16sdtdh w16sdtfl w16du wp14">
   <w:endnote w:type="separator" w:id="-1">
     <w:p>
       <w:r>
@@ -1970,11 +1990,11 @@
 </file>
 
 <file path=word/footer1.xml><?xml version="1.0" encoding="utf-8"?>
-<w:ftr xmlns:wpc="http://schemas.microsoft.com/office/word/2010/wordprocessingCanvas" xmlns:cx="http://schemas.microsoft.com/office/drawing/2014/chartex" xmlns:cx1="http://schemas.microsoft.com/office/drawing/2015/9/8/chartex" xmlns:cx2="http://schemas.microsoft.com/office/drawing/2015/10/21/chartex" xmlns:cx3="http://schemas.microsoft.com/office/drawing/2016/5/9/chartex" xmlns:cx4="http://schemas.microsoft.com/office/drawing/2016/5/10/chartex" xmlns:cx5="http://schemas.microsoft.com/office/drawing/2016/5/11/chartex" xmlns:cx6="http://schemas.microsoft.com/office/drawing/2016/5/12/chartex" xmlns:cx7="http://schemas.microsoft.com/office/drawing/2016/5/13/chartex" xmlns:cx8="http://schemas.microsoft.com/office/drawing/2016/5/14/chartex" xmlns:mc="http://schemas.openxmlformats.org/markup-compatibility/2006" xmlns:aink="http://schemas.microsoft.com/office/drawing/2016/ink" xmlns:am3d="http://schemas.microsoft.com/office/drawing/2017/model3d" xmlns:o="urn:schemas-microsoft-com:office:office" xmlns:oel="http://schemas.microsoft.com/office/2019/extlst" xmlns:r="http://schemas.openxmlformats.org/officeDocument/2006/relationships" xmlns:m="http://schemas.openxmlformats.org/officeDocument/2006/math" xmlns:v="urn:schemas-microsoft-com:vml" xmlns:wp14="http://schemas.microsoft.com/office/word/2010/wordprocessingDrawing" xmlns:wp="http://schemas.openxmlformats.org/drawingml/2006/wordprocessingDrawing" xmlns:w10="urn:schemas-microsoft-com:office:word" xmlns:w="http://schemas.openxmlformats.org/wordprocessingml/2006/main" xmlns:w14="http://schemas.microsoft.com/office/word/2010/wordml" xmlns:w15="http://schemas.microsoft.com/office/word/2012/wordml" xmlns:w16cex="http://schemas.microsoft.com/office/word/2018/wordml/cex" xmlns:w16cid="http://schemas.microsoft.com/office/word/2016/wordml/cid" xmlns:w16="http://schemas.microsoft.com/office/word/2018/wordml" xmlns:w16du="http://schemas.microsoft.com/office/word/2023/wordml/word16du" xmlns:w16sdtdh="http://schemas.microsoft.com/office/word/2020/wordml/sdtdatahash" xmlns:w16sdtfl="http://schemas.microsoft.com/office/word/2024/wordml/sdtformatlock" xmlns:w16se="http://schemas.microsoft.com/office/word/2015/wordml/symex" xmlns:wpg="http://schemas.microsoft.com/office/word/2010/wordprocessingGroup" xmlns:wpi="http://schemas.microsoft.com/office/word/2010/wordprocessingInk" xmlns:wne="http://schemas.microsoft.com/office/word/2006/wordml" xmlns:wps="http://schemas.microsoft.com/office/word/2010/wordprocessingShape" mc:Ignorable="w14 w15 w16se w16cid w16 w16cex w16sdtdh w16sdtfl w16du wp14">
+<w:ftr xmlns:wpc="http://schemas.microsoft.com/office/word/2010/wordprocessingCanvas" xmlns:cx="http://schemas.microsoft.com/office/drawing/2014/chartex" xmlns:cx1="http://schemas.microsoft.com/office/drawing/2015/9/8/chartex" xmlns:cx2="http://schemas.microsoft.com/office/drawing/2015/10/21/chartex" xmlns:cx3="http://schemas.microsoft.com/office/drawing/2016/5/9/chartex" xmlns:cx4="http://schemas.microsoft.com/office/drawing/2016/5/10/chartex" xmlns:cx5="http://schemas.microsoft.com/office/drawing/2016/5/11/chartex" xmlns:cx6="http://schemas.microsoft.com/office/drawing/2016/5/12/chartex" xmlns:cx7="http://schemas.microsoft.com/office/drawing/2016/5/13/chartex" xmlns:cx8="http://schemas.microsoft.com/office/drawing/2016/5/14/chartex" xmlns:mc="http://schemas.openxmlformats.org/markup-compatibility/2006" xmlns:aink="http://schemas.microsoft.com/office/drawing/2016/ink" xmlns:am3d="http://schemas.microsoft.com/office/drawing/2017/model3d" xmlns:o="urn:schemas-microsoft-com:office:office" xmlns:oel="http://schemas.microsoft.com/office/2019/extlst" xmlns:r="http://schemas.openxmlformats.org/officeDocument/2006/relationships" xmlns:m="http://schemas.openxmlformats.org/officeDocument/2006/math" xmlns:v="urn:schemas-microsoft-com:vml" xmlns:wp14="http://schemas.microsoft.com/office/word/2010/wordprocessingDrawing" xmlns:wp="http://schemas.openxmlformats.org/drawingml/2006/wordprocessingDrawing" xmlns:w10="urn:schemas-microsoft-com:office:word" xmlns:w="http://schemas.openxmlformats.org/wordprocessingml/2006/main" xmlns:w14="http://schemas.microsoft.com/office/word/2010/wordml" xmlns:w15="http://schemas.microsoft.com/office/word/2012/wordml" xmlns:w16cei="http://schemas.microsoft.com/office/word/2026/wordml/cei" xmlns:w16cex="http://schemas.microsoft.com/office/word/2018/wordml/cex" xmlns:w16cid="http://schemas.microsoft.com/office/word/2016/wordml/cid" xmlns:w16="http://schemas.microsoft.com/office/word/2018/wordml" xmlns:w16du="http://schemas.microsoft.com/office/word/2023/wordml/word16du" xmlns:w16sdtdh="http://schemas.microsoft.com/office/word/2020/wordml/sdtdatahash" xmlns:w16sdtfl="http://schemas.microsoft.com/office/word/2024/wordml/sdtformatlock" xmlns:w16se="http://schemas.microsoft.com/office/word/2015/wordml/symex" xmlns:wpg="http://schemas.microsoft.com/office/word/2010/wordprocessingGroup" xmlns:wpi="http://schemas.microsoft.com/office/word/2010/wordprocessingInk" xmlns:wne="http://schemas.microsoft.com/office/word/2006/wordml" xmlns:wps="http://schemas.microsoft.com/office/word/2010/wordprocessingShape" mc:Ignorable="w14 w15 w16se w16cid w16 w16cex w16sdtdh w16sdtfl w16du wp14">
   <w:sdt>
     <w:sdtPr>
       <w:rPr>
-        <w:rStyle w:val="PageNumber"/>
+        <w:rStyle w:val="Seitenzahl"/>
       </w:rPr>
       <w:id w:val="1291318251"/>
       <w:docPartObj>
@@ -1982,35 +2002,30 @@
         <w:docPartUnique/>
       </w:docPartObj>
     </w:sdtPr>
-    <w:sdtEndPr>
-      <w:rPr>
-        <w:rStyle w:val="PageNumber"/>
-      </w:rPr>
-    </w:sdtEndPr>
     <w:sdtContent>
       <w:p>
         <w:pPr>
-          <w:pStyle w:val="Footer"/>
+          <w:pStyle w:val="Fuzeile"/>
           <w:framePr w:wrap="none" w:vAnchor="text" w:hAnchor="margin" w:xAlign="center" w:y="1"/>
           <w:rPr>
-            <w:rStyle w:val="PageNumber"/>
+            <w:rStyle w:val="Seitenzahl"/>
           </w:rPr>
         </w:pPr>
         <w:r>
           <w:rPr>
-            <w:rStyle w:val="PageNumber"/>
+            <w:rStyle w:val="Seitenzahl"/>
           </w:rPr>
           <w:fldChar w:fldCharType="begin"/>
         </w:r>
         <w:r>
           <w:rPr>
-            <w:rStyle w:val="PageNumber"/>
+            <w:rStyle w:val="Seitenzahl"/>
           </w:rPr>
           <w:instrText xml:space="preserve"> PAGE </w:instrText>
         </w:r>
         <w:r>
           <w:rPr>
-            <w:rStyle w:val="PageNumber"/>
+            <w:rStyle w:val="Seitenzahl"/>
           </w:rPr>
           <w:fldChar w:fldCharType="end"/>
         </w:r>
@@ -2019,14 +2034,14 @@
   </w:sdt>
   <w:p>
     <w:pPr>
-      <w:pStyle w:val="Footer"/>
+      <w:pStyle w:val="Fuzeile"/>
     </w:pPr>
   </w:p>
 </w:ftr>
 </file>
 
 <file path=word/footer2.xml><?xml version="1.0" encoding="utf-8"?>
-<w:ftr xmlns:wpc="http://schemas.microsoft.com/office/word/2010/wordprocessingCanvas" xmlns:cx="http://schemas.microsoft.com/office/drawing/2014/chartex" xmlns:cx1="http://schemas.microsoft.com/office/drawing/2015/9/8/chartex" xmlns:cx2="http://schemas.microsoft.com/office/drawing/2015/10/21/chartex" xmlns:cx3="http://schemas.microsoft.com/office/drawing/2016/5/9/chartex" xmlns:cx4="http://schemas.microsoft.com/office/drawing/2016/5/10/chartex" xmlns:cx5="http://schemas.microsoft.com/office/drawing/2016/5/11/chartex" xmlns:cx6="http://schemas.microsoft.com/office/drawing/2016/5/12/chartex" xmlns:cx7="http://schemas.microsoft.com/office/drawing/2016/5/13/chartex" xmlns:cx8="http://schemas.microsoft.com/office/drawing/2016/5/14/chartex" xmlns:mc="http://schemas.openxmlformats.org/markup-compatibility/2006" xmlns:aink="http://schemas.microsoft.com/office/drawing/2016/ink" xmlns:am3d="http://schemas.microsoft.com/office/drawing/2017/model3d" xmlns:o="urn:schemas-microsoft-com:office:office" xmlns:oel="http://schemas.microsoft.com/office/2019/extlst" xmlns:r="http://schemas.openxmlformats.org/officeDocument/2006/relationships" xmlns:m="http://schemas.openxmlformats.org/officeDocument/2006/math" xmlns:v="urn:schemas-microsoft-com:vml" xmlns:wp14="http://schemas.microsoft.com/office/word/2010/wordprocessingDrawing" xmlns:wp="http://schemas.openxmlformats.org/drawingml/2006/wordprocessingDrawing" xmlns:w10="urn:schemas-microsoft-com:office:word" xmlns:w="http://schemas.openxmlformats.org/wordprocessingml/2006/main" xmlns:w14="http://schemas.microsoft.com/office/word/2010/wordml" xmlns:w15="http://schemas.microsoft.com/office/word/2012/wordml" xmlns:w16cex="http://schemas.microsoft.com/office/word/2018/wordml/cex" xmlns:w16cid="http://schemas.microsoft.com/office/word/2016/wordml/cid" xmlns:w16="http://schemas.microsoft.com/office/word/2018/wordml" xmlns:w16du="http://schemas.microsoft.com/office/word/2023/wordml/word16du" xmlns:w16sdtdh="http://schemas.microsoft.com/office/word/2020/wordml/sdtdatahash" xmlns:w16sdtfl="http://schemas.microsoft.com/office/word/2024/wordml/sdtformatlock" xmlns:w16se="http://schemas.microsoft.com/office/word/2015/wordml/symex" xmlns:wpg="http://schemas.microsoft.com/office/word/2010/wordprocessingGroup" xmlns:wpi="http://schemas.microsoft.com/office/word/2010/wordprocessingInk" xmlns:wne="http://schemas.microsoft.com/office/word/2006/wordml" xmlns:wps="http://schemas.microsoft.com/office/word/2010/wordprocessingShape" mc:Ignorable="w14 w15 w16se w16cid w16 w16cex w16sdtdh w16sdtfl w16du wp14">
+<w:ftr xmlns:wpc="http://schemas.microsoft.com/office/word/2010/wordprocessingCanvas" xmlns:cx="http://schemas.microsoft.com/office/drawing/2014/chartex" xmlns:cx1="http://schemas.microsoft.com/office/drawing/2015/9/8/chartex" xmlns:cx2="http://schemas.microsoft.com/office/drawing/2015/10/21/chartex" xmlns:cx3="http://schemas.microsoft.com/office/drawing/2016/5/9/chartex" xmlns:cx4="http://schemas.microsoft.com/office/drawing/2016/5/10/chartex" xmlns:cx5="http://schemas.microsoft.com/office/drawing/2016/5/11/chartex" xmlns:cx6="http://schemas.microsoft.com/office/drawing/2016/5/12/chartex" xmlns:cx7="http://schemas.microsoft.com/office/drawing/2016/5/13/chartex" xmlns:cx8="http://schemas.microsoft.com/office/drawing/2016/5/14/chartex" xmlns:mc="http://schemas.openxmlformats.org/markup-compatibility/2006" xmlns:aink="http://schemas.microsoft.com/office/drawing/2016/ink" xmlns:am3d="http://schemas.microsoft.com/office/drawing/2017/model3d" xmlns:o="urn:schemas-microsoft-com:office:office" xmlns:oel="http://schemas.microsoft.com/office/2019/extlst" xmlns:r="http://schemas.openxmlformats.org/officeDocument/2006/relationships" xmlns:m="http://schemas.openxmlformats.org/officeDocument/2006/math" xmlns:v="urn:schemas-microsoft-com:vml" xmlns:wp14="http://schemas.microsoft.com/office/word/2010/wordprocessingDrawing" xmlns:wp="http://schemas.openxmlformats.org/drawingml/2006/wordprocessingDrawing" xmlns:w10="urn:schemas-microsoft-com:office:word" xmlns:w="http://schemas.openxmlformats.org/wordprocessingml/2006/main" xmlns:w14="http://schemas.microsoft.com/office/word/2010/wordml" xmlns:w15="http://schemas.microsoft.com/office/word/2012/wordml" xmlns:w16cei="http://schemas.microsoft.com/office/word/2026/wordml/cei" xmlns:w16cex="http://schemas.microsoft.com/office/word/2018/wordml/cex" xmlns:w16cid="http://schemas.microsoft.com/office/word/2016/wordml/cid" xmlns:w16="http://schemas.microsoft.com/office/word/2018/wordml" xmlns:w16du="http://schemas.microsoft.com/office/word/2023/wordml/word16du" xmlns:w16sdtdh="http://schemas.microsoft.com/office/word/2020/wordml/sdtdatahash" xmlns:w16sdtfl="http://schemas.microsoft.com/office/word/2024/wordml/sdtformatlock" xmlns:w16se="http://schemas.microsoft.com/office/word/2015/wordml/symex" xmlns:wpg="http://schemas.microsoft.com/office/word/2010/wordprocessingGroup" xmlns:wpi="http://schemas.microsoft.com/office/word/2010/wordprocessingInk" xmlns:wne="http://schemas.microsoft.com/office/word/2006/wordml" xmlns:wps="http://schemas.microsoft.com/office/word/2010/wordprocessingShape" mc:Ignorable="w14 w15 w16se w16cid w16 w16cex w16sdtdh w16sdtfl w16du wp14">
   <w:sdt>
     <w:sdtPr>
       <w:id w:val="2006939010"/>
@@ -2035,11 +2050,10 @@
         <w:docPartUnique/>
       </w:docPartObj>
     </w:sdtPr>
-    <w:sdtEndPr/>
     <w:sdtContent>
       <w:p>
         <w:pPr>
-          <w:pStyle w:val="Footer"/>
+          <w:pStyle w:val="Fuzeile"/>
           <w:jc w:val="center"/>
         </w:pPr>
         <w:r>
@@ -2065,14 +2079,14 @@
   </w:sdt>
   <w:p>
     <w:pPr>
-      <w:pStyle w:val="Footer"/>
+      <w:pStyle w:val="Fuzeile"/>
     </w:pPr>
   </w:p>
 </w:ftr>
 </file>
 
 <file path=word/footer3.xml><?xml version="1.0" encoding="utf-8"?>
-<w:ftr xmlns:wpc="http://schemas.microsoft.com/office/word/2010/wordprocessingCanvas" xmlns:cx="http://schemas.microsoft.com/office/drawing/2014/chartex" xmlns:cx1="http://schemas.microsoft.com/office/drawing/2015/9/8/chartex" xmlns:cx2="http://schemas.microsoft.com/office/drawing/2015/10/21/chartex" xmlns:cx3="http://schemas.microsoft.com/office/drawing/2016/5/9/chartex" xmlns:cx4="http://schemas.microsoft.com/office/drawing/2016/5/10/chartex" xmlns:cx5="http://schemas.microsoft.com/office/drawing/2016/5/11/chartex" xmlns:cx6="http://schemas.microsoft.com/office/drawing/2016/5/12/chartex" xmlns:cx7="http://schemas.microsoft.com/office/drawing/2016/5/13/chartex" xmlns:cx8="http://schemas.microsoft.com/office/drawing/2016/5/14/chartex" xmlns:mc="http://schemas.openxmlformats.org/markup-compatibility/2006" xmlns:aink="http://schemas.microsoft.com/office/drawing/2016/ink" xmlns:am3d="http://schemas.microsoft.com/office/drawing/2017/model3d" xmlns:o="urn:schemas-microsoft-com:office:office" xmlns:oel="http://schemas.microsoft.com/office/2019/extlst" xmlns:r="http://schemas.openxmlformats.org/officeDocument/2006/relationships" xmlns:m="http://schemas.openxmlformats.org/officeDocument/2006/math" xmlns:v="urn:schemas-microsoft-com:vml" xmlns:wp14="http://schemas.microsoft.com/office/word/2010/wordprocessingDrawing" xmlns:wp="http://schemas.openxmlformats.org/drawingml/2006/wordprocessingDrawing" xmlns:w10="urn:schemas-microsoft-com:office:word" xmlns:w="http://schemas.openxmlformats.org/wordprocessingml/2006/main" xmlns:w14="http://schemas.microsoft.com/office/word/2010/wordml" xmlns:w15="http://schemas.microsoft.com/office/word/2012/wordml" xmlns:w16cex="http://schemas.microsoft.com/office/word/2018/wordml/cex" xmlns:w16cid="http://schemas.microsoft.com/office/word/2016/wordml/cid" xmlns:w16="http://schemas.microsoft.com/office/word/2018/wordml" xmlns:w16du="http://schemas.microsoft.com/office/word/2023/wordml/word16du" xmlns:w16sdtdh="http://schemas.microsoft.com/office/word/2020/wordml/sdtdatahash" xmlns:w16sdtfl="http://schemas.microsoft.com/office/word/2024/wordml/sdtformatlock" xmlns:w16se="http://schemas.microsoft.com/office/word/2015/wordml/symex" xmlns:wpg="http://schemas.microsoft.com/office/word/2010/wordprocessingGroup" xmlns:wpi="http://schemas.microsoft.com/office/word/2010/wordprocessingInk" xmlns:wne="http://schemas.microsoft.com/office/word/2006/wordml" xmlns:wps="http://schemas.microsoft.com/office/word/2010/wordprocessingShape" mc:Ignorable="w14 w15 w16se w16cid w16 w16cex w16sdtdh w16sdtfl w16du wp14">
+<w:ftr xmlns:wpc="http://schemas.microsoft.com/office/word/2010/wordprocessingCanvas" xmlns:cx="http://schemas.microsoft.com/office/drawing/2014/chartex" xmlns:cx1="http://schemas.microsoft.com/office/drawing/2015/9/8/chartex" xmlns:cx2="http://schemas.microsoft.com/office/drawing/2015/10/21/chartex" xmlns:cx3="http://schemas.microsoft.com/office/drawing/2016/5/9/chartex" xmlns:cx4="http://schemas.microsoft.com/office/drawing/2016/5/10/chartex" xmlns:cx5="http://schemas.microsoft.com/office/drawing/2016/5/11/chartex" xmlns:cx6="http://schemas.microsoft.com/office/drawing/2016/5/12/chartex" xmlns:cx7="http://schemas.microsoft.com/office/drawing/2016/5/13/chartex" xmlns:cx8="http://schemas.microsoft.com/office/drawing/2016/5/14/chartex" xmlns:mc="http://schemas.openxmlformats.org/markup-compatibility/2006" xmlns:aink="http://schemas.microsoft.com/office/drawing/2016/ink" xmlns:am3d="http://schemas.microsoft.com/office/drawing/2017/model3d" xmlns:o="urn:schemas-microsoft-com:office:office" xmlns:oel="http://schemas.microsoft.com/office/2019/extlst" xmlns:r="http://schemas.openxmlformats.org/officeDocument/2006/relationships" xmlns:m="http://schemas.openxmlformats.org/officeDocument/2006/math" xmlns:v="urn:schemas-microsoft-com:vml" xmlns:wp14="http://schemas.microsoft.com/office/word/2010/wordprocessingDrawing" xmlns:wp="http://schemas.openxmlformats.org/drawingml/2006/wordprocessingDrawing" xmlns:w10="urn:schemas-microsoft-com:office:word" xmlns:w="http://schemas.openxmlformats.org/wordprocessingml/2006/main" xmlns:w14="http://schemas.microsoft.com/office/word/2010/wordml" xmlns:w15="http://schemas.microsoft.com/office/word/2012/wordml" xmlns:w16cei="http://schemas.microsoft.com/office/word/2026/wordml/cei" xmlns:w16cex="http://schemas.microsoft.com/office/word/2018/wordml/cex" xmlns:w16cid="http://schemas.microsoft.com/office/word/2016/wordml/cid" xmlns:w16="http://schemas.microsoft.com/office/word/2018/wordml" xmlns:w16du="http://schemas.microsoft.com/office/word/2023/wordml/word16du" xmlns:w16sdtdh="http://schemas.microsoft.com/office/word/2020/wordml/sdtdatahash" xmlns:w16sdtfl="http://schemas.microsoft.com/office/word/2024/wordml/sdtformatlock" xmlns:w16se="http://schemas.microsoft.com/office/word/2015/wordml/symex" xmlns:wpg="http://schemas.microsoft.com/office/word/2010/wordprocessingGroup" xmlns:wpi="http://schemas.microsoft.com/office/word/2010/wordprocessingInk" xmlns:wne="http://schemas.microsoft.com/office/word/2006/wordml" xmlns:wps="http://schemas.microsoft.com/office/word/2010/wordprocessingShape" mc:Ignorable="w14 w15 w16se w16cid w16 w16cex w16sdtdh w16sdtfl w16du wp14">
   <w:sdt>
     <w:sdtPr>
       <w:id w:val="2128894162"/>
@@ -2081,11 +2095,10 @@
         <w:docPartUnique/>
       </w:docPartObj>
     </w:sdtPr>
-    <w:sdtEndPr/>
     <w:sdtContent>
       <w:p>
         <w:pPr>
-          <w:pStyle w:val="Footer"/>
+          <w:pStyle w:val="Fuzeile"/>
           <w:jc w:val="center"/>
         </w:pPr>
         <w:r>
@@ -2111,14 +2124,14 @@
   </w:sdt>
   <w:p>
     <w:pPr>
-      <w:pStyle w:val="Footer"/>
+      <w:pStyle w:val="Fuzeile"/>
     </w:pPr>
   </w:p>
 </w:ftr>
 </file>
 
 <file path=word/footnotes.xml><?xml version="1.0" encoding="utf-8"?>
-<w:footnotes xmlns:wpc="http://schemas.microsoft.com/office/word/2010/wordprocessingCanvas" xmlns:cx="http://schemas.microsoft.com/office/drawing/2014/chartex" xmlns:cx1="http://schemas.microsoft.com/office/drawing/2015/9/8/chartex" xmlns:cx2="http://schemas.microsoft.com/office/drawing/2015/10/21/chartex" xmlns:cx3="http://schemas.microsoft.com/office/drawing/2016/5/9/chartex" xmlns:cx4="http://schemas.microsoft.com/office/drawing/2016/5/10/chartex" xmlns:cx5="http://schemas.microsoft.com/office/drawing/2016/5/11/chartex" xmlns:cx6="http://schemas.microsoft.com/office/drawing/2016/5/12/chartex" xmlns:cx7="http://schemas.microsoft.com/office/drawing/2016/5/13/chartex" xmlns:cx8="http://schemas.microsoft.com/office/drawing/2016/5/14/chartex" xmlns:mc="http://schemas.openxmlformats.org/markup-compatibility/2006" xmlns:aink="http://schemas.microsoft.com/office/drawing/2016/ink" xmlns:am3d="http://schemas.microsoft.com/office/drawing/2017/model3d" xmlns:o="urn:schemas-microsoft-com:office:office" xmlns:oel="http://schemas.microsoft.com/office/2019/extlst" xmlns:r="http://schemas.openxmlformats.org/officeDocument/2006/relationships" xmlns:m="http://schemas.openxmlformats.org/officeDocument/2006/math" xmlns:v="urn:schemas-microsoft-com:vml" xmlns:wp14="http://schemas.microsoft.com/office/word/2010/wordprocessingDrawing" xmlns:wp="http://schemas.openxmlformats.org/drawingml/2006/wordprocessingDrawing" xmlns:w10="urn:schemas-microsoft-com:office:word" xmlns:w="http://schemas.openxmlformats.org/wordprocessingml/2006/main" xmlns:w14="http://schemas.microsoft.com/office/word/2010/wordml" xmlns:w15="http://schemas.microsoft.com/office/word/2012/wordml" xmlns:w16cex="http://schemas.microsoft.com/office/word/2018/wordml/cex" xmlns:w16cid="http://schemas.microsoft.com/office/word/2016/wordml/cid" xmlns:w16="http://schemas.microsoft.com/office/word/2018/wordml" xmlns:w16du="http://schemas.microsoft.com/office/word/2023/wordml/word16du" xmlns:w16sdtdh="http://schemas.microsoft.com/office/word/2020/wordml/sdtdatahash" xmlns:w16sdtfl="http://schemas.microsoft.com/office/word/2024/wordml/sdtformatlock" xmlns:w16se="http://schemas.microsoft.com/office/word/2015/wordml/symex" xmlns:wpg="http://schemas.microsoft.com/office/word/2010/wordprocessingGroup" xmlns:wpi="http://schemas.microsoft.com/office/word/2010/wordprocessingInk" xmlns:wne="http://schemas.microsoft.com/office/word/2006/wordml" xmlns:wps="http://schemas.microsoft.com/office/word/2010/wordprocessingShape" mc:Ignorable="w14 w15 w16se w16cid w16 w16cex w16sdtdh w16sdtfl w16du wp14">
+<w:footnotes xmlns:wpc="http://schemas.microsoft.com/office/word/2010/wordprocessingCanvas" xmlns:cx="http://schemas.microsoft.com/office/drawing/2014/chartex" xmlns:cx1="http://schemas.microsoft.com/office/drawing/2015/9/8/chartex" xmlns:cx2="http://schemas.microsoft.com/office/drawing/2015/10/21/chartex" xmlns:cx3="http://schemas.microsoft.com/office/drawing/2016/5/9/chartex" xmlns:cx4="http://schemas.microsoft.com/office/drawing/2016/5/10/chartex" xmlns:cx5="http://schemas.microsoft.com/office/drawing/2016/5/11/chartex" xmlns:cx6="http://schemas.microsoft.com/office/drawing/2016/5/12/chartex" xmlns:cx7="http://schemas.microsoft.com/office/drawing/2016/5/13/chartex" xmlns:cx8="http://schemas.microsoft.com/office/drawing/2016/5/14/chartex" xmlns:mc="http://schemas.openxmlformats.org/markup-compatibility/2006" xmlns:aink="http://schemas.microsoft.com/office/drawing/2016/ink" xmlns:am3d="http://schemas.microsoft.com/office/drawing/2017/model3d" xmlns:o="urn:schemas-microsoft-com:office:office" xmlns:oel="http://schemas.microsoft.com/office/2019/extlst" xmlns:r="http://schemas.openxmlformats.org/officeDocument/2006/relationships" xmlns:m="http://schemas.openxmlformats.org/officeDocument/2006/math" xmlns:v="urn:schemas-microsoft-com:vml" xmlns:wp14="http://schemas.microsoft.com/office/word/2010/wordprocessingDrawing" xmlns:wp="http://schemas.openxmlformats.org/drawingml/2006/wordprocessingDrawing" xmlns:w10="urn:schemas-microsoft-com:office:word" xmlns:w="http://schemas.openxmlformats.org/wordprocessingml/2006/main" xmlns:w14="http://schemas.microsoft.com/office/word/2010/wordml" xmlns:w15="http://schemas.microsoft.com/office/word/2012/wordml" xmlns:w16cei="http://schemas.microsoft.com/office/word/2026/wordml/cei" xmlns:w16cex="http://schemas.microsoft.com/office/word/2018/wordml/cex" xmlns:w16cid="http://schemas.microsoft.com/office/word/2016/wordml/cid" xmlns:w16="http://schemas.microsoft.com/office/word/2018/wordml" xmlns:w16du="http://schemas.microsoft.com/office/word/2023/wordml/word16du" xmlns:w16sdtdh="http://schemas.microsoft.com/office/word/2020/wordml/sdtdatahash" xmlns:w16sdtfl="http://schemas.microsoft.com/office/word/2024/wordml/sdtformatlock" xmlns:w16se="http://schemas.microsoft.com/office/word/2015/wordml/symex" xmlns:wpg="http://schemas.microsoft.com/office/word/2010/wordprocessingGroup" xmlns:wpi="http://schemas.microsoft.com/office/word/2010/wordprocessingInk" xmlns:wne="http://schemas.microsoft.com/office/word/2006/wordml" xmlns:wps="http://schemas.microsoft.com/office/word/2010/wordprocessingShape" mc:Ignorable="w14 w15 w16se w16cid w16 w16cex w16sdtdh w16sdtfl w16du wp14">
   <w:footnote w:type="separator" w:id="-1">
     <w:p>
       <w:r>
@@ -2137,17 +2150,17 @@
 </file>
 
 <file path=word/header1.xml><?xml version="1.0" encoding="utf-8"?>
-<w:hdr xmlns:wpc="http://schemas.microsoft.com/office/word/2010/wordprocessingCanvas" xmlns:cx="http://schemas.microsoft.com/office/drawing/2014/chartex" xmlns:cx1="http://schemas.microsoft.com/office/drawing/2015/9/8/chartex" xmlns:cx2="http://schemas.microsoft.com/office/drawing/2015/10/21/chartex" xmlns:cx3="http://schemas.microsoft.com/office/drawing/2016/5/9/chartex" xmlns:cx4="http://schemas.microsoft.com/office/drawing/2016/5/10/chartex" xmlns:cx5="http://schemas.microsoft.com/office/drawing/2016/5/11/chartex" xmlns:cx6="http://schemas.microsoft.com/office/drawing/2016/5/12/chartex" xmlns:cx7="http://schemas.microsoft.com/office/drawing/2016/5/13/chartex" xmlns:cx8="http://schemas.microsoft.com/office/drawing/2016/5/14/chartex" xmlns:mc="http://schemas.openxmlformats.org/markup-compatibility/2006" xmlns:aink="http://schemas.microsoft.com/office/drawing/2016/ink" xmlns:am3d="http://schemas.microsoft.com/office/drawing/2017/model3d" xmlns:o="urn:schemas-microsoft-com:office:office" xmlns:oel="http://schemas.microsoft.com/office/2019/extlst" xmlns:r="http://schemas.openxmlformats.org/officeDocument/2006/relationships" xmlns:m="http://schemas.openxmlformats.org/officeDocument/2006/math" xmlns:v="urn:schemas-microsoft-com:vml" xmlns:wp14="http://schemas.microsoft.com/office/word/2010/wordprocessingDrawing" xmlns:wp="http://schemas.openxmlformats.org/drawingml/2006/wordprocessingDrawing" xmlns:w10="urn:schemas-microsoft-com:office:word" xmlns:w="http://schemas.openxmlformats.org/wordprocessingml/2006/main" xmlns:w14="http://schemas.microsoft.com/office/word/2010/wordml" xmlns:w15="http://schemas.microsoft.com/office/word/2012/wordml" xmlns:w16cex="http://schemas.microsoft.com/office/word/2018/wordml/cex" xmlns:w16cid="http://schemas.microsoft.com/office/word/2016/wordml/cid" xmlns:w16="http://schemas.microsoft.com/office/word/2018/wordml" xmlns:w16du="http://schemas.microsoft.com/office/word/2023/wordml/word16du" xmlns:w16sdtdh="http://schemas.microsoft.com/office/word/2020/wordml/sdtdatahash" xmlns:w16sdtfl="http://schemas.microsoft.com/office/word/2024/wordml/sdtformatlock" xmlns:w16se="http://schemas.microsoft.com/office/word/2015/wordml/symex" xmlns:wpg="http://schemas.microsoft.com/office/word/2010/wordprocessingGroup" xmlns:wpi="http://schemas.microsoft.com/office/word/2010/wordprocessingInk" xmlns:wne="http://schemas.microsoft.com/office/word/2006/wordml" xmlns:wps="http://schemas.microsoft.com/office/word/2010/wordprocessingShape" mc:Ignorable="w14 w15 w16se w16cid w16 w16cex w16sdtdh w16sdtfl w16du wp14">
+<w:hdr xmlns:wpc="http://schemas.microsoft.com/office/word/2010/wordprocessingCanvas" xmlns:cx="http://schemas.microsoft.com/office/drawing/2014/chartex" xmlns:cx1="http://schemas.microsoft.com/office/drawing/2015/9/8/chartex" xmlns:cx2="http://schemas.microsoft.com/office/drawing/2015/10/21/chartex" xmlns:cx3="http://schemas.microsoft.com/office/drawing/2016/5/9/chartex" xmlns:cx4="http://schemas.microsoft.com/office/drawing/2016/5/10/chartex" xmlns:cx5="http://schemas.microsoft.com/office/drawing/2016/5/11/chartex" xmlns:cx6="http://schemas.microsoft.com/office/drawing/2016/5/12/chartex" xmlns:cx7="http://schemas.microsoft.com/office/drawing/2016/5/13/chartex" xmlns:cx8="http://schemas.microsoft.com/office/drawing/2016/5/14/chartex" xmlns:mc="http://schemas.openxmlformats.org/markup-compatibility/2006" xmlns:aink="http://schemas.microsoft.com/office/drawing/2016/ink" xmlns:am3d="http://schemas.microsoft.com/office/drawing/2017/model3d" xmlns:o="urn:schemas-microsoft-com:office:office" xmlns:oel="http://schemas.microsoft.com/office/2019/extlst" xmlns:r="http://schemas.openxmlformats.org/officeDocument/2006/relationships" xmlns:m="http://schemas.openxmlformats.org/officeDocument/2006/math" xmlns:v="urn:schemas-microsoft-com:vml" xmlns:wp14="http://schemas.microsoft.com/office/word/2010/wordprocessingDrawing" xmlns:wp="http://schemas.openxmlformats.org/drawingml/2006/wordprocessingDrawing" xmlns:w10="urn:schemas-microsoft-com:office:word" xmlns:w="http://schemas.openxmlformats.org/wordprocessingml/2006/main" xmlns:w14="http://schemas.microsoft.com/office/word/2010/wordml" xmlns:w15="http://schemas.microsoft.com/office/word/2012/wordml" xmlns:w16cei="http://schemas.microsoft.com/office/word/2026/wordml/cei" xmlns:w16cex="http://schemas.microsoft.com/office/word/2018/wordml/cex" xmlns:w16cid="http://schemas.microsoft.com/office/word/2016/wordml/cid" xmlns:w16="http://schemas.microsoft.com/office/word/2018/wordml" xmlns:w16du="http://schemas.microsoft.com/office/word/2023/wordml/word16du" xmlns:w16sdtdh="http://schemas.microsoft.com/office/word/2020/wordml/sdtdatahash" xmlns:w16sdtfl="http://schemas.microsoft.com/office/word/2024/wordml/sdtformatlock" xmlns:w16se="http://schemas.microsoft.com/office/word/2015/wordml/symex" xmlns:wpg="http://schemas.microsoft.com/office/word/2010/wordprocessingGroup" xmlns:wpi="http://schemas.microsoft.com/office/word/2010/wordprocessingInk" xmlns:wne="http://schemas.microsoft.com/office/word/2006/wordml" xmlns:wps="http://schemas.microsoft.com/office/word/2010/wordprocessingShape" mc:Ignorable="w14 w15 w16se w16cid w16 w16cex w16sdtdh w16sdtfl w16du wp14">
   <w:p>
     <w:pPr>
-      <w:pStyle w:val="Header"/>
+      <w:pStyle w:val="Kopfzeile"/>
     </w:pPr>
   </w:p>
 </w:hdr>
 </file>
 
 <file path=word/numbering.xml><?xml version="1.0" encoding="utf-8"?>
-<w:numbering xmlns:wpc="http://schemas.microsoft.com/office/word/2010/wordprocessingCanvas" xmlns:cx="http://schemas.microsoft.com/office/drawing/2014/chartex" xmlns:cx1="http://schemas.microsoft.com/office/drawing/2015/9/8/chartex" xmlns:cx2="http://schemas.microsoft.com/office/drawing/2015/10/21/chartex" xmlns:cx3="http://schemas.microsoft.com/office/drawing/2016/5/9/chartex" xmlns:cx4="http://schemas.microsoft.com/office/drawing/2016/5/10/chartex" xmlns:cx5="http://schemas.microsoft.com/office/drawing/2016/5/11/chartex" xmlns:cx6="http://schemas.microsoft.com/office/drawing/2016/5/12/chartex" xmlns:cx7="http://schemas.microsoft.com/office/drawing/2016/5/13/chartex" xmlns:cx8="http://schemas.microsoft.com/office/drawing/2016/5/14/chartex" xmlns:mc="http://schemas.openxmlformats.org/markup-compatibility/2006" xmlns:aink="http://schemas.microsoft.com/office/drawing/2016/ink" xmlns:am3d="http://schemas.microsoft.com/office/drawing/2017/model3d" xmlns:o="urn:schemas-microsoft-com:office:office" xmlns:oel="http://schemas.microsoft.com/office/2019/extlst" xmlns:r="http://schemas.openxmlformats.org/officeDocument/2006/relationships" xmlns:m="http://schemas.openxmlformats.org/officeDocument/2006/math" xmlns:v="urn:schemas-microsoft-com:vml" xmlns:wp14="http://schemas.microsoft.com/office/word/2010/wordprocessingDrawing" xmlns:wp="http://schemas.openxmlformats.org/drawingml/2006/wordprocessingDrawing" xmlns:w10="urn:schemas-microsoft-com:office:word" xmlns:w="http://schemas.openxmlformats.org/wordprocessingml/2006/main" xmlns:w14="http://schemas.microsoft.com/office/word/2010/wordml" xmlns:w15="http://schemas.microsoft.com/office/word/2012/wordml" xmlns:w16cex="http://schemas.microsoft.com/office/word/2018/wordml/cex" xmlns:w16cid="http://schemas.microsoft.com/office/word/2016/wordml/cid" xmlns:w16="http://schemas.microsoft.com/office/word/2018/wordml" xmlns:w16du="http://schemas.microsoft.com/office/word/2023/wordml/word16du" xmlns:w16sdtdh="http://schemas.microsoft.com/office/word/2020/wordml/sdtdatahash" xmlns:w16sdtfl="http://schemas.microsoft.com/office/word/2024/wordml/sdtformatlock" xmlns:w16se="http://schemas.microsoft.com/office/word/2015/wordml/symex" xmlns:wpg="http://schemas.microsoft.com/office/word/2010/wordprocessingGroup" xmlns:wpi="http://schemas.microsoft.com/office/word/2010/wordprocessingInk" xmlns:wne="http://schemas.microsoft.com/office/word/2006/wordml" xmlns:wps="http://schemas.microsoft.com/office/word/2010/wordprocessingShape" mc:Ignorable="w14 w15 w16se w16cid w16 w16cex w16sdtdh w16sdtfl w16du wp14">
+<w:numbering xmlns:wpc="http://schemas.microsoft.com/office/word/2010/wordprocessingCanvas" xmlns:cx="http://schemas.microsoft.com/office/drawing/2014/chartex" xmlns:cx1="http://schemas.microsoft.com/office/drawing/2015/9/8/chartex" xmlns:cx2="http://schemas.microsoft.com/office/drawing/2015/10/21/chartex" xmlns:cx3="http://schemas.microsoft.com/office/drawing/2016/5/9/chartex" xmlns:cx4="http://schemas.microsoft.com/office/drawing/2016/5/10/chartex" xmlns:cx5="http://schemas.microsoft.com/office/drawing/2016/5/11/chartex" xmlns:cx6="http://schemas.microsoft.com/office/drawing/2016/5/12/chartex" xmlns:cx7="http://schemas.microsoft.com/office/drawing/2016/5/13/chartex" xmlns:cx8="http://schemas.microsoft.com/office/drawing/2016/5/14/chartex" xmlns:mc="http://schemas.openxmlformats.org/markup-compatibility/2006" xmlns:aink="http://schemas.microsoft.com/office/drawing/2016/ink" xmlns:am3d="http://schemas.microsoft.com/office/drawing/2017/model3d" xmlns:o="urn:schemas-microsoft-com:office:office" xmlns:oel="http://schemas.microsoft.com/office/2019/extlst" xmlns:r="http://schemas.openxmlformats.org/officeDocument/2006/relationships" xmlns:m="http://schemas.openxmlformats.org/officeDocument/2006/math" xmlns:v="urn:schemas-microsoft-com:vml" xmlns:wp14="http://schemas.microsoft.com/office/word/2010/wordprocessingDrawing" xmlns:wp="http://schemas.openxmlformats.org/drawingml/2006/wordprocessingDrawing" xmlns:w10="urn:schemas-microsoft-com:office:word" xmlns:w="http://schemas.openxmlformats.org/wordprocessingml/2006/main" xmlns:w14="http://schemas.microsoft.com/office/word/2010/wordml" xmlns:w15="http://schemas.microsoft.com/office/word/2012/wordml" xmlns:w16cei="http://schemas.microsoft.com/office/word/2026/wordml/cei" xmlns:w16cex="http://schemas.microsoft.com/office/word/2018/wordml/cex" xmlns:w16cid="http://schemas.microsoft.com/office/word/2016/wordml/cid" xmlns:w16="http://schemas.microsoft.com/office/word/2018/wordml" xmlns:w16du="http://schemas.microsoft.com/office/word/2023/wordml/word16du" xmlns:w16sdtdh="http://schemas.microsoft.com/office/word/2020/wordml/sdtdatahash" xmlns:w16sdtfl="http://schemas.microsoft.com/office/word/2024/wordml/sdtformatlock" xmlns:w16se="http://schemas.microsoft.com/office/word/2015/wordml/symex" xmlns:wpg="http://schemas.microsoft.com/office/word/2010/wordprocessingGroup" xmlns:wpi="http://schemas.microsoft.com/office/word/2010/wordprocessingInk" xmlns:wne="http://schemas.microsoft.com/office/word/2006/wordml" xmlns:wps="http://schemas.microsoft.com/office/word/2010/wordprocessingShape" mc:Ignorable="w14 w15 w16se w16cid w16 w16cex w16sdtdh w16sdtfl w16du wp14">
   <w:abstractNum w:abstractNumId="0" w15:restartNumberingAfterBreak="0">
     <w:nsid w:val="06AC1601"/>
     <w:multiLevelType w:val="hybridMultilevel"/>
@@ -5452,15 +5465,15 @@
     <w:lsdException w:name="Unresolved Mention" w:semiHidden="1" w:unhideWhenUsed="1"/>
     <w:lsdException w:name="Smart Link" w:semiHidden="1" w:unhideWhenUsed="1"/>
   </w:latentStyles>
-  <w:style w:type="paragraph" w:default="1" w:styleId="Normal">
+  <w:style w:type="paragraph" w:default="1" w:styleId="Standard">
     <w:name w:val="Normal"/>
     <w:qFormat/>
   </w:style>
-  <w:style w:type="paragraph" w:styleId="Heading1">
+  <w:style w:type="paragraph" w:styleId="berschrift1">
     <w:name w:val="heading 1"/>
-    <w:basedOn w:val="Normal"/>
-    <w:next w:val="Normal"/>
-    <w:link w:val="Heading1Char"/>
+    <w:basedOn w:val="Standard"/>
+    <w:next w:val="Standard"/>
+    <w:link w:val="berschrift1Zchn"/>
     <w:uiPriority w:val="9"/>
     <w:qFormat/>
     <w:rsid w:val="001B40F9"/>
@@ -5479,13 +5492,13 @@
       <w:szCs w:val="28"/>
     </w:rPr>
   </w:style>
-  <w:style w:type="character" w:default="1" w:styleId="DefaultParagraphFont">
+  <w:style w:type="character" w:default="1" w:styleId="Absatz-Standardschriftart">
     <w:name w:val="Default Paragraph Font"/>
     <w:uiPriority w:val="1"/>
     <w:semiHidden/>
     <w:unhideWhenUsed/>
   </w:style>
-  <w:style w:type="table" w:default="1" w:styleId="TableNormal">
+  <w:style w:type="table" w:default="1" w:styleId="NormaleTabelle">
     <w:name w:val="Normal Table"/>
     <w:uiPriority w:val="99"/>
     <w:semiHidden/>
@@ -5500,15 +5513,15 @@
       </w:tblCellMar>
     </w:tblPr>
   </w:style>
-  <w:style w:type="numbering" w:default="1" w:styleId="NoList">
+  <w:style w:type="numbering" w:default="1" w:styleId="KeineListe">
     <w:name w:val="No List"/>
     <w:uiPriority w:val="99"/>
     <w:semiHidden/>
     <w:unhideWhenUsed/>
   </w:style>
-  <w:style w:type="paragraph" w:styleId="ListParagraph">
+  <w:style w:type="paragraph" w:styleId="Listenabsatz">
     <w:name w:val="List Paragraph"/>
-    <w:basedOn w:val="Normal"/>
+    <w:basedOn w:val="Standard"/>
     <w:uiPriority w:val="34"/>
     <w:qFormat/>
     <w:rsid w:val="00991548"/>
@@ -5519,7 +5532,7 @@
   </w:style>
   <w:style w:type="character" w:styleId="Hyperlink">
     <w:name w:val="Hyperlink"/>
-    <w:basedOn w:val="DefaultParagraphFont"/>
+    <w:basedOn w:val="Absatz-Standardschriftart"/>
     <w:uiPriority w:val="99"/>
     <w:unhideWhenUsed/>
     <w:rsid w:val="00476BA2"/>
@@ -5530,7 +5543,7 @@
   </w:style>
   <w:style w:type="character" w:customStyle="1" w:styleId="NichtaufgelsteErwhnung1">
     <w:name w:val="Nicht aufgelöste Erwähnung1"/>
-    <w:basedOn w:val="DefaultParagraphFont"/>
+    <w:basedOn w:val="Absatz-Standardschriftart"/>
     <w:uiPriority w:val="99"/>
     <w:semiHidden/>
     <w:unhideWhenUsed/>
@@ -5540,9 +5553,9 @@
       <w:shd w:val="clear" w:color="auto" w:fill="E1DFDD"/>
     </w:rPr>
   </w:style>
-  <w:style w:type="table" w:styleId="TableGrid">
+  <w:style w:type="table" w:styleId="Tabellenraster">
     <w:name w:val="Table Grid"/>
-    <w:basedOn w:val="TableNormal"/>
+    <w:basedOn w:val="NormaleTabelle"/>
     <w:uiPriority w:val="39"/>
     <w:rsid w:val="00326A50"/>
     <w:tblPr>
@@ -5558,7 +5571,7 @@
   </w:style>
   <w:style w:type="table" w:customStyle="1" w:styleId="Gitternetztabelle5dunkelAkzent31">
     <w:name w:val="Gitternetztabelle 5 dunkel  – Akzent 31"/>
-    <w:basedOn w:val="TableNormal"/>
+    <w:basedOn w:val="NormaleTabelle"/>
     <w:uiPriority w:val="50"/>
     <w:rsid w:val="008E79A8"/>
     <w:tblPr>
@@ -5659,9 +5672,9 @@
       </w:tcPr>
     </w:tblStylePr>
   </w:style>
-  <w:style w:type="character" w:styleId="FollowedHyperlink">
+  <w:style w:type="character" w:styleId="BesuchterLink">
     <w:name w:val="FollowedHyperlink"/>
-    <w:basedOn w:val="DefaultParagraphFont"/>
+    <w:basedOn w:val="Absatz-Standardschriftart"/>
     <w:uiPriority w:val="99"/>
     <w:semiHidden/>
     <w:unhideWhenUsed/>
@@ -5671,10 +5684,10 @@
       <w:u w:val="single"/>
     </w:rPr>
   </w:style>
-  <w:style w:type="paragraph" w:styleId="Header">
+  <w:style w:type="paragraph" w:styleId="Kopfzeile">
     <w:name w:val="header"/>
-    <w:basedOn w:val="Normal"/>
-    <w:link w:val="HeaderChar"/>
+    <w:basedOn w:val="Standard"/>
+    <w:link w:val="KopfzeileZchn"/>
     <w:uiPriority w:val="99"/>
     <w:unhideWhenUsed/>
     <w:rsid w:val="00016E32"/>
@@ -5685,17 +5698,17 @@
       </w:tabs>
     </w:pPr>
   </w:style>
-  <w:style w:type="character" w:customStyle="1" w:styleId="HeaderChar">
-    <w:name w:val="Header Char"/>
-    <w:basedOn w:val="DefaultParagraphFont"/>
-    <w:link w:val="Header"/>
+  <w:style w:type="character" w:customStyle="1" w:styleId="KopfzeileZchn">
+    <w:name w:val="Kopfzeile Zchn"/>
+    <w:basedOn w:val="Absatz-Standardschriftart"/>
+    <w:link w:val="Kopfzeile"/>
     <w:uiPriority w:val="99"/>
     <w:rsid w:val="00016E32"/>
   </w:style>
-  <w:style w:type="paragraph" w:styleId="Footer">
+  <w:style w:type="paragraph" w:styleId="Fuzeile">
     <w:name w:val="footer"/>
-    <w:basedOn w:val="Normal"/>
-    <w:link w:val="FooterChar"/>
+    <w:basedOn w:val="Standard"/>
+    <w:link w:val="FuzeileZchn"/>
     <w:uiPriority w:val="99"/>
     <w:unhideWhenUsed/>
     <w:rsid w:val="00016E32"/>
@@ -5706,39 +5719,39 @@
       </w:tabs>
     </w:pPr>
   </w:style>
-  <w:style w:type="character" w:customStyle="1" w:styleId="FooterChar">
-    <w:name w:val="Footer Char"/>
-    <w:basedOn w:val="DefaultParagraphFont"/>
-    <w:link w:val="Footer"/>
+  <w:style w:type="character" w:customStyle="1" w:styleId="FuzeileZchn">
+    <w:name w:val="Fußzeile Zchn"/>
+    <w:basedOn w:val="Absatz-Standardschriftart"/>
+    <w:link w:val="Fuzeile"/>
     <w:uiPriority w:val="99"/>
     <w:rsid w:val="00016E32"/>
   </w:style>
-  <w:style w:type="character" w:styleId="PageNumber">
+  <w:style w:type="character" w:styleId="Seitenzahl">
     <w:name w:val="page number"/>
-    <w:basedOn w:val="DefaultParagraphFont"/>
+    <w:basedOn w:val="Absatz-Standardschriftart"/>
     <w:uiPriority w:val="99"/>
     <w:semiHidden/>
     <w:unhideWhenUsed/>
     <w:rsid w:val="00016E32"/>
   </w:style>
-  <w:style w:type="paragraph" w:styleId="NoSpacing">
+  <w:style w:type="paragraph" w:styleId="KeinLeerraum">
     <w:name w:val="No Spacing"/>
-    <w:link w:val="NoSpacingChar"/>
+    <w:link w:val="KeinLeerraumZchn"/>
     <w:uiPriority w:val="1"/>
     <w:qFormat/>
     <w:rsid w:val="008A4D33"/>
   </w:style>
-  <w:style w:type="character" w:customStyle="1" w:styleId="NoSpacingChar">
-    <w:name w:val="No Spacing Char"/>
-    <w:basedOn w:val="DefaultParagraphFont"/>
-    <w:link w:val="NoSpacing"/>
+  <w:style w:type="character" w:customStyle="1" w:styleId="KeinLeerraumZchn">
+    <w:name w:val="Kein Leerraum Zchn"/>
+    <w:basedOn w:val="Absatz-Standardschriftart"/>
+    <w:link w:val="KeinLeerraum"/>
     <w:uiPriority w:val="1"/>
     <w:rsid w:val="008A4D33"/>
   </w:style>
-  <w:style w:type="paragraph" w:styleId="BalloonText">
+  <w:style w:type="paragraph" w:styleId="Sprechblasentext">
     <w:name w:val="Balloon Text"/>
-    <w:basedOn w:val="Normal"/>
-    <w:link w:val="BalloonTextChar"/>
+    <w:basedOn w:val="Standard"/>
+    <w:link w:val="SprechblasentextZchn"/>
     <w:uiPriority w:val="99"/>
     <w:semiHidden/>
     <w:unhideWhenUsed/>
@@ -5749,10 +5762,10 @@
       <w:szCs w:val="16"/>
     </w:rPr>
   </w:style>
-  <w:style w:type="character" w:customStyle="1" w:styleId="BalloonTextChar">
-    <w:name w:val="Balloon Text Char"/>
-    <w:basedOn w:val="DefaultParagraphFont"/>
-    <w:link w:val="BalloonText"/>
+  <w:style w:type="character" w:customStyle="1" w:styleId="SprechblasentextZchn">
+    <w:name w:val="Sprechblasentext Zchn"/>
+    <w:basedOn w:val="Absatz-Standardschriftart"/>
+    <w:link w:val="Sprechblasentext"/>
     <w:uiPriority w:val="99"/>
     <w:semiHidden/>
     <w:rsid w:val="008A4D33"/>
@@ -5762,10 +5775,10 @@
       <w:szCs w:val="16"/>
     </w:rPr>
   </w:style>
-  <w:style w:type="character" w:customStyle="1" w:styleId="Heading1Char">
-    <w:name w:val="Heading 1 Char"/>
-    <w:basedOn w:val="DefaultParagraphFont"/>
-    <w:link w:val="Heading1"/>
+  <w:style w:type="character" w:customStyle="1" w:styleId="berschrift1Zchn">
+    <w:name w:val="Überschrift 1 Zchn"/>
+    <w:basedOn w:val="Absatz-Standardschriftart"/>
+    <w:link w:val="berschrift1"/>
     <w:uiPriority w:val="9"/>
     <w:rsid w:val="001B40F9"/>
     <w:rPr>
@@ -5777,10 +5790,10 @@
       <w:szCs w:val="28"/>
     </w:rPr>
   </w:style>
-  <w:style w:type="paragraph" w:styleId="TOCHeading">
+  <w:style w:type="paragraph" w:styleId="Inhaltsverzeichnisberschrift">
     <w:name w:val="TOC Heading"/>
-    <w:basedOn w:val="Heading1"/>
-    <w:next w:val="Normal"/>
+    <w:basedOn w:val="berschrift1"/>
+    <w:next w:val="Standard"/>
     <w:uiPriority w:val="39"/>
     <w:unhideWhenUsed/>
     <w:qFormat/>
@@ -5790,10 +5803,10 @@
       <w:outlineLvl w:val="9"/>
     </w:pPr>
   </w:style>
-  <w:style w:type="paragraph" w:styleId="TOC1">
+  <w:style w:type="paragraph" w:styleId="Verzeichnis1">
     <w:name w:val="toc 1"/>
-    <w:basedOn w:val="Normal"/>
-    <w:next w:val="Normal"/>
+    <w:basedOn w:val="Standard"/>
+    <w:next w:val="Standard"/>
     <w:autoRedefine/>
     <w:uiPriority w:val="39"/>
     <w:unhideWhenUsed/>
@@ -5802,10 +5815,10 @@
       <w:spacing w:after="100"/>
     </w:pPr>
   </w:style>
-  <w:style w:type="paragraph" w:styleId="TOC2">
+  <w:style w:type="paragraph" w:styleId="Verzeichnis2">
     <w:name w:val="toc 2"/>
-    <w:basedOn w:val="Normal"/>
-    <w:next w:val="Normal"/>
+    <w:basedOn w:val="Standard"/>
+    <w:next w:val="Standard"/>
     <w:autoRedefine/>
     <w:uiPriority w:val="39"/>
     <w:unhideWhenUsed/>
@@ -5815,10 +5828,10 @@
       <w:ind w:left="220"/>
     </w:pPr>
   </w:style>
-  <w:style w:type="paragraph" w:styleId="TOC3">
+  <w:style w:type="paragraph" w:styleId="Verzeichnis3">
     <w:name w:val="toc 3"/>
-    <w:basedOn w:val="Normal"/>
-    <w:next w:val="Normal"/>
+    <w:basedOn w:val="Standard"/>
+    <w:next w:val="Standard"/>
     <w:autoRedefine/>
     <w:uiPriority w:val="39"/>
     <w:unhideWhenUsed/>
@@ -5828,10 +5841,10 @@
       <w:ind w:left="440"/>
     </w:pPr>
   </w:style>
-  <w:style w:type="paragraph" w:styleId="Bibliography">
+  <w:style w:type="paragraph" w:styleId="Literaturverzeichnis">
     <w:name w:val="Bibliography"/>
-    <w:basedOn w:val="Normal"/>
-    <w:next w:val="Normal"/>
+    <w:basedOn w:val="Standard"/>
+    <w:next w:val="Standard"/>
     <w:uiPriority w:val="37"/>
     <w:unhideWhenUsed/>
     <w:rsid w:val="000E541F"/>
@@ -5842,10 +5855,10 @@
       <w:ind w:left="504" w:hanging="504"/>
     </w:pPr>
   </w:style>
-  <w:style w:type="paragraph" w:styleId="FootnoteText">
+  <w:style w:type="paragraph" w:styleId="Funotentext">
     <w:name w:val="footnote text"/>
-    <w:basedOn w:val="Normal"/>
-    <w:link w:val="FootnoteTextChar"/>
+    <w:basedOn w:val="Standard"/>
+    <w:link w:val="FunotentextZchn"/>
     <w:uiPriority w:val="99"/>
     <w:semiHidden/>
     <w:unhideWhenUsed/>
@@ -5855,10 +5868,10 @@
       <w:szCs w:val="20"/>
     </w:rPr>
   </w:style>
-  <w:style w:type="character" w:customStyle="1" w:styleId="FootnoteTextChar">
-    <w:name w:val="Footnote Text Char"/>
-    <w:basedOn w:val="DefaultParagraphFont"/>
-    <w:link w:val="FootnoteText"/>
+  <w:style w:type="character" w:customStyle="1" w:styleId="FunotentextZchn">
+    <w:name w:val="Fußnotentext Zchn"/>
+    <w:basedOn w:val="Absatz-Standardschriftart"/>
+    <w:link w:val="Funotentext"/>
     <w:uiPriority w:val="99"/>
     <w:semiHidden/>
     <w:rsid w:val="00257F2E"/>
@@ -5867,9 +5880,9 @@
       <w:szCs w:val="20"/>
     </w:rPr>
   </w:style>
-  <w:style w:type="character" w:styleId="FootnoteReference">
+  <w:style w:type="character" w:styleId="Funotenzeichen">
     <w:name w:val="footnote reference"/>
-    <w:basedOn w:val="DefaultParagraphFont"/>
+    <w:basedOn w:val="Absatz-Standardschriftart"/>
     <w:uiPriority w:val="99"/>
     <w:semiHidden/>
     <w:unhideWhenUsed/>
@@ -5894,9 +5907,9 @@
       <w:lang w:eastAsia="en-US"/>
     </w:rPr>
   </w:style>
-  <w:style w:type="character" w:styleId="PlaceholderText">
+  <w:style w:type="character" w:styleId="Platzhaltertext">
     <w:name w:val="Placeholder Text"/>
-    <w:basedOn w:val="DefaultParagraphFont"/>
+    <w:basedOn w:val="Absatz-Standardschriftart"/>
     <w:uiPriority w:val="99"/>
     <w:semiHidden/>
     <w:rsid w:val="0027049B"/>
@@ -5904,10 +5917,10 @@
       <w:color w:val="666666"/>
     </w:rPr>
   </w:style>
-  <w:style w:type="paragraph" w:styleId="EndnoteText">
+  <w:style w:type="paragraph" w:styleId="Endnotentext">
     <w:name w:val="endnote text"/>
-    <w:basedOn w:val="Normal"/>
-    <w:link w:val="EndnoteTextChar"/>
+    <w:basedOn w:val="Standard"/>
+    <w:link w:val="EndnotentextZchn"/>
     <w:uiPriority w:val="99"/>
     <w:semiHidden/>
     <w:unhideWhenUsed/>
@@ -5917,10 +5930,10 @@
       <w:szCs w:val="20"/>
     </w:rPr>
   </w:style>
-  <w:style w:type="character" w:customStyle="1" w:styleId="EndnoteTextChar">
-    <w:name w:val="Endnote Text Char"/>
-    <w:basedOn w:val="DefaultParagraphFont"/>
-    <w:link w:val="EndnoteText"/>
+  <w:style w:type="character" w:customStyle="1" w:styleId="EndnotentextZchn">
+    <w:name w:val="Endnotentext Zchn"/>
+    <w:basedOn w:val="Absatz-Standardschriftart"/>
+    <w:link w:val="Endnotentext"/>
     <w:uiPriority w:val="99"/>
     <w:semiHidden/>
     <w:rsid w:val="00AA502A"/>
@@ -5929,9 +5942,9 @@
       <w:szCs w:val="20"/>
     </w:rPr>
   </w:style>
-  <w:style w:type="character" w:styleId="EndnoteReference">
+  <w:style w:type="character" w:styleId="Endnotenzeichen">
     <w:name w:val="endnote reference"/>
-    <w:basedOn w:val="DefaultParagraphFont"/>
+    <w:basedOn w:val="Absatz-Standardschriftart"/>
     <w:uiPriority w:val="99"/>
     <w:semiHidden/>
     <w:unhideWhenUsed/>
@@ -5940,9 +5953,9 @@
       <w:vertAlign w:val="superscript"/>
     </w:rPr>
   </w:style>
-  <w:style w:type="character" w:styleId="UnresolvedMention">
+  <w:style w:type="character" w:styleId="NichtaufgelsteErwhnung">
     <w:name w:val="Unresolved Mention"/>
-    <w:basedOn w:val="DefaultParagraphFont"/>
+    <w:basedOn w:val="Absatz-Standardschriftart"/>
     <w:uiPriority w:val="99"/>
     <w:semiHidden/>
     <w:unhideWhenUsed/>
@@ -5954,8 +5967,8 @@
   </w:style>
   <w:style w:type="table" w:customStyle="1" w:styleId="Tabellenraster1">
     <w:name w:val="Tabellenraster1"/>
-    <w:basedOn w:val="TableNormal"/>
-    <w:next w:val="TableGrid"/>
+    <w:basedOn w:val="NormaleTabelle"/>
+    <w:next w:val="Tabellenraster"/>
     <w:uiPriority w:val="39"/>
     <w:rsid w:val="003E2196"/>
     <w:rPr>

</xml_diff>

<commit_message>
scripts were made more clear
</commit_message>
<xml_diff>
--- a/report.docx
+++ b/report.docx
@@ -952,7 +952,7 @@
             </w:rPr>
             <w:fldChar w:fldCharType="separate"/>
           </w:r>
-          <w:hyperlink w:anchor="_Toc237947567" w:history="1">
+          <w:hyperlink w:anchor="_Toc238146696" w:history="1">
             <w:r>
               <w:rPr>
                 <w:rStyle w:val="Hyperlink"/>
@@ -1001,7 +1001,7 @@
                 <w:noProof/>
                 <w:webHidden/>
               </w:rPr>
-              <w:instrText xml:space="preserve"> PAGEREF _Toc237947567 \h </w:instrText>
+              <w:instrText xml:space="preserve"> PAGEREF _Toc238146696 \h </w:instrText>
             </w:r>
             <w:r>
               <w:rPr>
@@ -1048,13 +1048,14 @@
               <w14:ligatures w14:val="standardContextual"/>
             </w:rPr>
           </w:pPr>
-          <w:hyperlink w:anchor="_Toc237947568" w:history="1">
+          <w:hyperlink w:anchor="_Toc238146697" w:history="1">
             <w:r>
               <w:rPr>
                 <w:rStyle w:val="Hyperlink"/>
                 <w:rFonts w:ascii="Arial" w:hAnsi="Arial" w:cs="Arial"/>
                 <w:b/>
                 <w:noProof/>
+                <w:lang w:val="en-GB"/>
               </w:rPr>
               <w:t>2.</w:t>
             </w:r>
@@ -1075,8 +1076,9 @@
                 <w:rFonts w:ascii="Arial" w:hAnsi="Arial" w:cs="Arial"/>
                 <w:b/>
                 <w:noProof/>
-              </w:rPr>
-              <w:t>Methodology and Implementation</w:t>
+                <w:lang w:val="en-GB"/>
+              </w:rPr>
+              <w:t>Related Work / State of the Art (optional)</w:t>
             </w:r>
             <w:r>
               <w:rPr>
@@ -1097,7 +1099,7 @@
                 <w:noProof/>
                 <w:webHidden/>
               </w:rPr>
-              <w:instrText xml:space="preserve"> PAGEREF _Toc237947568 \h </w:instrText>
+              <w:instrText xml:space="preserve"> PAGEREF _Toc238146697 \h </w:instrText>
             </w:r>
             <w:r>
               <w:rPr>
@@ -1144,7 +1146,7 @@
               <w14:ligatures w14:val="standardContextual"/>
             </w:rPr>
           </w:pPr>
-          <w:hyperlink w:anchor="_Toc237947569" w:history="1">
+          <w:hyperlink w:anchor="_Toc238146698" w:history="1">
             <w:r>
               <w:rPr>
                 <w:rStyle w:val="Hyperlink"/>
@@ -1172,7 +1174,7 @@
                 <w:b/>
                 <w:noProof/>
               </w:rPr>
-              <w:t>Results</w:t>
+              <w:t>Methodology and Implementation</w:t>
             </w:r>
             <w:r>
               <w:rPr>
@@ -1193,7 +1195,497 @@
                 <w:noProof/>
                 <w:webHidden/>
               </w:rPr>
-              <w:instrText xml:space="preserve"> PAGEREF _Toc237947569 \h </w:instrText>
+              <w:instrText xml:space="preserve"> PAGEREF _Toc238146698 \h </w:instrText>
+            </w:r>
+            <w:r>
+              <w:rPr>
+                <w:noProof/>
+                <w:webHidden/>
+              </w:rPr>
+            </w:r>
+            <w:r>
+              <w:rPr>
+                <w:noProof/>
+                <w:webHidden/>
+              </w:rPr>
+              <w:fldChar w:fldCharType="separate"/>
+            </w:r>
+            <w:r>
+              <w:rPr>
+                <w:noProof/>
+                <w:webHidden/>
+              </w:rPr>
+              <w:t>3</w:t>
+            </w:r>
+            <w:r>
+              <w:rPr>
+                <w:noProof/>
+                <w:webHidden/>
+              </w:rPr>
+              <w:fldChar w:fldCharType="end"/>
+            </w:r>
+          </w:hyperlink>
+        </w:p>
+        <w:p>
+          <w:pPr>
+            <w:pStyle w:val="Verzeichnis1"/>
+            <w:tabs>
+              <w:tab w:val="left" w:pos="720"/>
+              <w:tab w:val="right" w:leader="dot" w:pos="8210"/>
+            </w:tabs>
+            <w:rPr>
+              <w:noProof/>
+              <w:kern w:val="2"/>
+              <w:sz w:val="24"/>
+              <w:szCs w:val="24"/>
+              <w:lang w:val="en-GB" w:eastAsia="en-GB"/>
+              <w14:ligatures w14:val="standardContextual"/>
+            </w:rPr>
+          </w:pPr>
+          <w:hyperlink w:anchor="_Toc238146699" w:history="1">
+            <w:r>
+              <w:rPr>
+                <w:rStyle w:val="Hyperlink"/>
+                <w:rFonts w:ascii="Arial" w:hAnsi="Arial" w:cs="Arial"/>
+                <w:b/>
+                <w:noProof/>
+                <w:lang w:val="en-GB"/>
+              </w:rPr>
+              <w:t>3.1</w:t>
+            </w:r>
+            <w:r>
+              <w:rPr>
+                <w:noProof/>
+                <w:kern w:val="2"/>
+                <w:sz w:val="24"/>
+                <w:szCs w:val="24"/>
+                <w:lang w:val="en-GB" w:eastAsia="en-GB"/>
+                <w14:ligatures w14:val="standardContextual"/>
+              </w:rPr>
+              <w:tab/>
+            </w:r>
+            <w:r>
+              <w:rPr>
+                <w:rStyle w:val="Hyperlink"/>
+                <w:rFonts w:ascii="Arial" w:hAnsi="Arial" w:cs="Arial"/>
+                <w:b/>
+                <w:noProof/>
+                <w:lang w:val="en-GB"/>
+              </w:rPr>
+              <w:t>Preperation of the project</w:t>
+            </w:r>
+            <w:r>
+              <w:rPr>
+                <w:noProof/>
+                <w:webHidden/>
+              </w:rPr>
+              <w:tab/>
+            </w:r>
+            <w:r>
+              <w:rPr>
+                <w:noProof/>
+                <w:webHidden/>
+              </w:rPr>
+              <w:fldChar w:fldCharType="begin"/>
+            </w:r>
+            <w:r>
+              <w:rPr>
+                <w:noProof/>
+                <w:webHidden/>
+              </w:rPr>
+              <w:instrText xml:space="preserve"> PAGEREF _Toc238146699 \h </w:instrText>
+            </w:r>
+            <w:r>
+              <w:rPr>
+                <w:noProof/>
+                <w:webHidden/>
+              </w:rPr>
+            </w:r>
+            <w:r>
+              <w:rPr>
+                <w:noProof/>
+                <w:webHidden/>
+              </w:rPr>
+              <w:fldChar w:fldCharType="separate"/>
+            </w:r>
+            <w:r>
+              <w:rPr>
+                <w:noProof/>
+                <w:webHidden/>
+              </w:rPr>
+              <w:t>3</w:t>
+            </w:r>
+            <w:r>
+              <w:rPr>
+                <w:noProof/>
+                <w:webHidden/>
+              </w:rPr>
+              <w:fldChar w:fldCharType="end"/>
+            </w:r>
+          </w:hyperlink>
+        </w:p>
+        <w:p>
+          <w:pPr>
+            <w:pStyle w:val="Verzeichnis1"/>
+            <w:tabs>
+              <w:tab w:val="left" w:pos="720"/>
+              <w:tab w:val="right" w:leader="dot" w:pos="8210"/>
+            </w:tabs>
+            <w:rPr>
+              <w:noProof/>
+              <w:kern w:val="2"/>
+              <w:sz w:val="24"/>
+              <w:szCs w:val="24"/>
+              <w:lang w:val="en-GB" w:eastAsia="en-GB"/>
+              <w14:ligatures w14:val="standardContextual"/>
+            </w:rPr>
+          </w:pPr>
+          <w:hyperlink w:anchor="_Toc238146700" w:history="1">
+            <w:r>
+              <w:rPr>
+                <w:rStyle w:val="Hyperlink"/>
+                <w:rFonts w:ascii="Arial" w:hAnsi="Arial" w:cs="Arial"/>
+                <w:b/>
+                <w:noProof/>
+                <w:lang w:val="en-GB"/>
+              </w:rPr>
+              <w:t>3.2</w:t>
+            </w:r>
+            <w:r>
+              <w:rPr>
+                <w:noProof/>
+                <w:kern w:val="2"/>
+                <w:sz w:val="24"/>
+                <w:szCs w:val="24"/>
+                <w:lang w:val="en-GB" w:eastAsia="en-GB"/>
+                <w14:ligatures w14:val="standardContextual"/>
+              </w:rPr>
+              <w:tab/>
+            </w:r>
+            <w:r>
+              <w:rPr>
+                <w:rStyle w:val="Hyperlink"/>
+                <w:rFonts w:ascii="Arial" w:hAnsi="Arial" w:cs="Arial"/>
+                <w:b/>
+                <w:noProof/>
+                <w:lang w:val="en-GB"/>
+              </w:rPr>
+              <w:t>Data source</w:t>
+            </w:r>
+            <w:r>
+              <w:rPr>
+                <w:noProof/>
+                <w:webHidden/>
+              </w:rPr>
+              <w:tab/>
+            </w:r>
+            <w:r>
+              <w:rPr>
+                <w:noProof/>
+                <w:webHidden/>
+              </w:rPr>
+              <w:fldChar w:fldCharType="begin"/>
+            </w:r>
+            <w:r>
+              <w:rPr>
+                <w:noProof/>
+                <w:webHidden/>
+              </w:rPr>
+              <w:instrText xml:space="preserve"> PAGEREF _Toc238146700 \h </w:instrText>
+            </w:r>
+            <w:r>
+              <w:rPr>
+                <w:noProof/>
+                <w:webHidden/>
+              </w:rPr>
+            </w:r>
+            <w:r>
+              <w:rPr>
+                <w:noProof/>
+                <w:webHidden/>
+              </w:rPr>
+              <w:fldChar w:fldCharType="separate"/>
+            </w:r>
+            <w:r>
+              <w:rPr>
+                <w:noProof/>
+                <w:webHidden/>
+              </w:rPr>
+              <w:t>3</w:t>
+            </w:r>
+            <w:r>
+              <w:rPr>
+                <w:noProof/>
+                <w:webHidden/>
+              </w:rPr>
+              <w:fldChar w:fldCharType="end"/>
+            </w:r>
+          </w:hyperlink>
+        </w:p>
+        <w:p>
+          <w:pPr>
+            <w:pStyle w:val="Verzeichnis1"/>
+            <w:tabs>
+              <w:tab w:val="left" w:pos="720"/>
+              <w:tab w:val="right" w:leader="dot" w:pos="8210"/>
+            </w:tabs>
+            <w:rPr>
+              <w:noProof/>
+              <w:kern w:val="2"/>
+              <w:sz w:val="24"/>
+              <w:szCs w:val="24"/>
+              <w:lang w:val="en-GB" w:eastAsia="en-GB"/>
+              <w14:ligatures w14:val="standardContextual"/>
+            </w:rPr>
+          </w:pPr>
+          <w:hyperlink w:anchor="_Toc238146701" w:history="1">
+            <w:r>
+              <w:rPr>
+                <w:rStyle w:val="Hyperlink"/>
+                <w:rFonts w:ascii="Arial" w:hAnsi="Arial" w:cs="Arial"/>
+                <w:b/>
+                <w:noProof/>
+                <w:lang w:val="en-GB"/>
+              </w:rPr>
+              <w:t>3.3</w:t>
+            </w:r>
+            <w:r>
+              <w:rPr>
+                <w:noProof/>
+                <w:kern w:val="2"/>
+                <w:sz w:val="24"/>
+                <w:szCs w:val="24"/>
+                <w:lang w:val="en-GB" w:eastAsia="en-GB"/>
+                <w14:ligatures w14:val="standardContextual"/>
+              </w:rPr>
+              <w:tab/>
+            </w:r>
+            <w:r>
+              <w:rPr>
+                <w:rStyle w:val="Hyperlink"/>
+                <w:rFonts w:ascii="Arial" w:hAnsi="Arial" w:cs="Arial"/>
+                <w:b/>
+                <w:noProof/>
+                <w:lang w:val="en-GB"/>
+              </w:rPr>
+              <w:t>Combining datasets</w:t>
+            </w:r>
+            <w:r>
+              <w:rPr>
+                <w:noProof/>
+                <w:webHidden/>
+              </w:rPr>
+              <w:tab/>
+            </w:r>
+            <w:r>
+              <w:rPr>
+                <w:noProof/>
+                <w:webHidden/>
+              </w:rPr>
+              <w:fldChar w:fldCharType="begin"/>
+            </w:r>
+            <w:r>
+              <w:rPr>
+                <w:noProof/>
+                <w:webHidden/>
+              </w:rPr>
+              <w:instrText xml:space="preserve"> PAGEREF _Toc238146701 \h </w:instrText>
+            </w:r>
+            <w:r>
+              <w:rPr>
+                <w:noProof/>
+                <w:webHidden/>
+              </w:rPr>
+            </w:r>
+            <w:r>
+              <w:rPr>
+                <w:noProof/>
+                <w:webHidden/>
+              </w:rPr>
+              <w:fldChar w:fldCharType="separate"/>
+            </w:r>
+            <w:r>
+              <w:rPr>
+                <w:noProof/>
+                <w:webHidden/>
+              </w:rPr>
+              <w:t>3</w:t>
+            </w:r>
+            <w:r>
+              <w:rPr>
+                <w:noProof/>
+                <w:webHidden/>
+              </w:rPr>
+              <w:fldChar w:fldCharType="end"/>
+            </w:r>
+          </w:hyperlink>
+        </w:p>
+        <w:p>
+          <w:pPr>
+            <w:pStyle w:val="Verzeichnis1"/>
+            <w:tabs>
+              <w:tab w:val="left" w:pos="720"/>
+              <w:tab w:val="right" w:leader="dot" w:pos="8210"/>
+            </w:tabs>
+            <w:rPr>
+              <w:noProof/>
+              <w:kern w:val="2"/>
+              <w:sz w:val="24"/>
+              <w:szCs w:val="24"/>
+              <w:lang w:val="en-GB" w:eastAsia="en-GB"/>
+              <w14:ligatures w14:val="standardContextual"/>
+            </w:rPr>
+          </w:pPr>
+          <w:hyperlink w:anchor="_Toc238146702" w:history="1">
+            <w:r>
+              <w:rPr>
+                <w:rStyle w:val="Hyperlink"/>
+                <w:rFonts w:ascii="Arial" w:hAnsi="Arial" w:cs="Arial"/>
+                <w:b/>
+                <w:noProof/>
+                <w:lang w:val="en-GB"/>
+              </w:rPr>
+              <w:t>3.4</w:t>
+            </w:r>
+            <w:r>
+              <w:rPr>
+                <w:noProof/>
+                <w:kern w:val="2"/>
+                <w:sz w:val="24"/>
+                <w:szCs w:val="24"/>
+                <w:lang w:val="en-GB" w:eastAsia="en-GB"/>
+                <w14:ligatures w14:val="standardContextual"/>
+              </w:rPr>
+              <w:tab/>
+            </w:r>
+            <w:r>
+              <w:rPr>
+                <w:rStyle w:val="Hyperlink"/>
+                <w:rFonts w:ascii="Arial" w:hAnsi="Arial" w:cs="Arial"/>
+                <w:b/>
+                <w:noProof/>
+                <w:lang w:val="en-GB"/>
+              </w:rPr>
+              <w:t>Cleaning the data</w:t>
+            </w:r>
+            <w:r>
+              <w:rPr>
+                <w:noProof/>
+                <w:webHidden/>
+              </w:rPr>
+              <w:tab/>
+            </w:r>
+            <w:r>
+              <w:rPr>
+                <w:noProof/>
+                <w:webHidden/>
+              </w:rPr>
+              <w:fldChar w:fldCharType="begin"/>
+            </w:r>
+            <w:r>
+              <w:rPr>
+                <w:noProof/>
+                <w:webHidden/>
+              </w:rPr>
+              <w:instrText xml:space="preserve"> PAGEREF _Toc238146702 \h </w:instrText>
+            </w:r>
+            <w:r>
+              <w:rPr>
+                <w:noProof/>
+                <w:webHidden/>
+              </w:rPr>
+            </w:r>
+            <w:r>
+              <w:rPr>
+                <w:noProof/>
+                <w:webHidden/>
+              </w:rPr>
+              <w:fldChar w:fldCharType="separate"/>
+            </w:r>
+            <w:r>
+              <w:rPr>
+                <w:noProof/>
+                <w:webHidden/>
+              </w:rPr>
+              <w:t>3</w:t>
+            </w:r>
+            <w:r>
+              <w:rPr>
+                <w:noProof/>
+                <w:webHidden/>
+              </w:rPr>
+              <w:fldChar w:fldCharType="end"/>
+            </w:r>
+          </w:hyperlink>
+        </w:p>
+        <w:p>
+          <w:pPr>
+            <w:pStyle w:val="Verzeichnis1"/>
+            <w:tabs>
+              <w:tab w:val="left" w:pos="720"/>
+              <w:tab w:val="right" w:leader="dot" w:pos="8210"/>
+            </w:tabs>
+            <w:rPr>
+              <w:noProof/>
+              <w:kern w:val="2"/>
+              <w:sz w:val="24"/>
+              <w:szCs w:val="24"/>
+              <w:lang w:val="en-GB" w:eastAsia="en-GB"/>
+              <w14:ligatures w14:val="standardContextual"/>
+            </w:rPr>
+          </w:pPr>
+          <w:hyperlink w:anchor="_Toc238146703" w:history="1">
+            <w:r>
+              <w:rPr>
+                <w:rStyle w:val="Hyperlink"/>
+                <w:rFonts w:ascii="Arial" w:hAnsi="Arial" w:cs="Arial"/>
+                <w:b/>
+                <w:noProof/>
+                <w:lang w:val="en-GB"/>
+              </w:rPr>
+              <w:t>3.5</w:t>
+            </w:r>
+            <w:r>
+              <w:rPr>
+                <w:noProof/>
+                <w:kern w:val="2"/>
+                <w:sz w:val="24"/>
+                <w:szCs w:val="24"/>
+                <w:lang w:val="en-GB" w:eastAsia="en-GB"/>
+                <w14:ligatures w14:val="standardContextual"/>
+              </w:rPr>
+              <w:tab/>
+            </w:r>
+            <w:r>
+              <w:rPr>
+                <w:rStyle w:val="Hyperlink"/>
+                <w:rFonts w:ascii="Arial" w:hAnsi="Arial" w:cs="Arial"/>
+                <w:b/>
+                <w:noProof/>
+                <w:lang w:val="en-GB"/>
+              </w:rPr>
+              <w:t>Data analysis</w:t>
+            </w:r>
+            <w:r>
+              <w:rPr>
+                <w:noProof/>
+                <w:webHidden/>
+              </w:rPr>
+              <w:tab/>
+            </w:r>
+            <w:r>
+              <w:rPr>
+                <w:noProof/>
+                <w:webHidden/>
+              </w:rPr>
+              <w:fldChar w:fldCharType="begin"/>
+            </w:r>
+            <w:r>
+              <w:rPr>
+                <w:noProof/>
+                <w:webHidden/>
+              </w:rPr>
+              <w:instrText xml:space="preserve"> PAGEREF _Toc238146703 \h </w:instrText>
             </w:r>
             <w:r>
               <w:rPr>
@@ -1240,14 +1732,13 @@
               <w14:ligatures w14:val="standardContextual"/>
             </w:rPr>
           </w:pPr>
-          <w:hyperlink w:anchor="_Toc237947570" w:history="1">
+          <w:hyperlink w:anchor="_Toc238146704" w:history="1">
             <w:r>
               <w:rPr>
                 <w:rStyle w:val="Hyperlink"/>
                 <w:rFonts w:ascii="Arial" w:hAnsi="Arial" w:cs="Arial"/>
                 <w:b/>
                 <w:noProof/>
-                <w:lang w:val="en-GB"/>
               </w:rPr>
               <w:t>4.</w:t>
             </w:r>
@@ -1268,9 +1759,8 @@
                 <w:rFonts w:ascii="Arial" w:hAnsi="Arial" w:cs="Arial"/>
                 <w:b/>
                 <w:noProof/>
-                <w:lang w:val="en-GB"/>
-              </w:rPr>
-              <w:t>Discussion</w:t>
+              </w:rPr>
+              <w:t>Results</w:t>
             </w:r>
             <w:r>
               <w:rPr>
@@ -1291,7 +1781,295 @@
                 <w:noProof/>
                 <w:webHidden/>
               </w:rPr>
-              <w:instrText xml:space="preserve"> PAGEREF _Toc237947570 \h </w:instrText>
+              <w:instrText xml:space="preserve"> PAGEREF _Toc238146704 \h </w:instrText>
+            </w:r>
+            <w:r>
+              <w:rPr>
+                <w:noProof/>
+                <w:webHidden/>
+              </w:rPr>
+            </w:r>
+            <w:r>
+              <w:rPr>
+                <w:noProof/>
+                <w:webHidden/>
+              </w:rPr>
+              <w:fldChar w:fldCharType="separate"/>
+            </w:r>
+            <w:r>
+              <w:rPr>
+                <w:noProof/>
+                <w:webHidden/>
+              </w:rPr>
+              <w:t>3</w:t>
+            </w:r>
+            <w:r>
+              <w:rPr>
+                <w:noProof/>
+                <w:webHidden/>
+              </w:rPr>
+              <w:fldChar w:fldCharType="end"/>
+            </w:r>
+          </w:hyperlink>
+        </w:p>
+        <w:p>
+          <w:pPr>
+            <w:pStyle w:val="Verzeichnis1"/>
+            <w:tabs>
+              <w:tab w:val="left" w:pos="720"/>
+              <w:tab w:val="right" w:leader="dot" w:pos="8210"/>
+            </w:tabs>
+            <w:rPr>
+              <w:noProof/>
+              <w:kern w:val="2"/>
+              <w:sz w:val="24"/>
+              <w:szCs w:val="24"/>
+              <w:lang w:val="en-GB" w:eastAsia="en-GB"/>
+              <w14:ligatures w14:val="standardContextual"/>
+            </w:rPr>
+          </w:pPr>
+          <w:hyperlink w:anchor="_Toc238146705" w:history="1">
+            <w:r>
+              <w:rPr>
+                <w:rStyle w:val="Hyperlink"/>
+                <w:rFonts w:ascii="Arial" w:hAnsi="Arial" w:cs="Arial"/>
+                <w:b/>
+                <w:noProof/>
+              </w:rPr>
+              <w:t>4.1</w:t>
+            </w:r>
+            <w:r>
+              <w:rPr>
+                <w:noProof/>
+                <w:kern w:val="2"/>
+                <w:sz w:val="24"/>
+                <w:szCs w:val="24"/>
+                <w:lang w:val="en-GB" w:eastAsia="en-GB"/>
+                <w14:ligatures w14:val="standardContextual"/>
+              </w:rPr>
+              <w:tab/>
+            </w:r>
+            <w:r>
+              <w:rPr>
+                <w:rStyle w:val="Hyperlink"/>
+                <w:rFonts w:ascii="Arial" w:hAnsi="Arial" w:cs="Arial"/>
+                <w:b/>
+                <w:noProof/>
+              </w:rPr>
+              <w:t>Combining Datasets</w:t>
+            </w:r>
+            <w:r>
+              <w:rPr>
+                <w:noProof/>
+                <w:webHidden/>
+              </w:rPr>
+              <w:tab/>
+            </w:r>
+            <w:r>
+              <w:rPr>
+                <w:noProof/>
+                <w:webHidden/>
+              </w:rPr>
+              <w:fldChar w:fldCharType="begin"/>
+            </w:r>
+            <w:r>
+              <w:rPr>
+                <w:noProof/>
+                <w:webHidden/>
+              </w:rPr>
+              <w:instrText xml:space="preserve"> PAGEREF _Toc238146705 \h </w:instrText>
+            </w:r>
+            <w:r>
+              <w:rPr>
+                <w:noProof/>
+                <w:webHidden/>
+              </w:rPr>
+            </w:r>
+            <w:r>
+              <w:rPr>
+                <w:noProof/>
+                <w:webHidden/>
+              </w:rPr>
+              <w:fldChar w:fldCharType="separate"/>
+            </w:r>
+            <w:r>
+              <w:rPr>
+                <w:noProof/>
+                <w:webHidden/>
+              </w:rPr>
+              <w:t>3</w:t>
+            </w:r>
+            <w:r>
+              <w:rPr>
+                <w:noProof/>
+                <w:webHidden/>
+              </w:rPr>
+              <w:fldChar w:fldCharType="end"/>
+            </w:r>
+          </w:hyperlink>
+        </w:p>
+        <w:p>
+          <w:pPr>
+            <w:pStyle w:val="Verzeichnis1"/>
+            <w:tabs>
+              <w:tab w:val="left" w:pos="720"/>
+              <w:tab w:val="right" w:leader="dot" w:pos="8210"/>
+            </w:tabs>
+            <w:rPr>
+              <w:noProof/>
+              <w:kern w:val="2"/>
+              <w:sz w:val="24"/>
+              <w:szCs w:val="24"/>
+              <w:lang w:val="en-GB" w:eastAsia="en-GB"/>
+              <w14:ligatures w14:val="standardContextual"/>
+            </w:rPr>
+          </w:pPr>
+          <w:hyperlink w:anchor="_Toc238146706" w:history="1">
+            <w:r>
+              <w:rPr>
+                <w:rStyle w:val="Hyperlink"/>
+                <w:rFonts w:ascii="Arial" w:hAnsi="Arial" w:cs="Arial"/>
+                <w:b/>
+                <w:noProof/>
+              </w:rPr>
+              <w:t>4.2</w:t>
+            </w:r>
+            <w:r>
+              <w:rPr>
+                <w:noProof/>
+                <w:kern w:val="2"/>
+                <w:sz w:val="24"/>
+                <w:szCs w:val="24"/>
+                <w:lang w:val="en-GB" w:eastAsia="en-GB"/>
+                <w14:ligatures w14:val="standardContextual"/>
+              </w:rPr>
+              <w:tab/>
+            </w:r>
+            <w:r>
+              <w:rPr>
+                <w:rStyle w:val="Hyperlink"/>
+                <w:rFonts w:ascii="Arial" w:hAnsi="Arial" w:cs="Arial"/>
+                <w:b/>
+                <w:noProof/>
+              </w:rPr>
+              <w:t>Cleaning the data</w:t>
+            </w:r>
+            <w:r>
+              <w:rPr>
+                <w:noProof/>
+                <w:webHidden/>
+              </w:rPr>
+              <w:tab/>
+            </w:r>
+            <w:r>
+              <w:rPr>
+                <w:noProof/>
+                <w:webHidden/>
+              </w:rPr>
+              <w:fldChar w:fldCharType="begin"/>
+            </w:r>
+            <w:r>
+              <w:rPr>
+                <w:noProof/>
+                <w:webHidden/>
+              </w:rPr>
+              <w:instrText xml:space="preserve"> PAGEREF _Toc238146706 \h </w:instrText>
+            </w:r>
+            <w:r>
+              <w:rPr>
+                <w:noProof/>
+                <w:webHidden/>
+              </w:rPr>
+            </w:r>
+            <w:r>
+              <w:rPr>
+                <w:noProof/>
+                <w:webHidden/>
+              </w:rPr>
+              <w:fldChar w:fldCharType="separate"/>
+            </w:r>
+            <w:r>
+              <w:rPr>
+                <w:noProof/>
+                <w:webHidden/>
+              </w:rPr>
+              <w:t>3</w:t>
+            </w:r>
+            <w:r>
+              <w:rPr>
+                <w:noProof/>
+                <w:webHidden/>
+              </w:rPr>
+              <w:fldChar w:fldCharType="end"/>
+            </w:r>
+          </w:hyperlink>
+        </w:p>
+        <w:p>
+          <w:pPr>
+            <w:pStyle w:val="Verzeichnis1"/>
+            <w:tabs>
+              <w:tab w:val="left" w:pos="720"/>
+              <w:tab w:val="right" w:leader="dot" w:pos="8210"/>
+            </w:tabs>
+            <w:rPr>
+              <w:noProof/>
+              <w:kern w:val="2"/>
+              <w:sz w:val="24"/>
+              <w:szCs w:val="24"/>
+              <w:lang w:val="en-GB" w:eastAsia="en-GB"/>
+              <w14:ligatures w14:val="standardContextual"/>
+            </w:rPr>
+          </w:pPr>
+          <w:hyperlink w:anchor="_Toc238146707" w:history="1">
+            <w:r>
+              <w:rPr>
+                <w:rStyle w:val="Hyperlink"/>
+                <w:rFonts w:ascii="Arial" w:hAnsi="Arial" w:cs="Arial"/>
+                <w:b/>
+                <w:noProof/>
+              </w:rPr>
+              <w:t>4.3</w:t>
+            </w:r>
+            <w:r>
+              <w:rPr>
+                <w:noProof/>
+                <w:kern w:val="2"/>
+                <w:sz w:val="24"/>
+                <w:szCs w:val="24"/>
+                <w:lang w:val="en-GB" w:eastAsia="en-GB"/>
+                <w14:ligatures w14:val="standardContextual"/>
+              </w:rPr>
+              <w:tab/>
+            </w:r>
+            <w:r>
+              <w:rPr>
+                <w:rStyle w:val="Hyperlink"/>
+                <w:rFonts w:ascii="Arial" w:hAnsi="Arial" w:cs="Arial"/>
+                <w:b/>
+                <w:noProof/>
+              </w:rPr>
+              <w:t>Data analysis</w:t>
+            </w:r>
+            <w:r>
+              <w:rPr>
+                <w:noProof/>
+                <w:webHidden/>
+              </w:rPr>
+              <w:tab/>
+            </w:r>
+            <w:r>
+              <w:rPr>
+                <w:noProof/>
+                <w:webHidden/>
+              </w:rPr>
+              <w:fldChar w:fldCharType="begin"/>
+            </w:r>
+            <w:r>
+              <w:rPr>
+                <w:noProof/>
+                <w:webHidden/>
+              </w:rPr>
+              <w:instrText xml:space="preserve"> PAGEREF _Toc238146707 \h </w:instrText>
             </w:r>
             <w:r>
               <w:rPr>
@@ -1338,7 +2116,7 @@
               <w14:ligatures w14:val="standardContextual"/>
             </w:rPr>
           </w:pPr>
-          <w:hyperlink w:anchor="_Toc237947571" w:history="1">
+          <w:hyperlink w:anchor="_Toc238146708" w:history="1">
             <w:r>
               <w:rPr>
                 <w:rStyle w:val="Hyperlink"/>
@@ -1368,7 +2146,7 @@
                 <w:noProof/>
                 <w:lang w:val="en-GB"/>
               </w:rPr>
-              <w:t>Conclusion</w:t>
+              <w:t>Discussion</w:t>
             </w:r>
             <w:r>
               <w:rPr>
@@ -1389,7 +2167,7 @@
                 <w:noProof/>
                 <w:webHidden/>
               </w:rPr>
-              <w:instrText xml:space="preserve"> PAGEREF _Toc237947571 \h </w:instrText>
+              <w:instrText xml:space="preserve"> PAGEREF _Toc238146708 \h </w:instrText>
             </w:r>
             <w:r>
               <w:rPr>
@@ -1436,7 +2214,7 @@
               <w14:ligatures w14:val="standardContextual"/>
             </w:rPr>
           </w:pPr>
-          <w:hyperlink w:anchor="_Toc237947572" w:history="1">
+          <w:hyperlink w:anchor="_Toc238146709" w:history="1">
             <w:r>
               <w:rPr>
                 <w:rStyle w:val="Hyperlink"/>
@@ -1466,6 +2244,104 @@
                 <w:noProof/>
                 <w:lang w:val="en-GB"/>
               </w:rPr>
+              <w:t>Conclusion</w:t>
+            </w:r>
+            <w:r>
+              <w:rPr>
+                <w:noProof/>
+                <w:webHidden/>
+              </w:rPr>
+              <w:tab/>
+            </w:r>
+            <w:r>
+              <w:rPr>
+                <w:noProof/>
+                <w:webHidden/>
+              </w:rPr>
+              <w:fldChar w:fldCharType="begin"/>
+            </w:r>
+            <w:r>
+              <w:rPr>
+                <w:noProof/>
+                <w:webHidden/>
+              </w:rPr>
+              <w:instrText xml:space="preserve"> PAGEREF _Toc238146709 \h </w:instrText>
+            </w:r>
+            <w:r>
+              <w:rPr>
+                <w:noProof/>
+                <w:webHidden/>
+              </w:rPr>
+            </w:r>
+            <w:r>
+              <w:rPr>
+                <w:noProof/>
+                <w:webHidden/>
+              </w:rPr>
+              <w:fldChar w:fldCharType="separate"/>
+            </w:r>
+            <w:r>
+              <w:rPr>
+                <w:noProof/>
+                <w:webHidden/>
+              </w:rPr>
+              <w:t>3</w:t>
+            </w:r>
+            <w:r>
+              <w:rPr>
+                <w:noProof/>
+                <w:webHidden/>
+              </w:rPr>
+              <w:fldChar w:fldCharType="end"/>
+            </w:r>
+          </w:hyperlink>
+        </w:p>
+        <w:p>
+          <w:pPr>
+            <w:pStyle w:val="Verzeichnis1"/>
+            <w:tabs>
+              <w:tab w:val="left" w:pos="440"/>
+              <w:tab w:val="right" w:leader="dot" w:pos="8210"/>
+            </w:tabs>
+            <w:rPr>
+              <w:noProof/>
+              <w:kern w:val="2"/>
+              <w:sz w:val="24"/>
+              <w:szCs w:val="24"/>
+              <w:lang w:val="en-GB" w:eastAsia="en-GB"/>
+              <w14:ligatures w14:val="standardContextual"/>
+            </w:rPr>
+          </w:pPr>
+          <w:hyperlink w:anchor="_Toc238146710" w:history="1">
+            <w:r>
+              <w:rPr>
+                <w:rStyle w:val="Hyperlink"/>
+                <w:rFonts w:ascii="Arial" w:hAnsi="Arial" w:cs="Arial"/>
+                <w:b/>
+                <w:noProof/>
+                <w:lang w:val="en-GB"/>
+              </w:rPr>
+              <w:t>7.</w:t>
+            </w:r>
+            <w:r>
+              <w:rPr>
+                <w:noProof/>
+                <w:kern w:val="2"/>
+                <w:sz w:val="24"/>
+                <w:szCs w:val="24"/>
+                <w:lang w:val="en-GB" w:eastAsia="en-GB"/>
+                <w14:ligatures w14:val="standardContextual"/>
+              </w:rPr>
+              <w:tab/>
+            </w:r>
+            <w:r>
+              <w:rPr>
+                <w:rStyle w:val="Hyperlink"/>
+                <w:rFonts w:ascii="Arial" w:hAnsi="Arial" w:cs="Arial"/>
+                <w:b/>
+                <w:noProof/>
+                <w:lang w:val="en-GB"/>
+              </w:rPr>
               <w:t>References</w:t>
             </w:r>
             <w:r>
@@ -1487,7 +2363,7 @@
                 <w:noProof/>
                 <w:webHidden/>
               </w:rPr>
-              <w:instrText xml:space="preserve"> PAGEREF _Toc237947572 \h </w:instrText>
+              <w:instrText xml:space="preserve"> PAGEREF _Toc238146710 \h </w:instrText>
             </w:r>
             <w:r>
               <w:rPr>
@@ -1523,14 +2399,6 @@
             <w:rPr>
               <w:rFonts w:ascii="Arial" w:hAnsi="Arial" w:cs="Arial"/>
             </w:rPr>
-            <w:sectPr>
-              <w:footerReference w:type="even" r:id="rId10"/>
-              <w:footerReference w:type="first" r:id="rId11"/>
-              <w:pgSz w:w="11906" w:h="16838"/>
-              <w:pgMar w:top="1418" w:right="2268" w:bottom="1134" w:left="1418" w:header="709" w:footer="709" w:gutter="0"/>
-              <w:cols w:space="708"/>
-              <w:docGrid w:linePitch="360"/>
-            </w:sectPr>
           </w:pPr>
           <w:r>
             <w:rPr>
@@ -1543,6 +2411,68 @@
     </w:sdt>
     <w:p>
       <w:pPr>
+        <w:rPr>
+          <w:rFonts w:ascii="Arial" w:hAnsi="Arial" w:cs="Arial"/>
+        </w:rPr>
+      </w:pPr>
+    </w:p>
+    <w:p>
+      <w:pPr>
+        <w:rPr>
+          <w:rFonts w:ascii="Arial" w:hAnsi="Arial" w:cs="Arial"/>
+        </w:rPr>
+      </w:pPr>
+    </w:p>
+    <w:p>
+      <w:pPr>
+        <w:rPr>
+          <w:rFonts w:ascii="Arial" w:hAnsi="Arial" w:cs="Arial"/>
+        </w:rPr>
+        <w:sectPr>
+          <w:footerReference w:type="even" r:id="rId10"/>
+          <w:footerReference w:type="first" r:id="rId11"/>
+          <w:pgSz w:w="11906" w:h="16838"/>
+          <w:pgMar w:top="1418" w:right="2268" w:bottom="1134" w:left="1418" w:header="709" w:footer="709" w:gutter="0"/>
+          <w:cols w:space="708"/>
+          <w:docGrid w:linePitch="360"/>
+        </w:sectPr>
+      </w:pPr>
+      <w:r>
+        <w:rPr>
+          <w:rFonts w:ascii="Arial" w:hAnsi="Arial" w:cs="Arial"/>
+        </w:rPr>
+        <w:fldChar w:fldCharType="begin"/>
+      </w:r>
+      <w:r>
+        <w:rPr>
+          <w:rFonts w:ascii="Arial" w:hAnsi="Arial" w:cs="Arial"/>
+        </w:rPr>
+        <w:instrText xml:space="preserve"> TOC \h \z \c "Abbildung" </w:instrText>
+      </w:r>
+      <w:r>
+        <w:rPr>
+          <w:rFonts w:ascii="Arial" w:hAnsi="Arial" w:cs="Arial"/>
+        </w:rPr>
+        <w:fldChar w:fldCharType="separate"/>
+      </w:r>
+      <w:r>
+        <w:rPr>
+          <w:rFonts w:ascii="Arial" w:hAnsi="Arial" w:cs="Arial"/>
+          <w:b/>
+          <w:bCs/>
+          <w:noProof/>
+        </w:rPr>
+        <w:t>Es konnten keine Einträge für ein Abbildungsverzeichnis gefunden werden.</w:t>
+      </w:r>
+      <w:r>
+        <w:rPr>
+          <w:rFonts w:ascii="Arial" w:hAnsi="Arial" w:cs="Arial"/>
+        </w:rPr>
+        <w:fldChar w:fldCharType="end"/>
+      </w:r>
+    </w:p>
+    <w:p>
+      <w:pPr>
         <w:pStyle w:val="Listenabsatz"/>
         <w:numPr>
           <w:ilvl w:val="0"/>
@@ -1556,7 +2486,7 @@
           <w:b/>
         </w:rPr>
       </w:pPr>
-      <w:bookmarkStart w:id="0" w:name="_Toc237947567"/>
+      <w:bookmarkStart w:id="0" w:name="_Toc238146696"/>
       <w:r>
         <w:rPr>
           <w:rFonts w:ascii="Arial" w:hAnsi="Arial" w:cs="Arial"/>
@@ -1652,74 +2582,27 @@
         <w:rPr>
           <w:rFonts w:ascii="Arial" w:hAnsi="Arial" w:cs="Arial"/>
           <w:b/>
-        </w:rPr>
-      </w:pPr>
-      <w:bookmarkStart w:id="1" w:name="_Toc237947568"/>
+          <w:lang w:val="en-GB"/>
+        </w:rPr>
+      </w:pPr>
+      <w:bookmarkStart w:id="1" w:name="_Toc238146697"/>
       <w:r>
         <w:rPr>
           <w:rFonts w:ascii="Arial" w:hAnsi="Arial" w:cs="Arial"/>
           <w:b/>
-        </w:rPr>
-        <w:t>Methodology</w:t>
+          <w:lang w:val="en-GB"/>
+        </w:rPr>
+        <w:t>Related Work / State of t</w:t>
       </w:r>
       <w:r>
         <w:rPr>
           <w:rFonts w:ascii="Arial" w:hAnsi="Arial" w:cs="Arial"/>
           <w:b/>
-        </w:rPr>
-        <w:t xml:space="preserve"> and Implementation</w:t>
+          <w:lang w:val="en-GB"/>
+        </w:rPr>
+        <w:t>he Art (optional)</w:t>
       </w:r>
       <w:bookmarkEnd w:id="1"/>
-    </w:p>
-    <w:p>
-      <w:pPr>
-        <w:spacing w:line="360" w:lineRule="auto"/>
-        <w:jc w:val="both"/>
-        <w:rPr>
-          <w:rFonts w:ascii="Arial" w:hAnsi="Arial" w:cs="Arial"/>
-          <w:bCs/>
-          <w:lang w:val="en-GB"/>
-        </w:rPr>
-      </w:pPr>
-      <w:r>
-        <w:rPr>
-          <w:rFonts w:ascii="Arial" w:hAnsi="Arial" w:cs="Arial"/>
-          <w:bCs/>
-          <w:lang w:val="en-GB"/>
-        </w:rPr>
-        <w:t>Text</w:t>
-      </w:r>
-    </w:p>
-    <w:p>
-      <w:pPr>
-        <w:spacing w:line="360" w:lineRule="auto"/>
-        <w:jc w:val="both"/>
-        <w:rPr>
-          <w:rFonts w:ascii="Arial" w:hAnsi="Arial" w:cs="Arial"/>
-          <w:bCs/>
-        </w:rPr>
-      </w:pPr>
-      <w:r>
-        <w:rPr>
-          <w:rFonts w:ascii="Arial" w:hAnsi="Arial" w:cs="Arial"/>
-          <w:bCs/>
-        </w:rPr>
-        <w:t xml:space="preserve">Sensor 31 am besten entfernen, </w:t>
-      </w:r>
-      <w:r>
-        <w:rPr>
-          <w:rFonts w:ascii="Arial" w:hAnsi="Arial" w:cs="Arial"/>
-          <w:bCs/>
-        </w:rPr>
-        <w:t>d</w:t>
-      </w:r>
-      <w:r>
-        <w:rPr>
-          <w:rFonts w:ascii="Arial" w:hAnsi="Arial" w:cs="Arial"/>
-          <w:bCs/>
-        </w:rPr>
-        <w:t>a die werte dort beim cleaning bzw bei den flags häufig als unplausibel gewertet wurden</w:t>
-      </w:r>
     </w:p>
     <w:p>
       <w:pPr>
@@ -1736,18 +2619,76 @@
           <w:b/>
         </w:rPr>
       </w:pPr>
-      <w:bookmarkStart w:id="2" w:name="_Toc237947569"/>
+      <w:bookmarkStart w:id="2" w:name="_Toc238146698"/>
       <w:r>
         <w:rPr>
           <w:rFonts w:ascii="Arial" w:hAnsi="Arial" w:cs="Arial"/>
           <w:b/>
         </w:rPr>
-        <w:t>Results</w:t>
+        <w:t>Methodology</w:t>
+      </w:r>
+      <w:r>
+        <w:rPr>
+          <w:rFonts w:ascii="Arial" w:hAnsi="Arial" w:cs="Arial"/>
+          <w:b/>
+        </w:rPr>
+        <w:t xml:space="preserve"> and Implementation</w:t>
       </w:r>
       <w:bookmarkEnd w:id="2"/>
     </w:p>
     <w:p>
       <w:pPr>
+        <w:pStyle w:val="Listenabsatz"/>
+        <w:numPr>
+          <w:ilvl w:val="1"/>
+          <w:numId w:val="31"/>
+        </w:numPr>
+        <w:spacing w:after="240" w:line="360" w:lineRule="auto"/>
+        <w:jc w:val="both"/>
+        <w:outlineLvl w:val="0"/>
+        <w:rPr>
+          <w:rFonts w:ascii="Arial" w:hAnsi="Arial" w:cs="Arial"/>
+          <w:b/>
+          <w:lang w:val="en-GB"/>
+        </w:rPr>
+      </w:pPr>
+      <w:bookmarkStart w:id="3" w:name="_Toc238146699"/>
+      <w:r>
+        <w:rPr>
+          <w:rFonts w:ascii="Arial" w:hAnsi="Arial" w:cs="Arial"/>
+          <w:b/>
+          <w:lang w:val="en-GB"/>
+        </w:rPr>
+        <w:t>P</w:t>
+      </w:r>
+      <w:r>
+        <w:rPr>
+          <w:rFonts w:ascii="Arial" w:hAnsi="Arial" w:cs="Arial"/>
+          <w:b/>
+          <w:lang w:val="en-GB"/>
+        </w:rPr>
+        <w:t>r</w:t>
+      </w:r>
+      <w:r>
+        <w:rPr>
+          <w:rFonts w:ascii="Arial" w:hAnsi="Arial" w:cs="Arial"/>
+          <w:b/>
+          <w:lang w:val="en-GB"/>
+        </w:rPr>
+        <w:t>eperation of the project</w:t>
+      </w:r>
+      <w:bookmarkEnd w:id="3"/>
+      <w:r>
+        <w:rPr>
+          <w:rFonts w:ascii="Arial" w:hAnsi="Arial" w:cs="Arial"/>
+          <w:b/>
+          <w:lang w:val="en-GB"/>
+        </w:rPr>
+        <w:t xml:space="preserve"> </w:t>
+      </w:r>
+    </w:p>
+    <w:p>
+      <w:pPr>
         <w:spacing w:line="360" w:lineRule="auto"/>
         <w:jc w:val="both"/>
         <w:rPr>
@@ -1762,7 +2703,1792 @@
           <w:bCs/>
           <w:lang w:val="en-GB"/>
         </w:rPr>
+        <w:t xml:space="preserve">For preparing the project, </w:t>
+      </w:r>
+      <w:r>
+        <w:rPr>
+          <w:rFonts w:ascii="Arial" w:hAnsi="Arial" w:cs="Arial"/>
+          <w:bCs/>
+          <w:lang w:val="en-GB"/>
+        </w:rPr>
+        <w:t>first</w:t>
+      </w:r>
+      <w:r>
+        <w:rPr>
+          <w:rFonts w:ascii="Arial" w:hAnsi="Arial" w:cs="Arial"/>
+          <w:bCs/>
+          <w:lang w:val="en-GB"/>
+        </w:rPr>
+        <w:t xml:space="preserve"> i</w:t>
+      </w:r>
+      <w:r>
+        <w:rPr>
+          <w:rFonts w:ascii="Arial" w:hAnsi="Arial" w:cs="Arial"/>
+          <w:bCs/>
+          <w:lang w:val="en-GB"/>
+        </w:rPr>
+        <w:t>t</w:t>
+      </w:r>
+      <w:r>
+        <w:rPr>
+          <w:rFonts w:ascii="Arial" w:hAnsi="Arial" w:cs="Arial"/>
+          <w:bCs/>
+          <w:lang w:val="en-GB"/>
+        </w:rPr>
+        <w:t xml:space="preserve"> was important to find </w:t>
+      </w:r>
+      <w:r>
+        <w:rPr>
+          <w:rFonts w:ascii="Arial" w:hAnsi="Arial" w:cs="Arial"/>
+          <w:bCs/>
+          <w:lang w:val="en-GB"/>
+        </w:rPr>
+        <w:t xml:space="preserve">a specific dataset that fits to the selected topic. </w:t>
+      </w:r>
+      <w:r>
+        <w:rPr>
+          <w:rFonts w:ascii="Arial" w:hAnsi="Arial" w:cs="Arial"/>
+          <w:bCs/>
+          <w:lang w:val="en-GB"/>
+        </w:rPr>
+        <w:t xml:space="preserve">After some research the </w:t>
+      </w:r>
+      <w:r>
+        <w:rPr>
+          <w:rFonts w:ascii="Arial" w:hAnsi="Arial" w:cs="Arial"/>
+          <w:bCs/>
+          <w:lang w:val="en-GB"/>
+        </w:rPr>
+        <w:t xml:space="preserve">CARE-to-Compare dataset </w:t>
+      </w:r>
+      <w:r>
+        <w:rPr>
+          <w:rFonts w:ascii="Arial" w:hAnsi="Arial" w:cs="Arial"/>
+          <w:bCs/>
+          <w:lang w:val="en-GB"/>
+        </w:rPr>
+        <w:fldChar w:fldCharType="begin"/>
+      </w:r>
+      <w:r>
+        <w:rPr>
+          <w:rFonts w:ascii="Arial" w:hAnsi="Arial" w:cs="Arial"/>
+          <w:bCs/>
+          <w:lang w:val="en-GB"/>
+        </w:rPr>
+        <w:instrText xml:space="preserve"> ADDIN ZOTERO_ITEM CSL_CITATION {"citationID":"NPg7ncCk","properties":{"unsorted":false,"formattedCitation":"[1]","plainCitation":"[1]","noteIndex":0},"citationItems":[{"id":454,"uris":["http://zotero.org/users/16453226/items/TVA5PR4W"],"itemData":{"id":454,"type":"dataset","abstract":"Table of Contents\n\n\n\nData Description\n\n\n\nNotes\n\n\n\n\n\nKnown Data Issues\n\n\n\n\nVersion Changes\n\n\n\n\n\nDescription\n\nThis dataset is published together with the paper \"CARE to Compare: A real-world dataset for anomaly detection in wind turbine data\" which explains the dataset in detail and defines the CARE score that can be used to evaluate anomaly detection algorithms on this dataset. When referring to this dataset, please cite the paper mentioned in the related work section. \n\nThe data consists of 95 datasets, containing 89 years of SCADA time series distributed across 36 different wind turbinesfrom the three wind farms A, B and C. The number of features depends on the wind farm; Wind farm A has 86 features, wind farm B has 257 features and wind farm C has 957 features. \n\nThe overall dataset is balanced, as 45 out the 95 datasets contain a labeled anomaly event that leads up to a turbine fault and the other 50 datasets represent normal behavior. Additionally, the quality of training data is ensured by turbine-status-based labels for each data point and further information about some of the given turbine faults are included.\n\nThe data for Wind farm A is based on data from the EDP open data platform (https://www.edp.com/en/innovation/open-data/data), and consists of 5 wind turbines of an onshore wind farm in Portugal. It contains SCADA data and information derived by a given fault logbook which defines start timestamps for specified faults. From this data 22 datasets were selected to be included in this data collection. The other two wind farms are offshore wind farms located in Germany. All three datasets were anonymized due to confidentiality reasons for the wind farms B and C.Each dataset is provided in form of a csv-file with columns defining the features and rows representing the data points of the time series. Files\n\nMore detailed information can be found in the included README-file.\n\nNotes\n\nIn wind farm A status_type_id labels can be ignored while evaluating prediction time frames of error events with metrics like the CARE-score since the status_type_id is of wind farm A is based on the EDP failure logbook and it is intended to be used for filtering of the training data.\n\nKnown Data Issues\n\nThis dataset contains per</w:instrText>
+      </w:r>
+      <w:r>
+        <w:rPr>
+          <w:rFonts w:ascii="Cambria Math" w:hAnsi="Cambria Math" w:cs="Cambria Math"/>
+          <w:bCs/>
+          <w:lang w:val="en-GB"/>
+        </w:rPr>
+        <w:instrText>‑</w:instrText>
+      </w:r>
+      <w:r>
+        <w:rPr>
+          <w:rFonts w:ascii="Arial" w:hAnsi="Arial" w:cs="Arial"/>
+          <w:bCs/>
+          <w:lang w:val="en-GB"/>
+        </w:rPr>
+        <w:instrText xml:space="preserve">timestamp summary statistics (Min, Max, Avg, Std) for multiple sensors and wind farms.The following issues are known and should be taken into account when using the data.\n\n1. General Remarks and Recommendations\n\n\n\nImplausible values in Min, Max and Std are present across all wind farms, with varying severity by feature and site.\n\nValues were provided as-is by the operator. The only modifications are:\n\n\n\nAnonymization-related scaling of power-related data. \n\nRenaming of features.\n\n\nAs a consequence, all Min, Max and Std values should be used with caution and may not be physically meaningful.\n\nPer-timestamp Avg (average) sensor measurements are generally plausible across all datasets and can be used for meaningful analysis.\n\n\n2. Types of Issues\n\nThe following types of implausibilities occur in the Min/Max/Std statistics:\n\n\n\n\n\n\nIssue\n\n\n\nDescription\n\n\n\n\n\n1\n\n\n\nStd per timestamp is higher than the maximum possible standard deviation given the corresponding Min, Max and Avg.\n\n\n\n\n\n2\n\n\n\nMin values are higher than the corresponding Avg values.\n\n\n\n\n\n3\n\n\n\nMax values are lower than the corresponding Avg values.\n\n\n\n\n\n4\n\n\n\nMin, Max and Std are equal to 0 for all datapoints of a feature.\n\n\n\n\n\n \n\n3. Wind-Farm-Specific Issues\n\n3.1 Wind Farm A\n\n\n\nGrid Reactive Power\n\n\n\nMin, Max and Std are affected by Issue 1 and Issue 3.\n\n\nPitch Angle\n\n\n\nContains implausible values likely caused by angle wrapping (e.g. 0° equivalent to 360°), leading to ambiguities.\n\n\nAll other sensors\n\n\n\nHave fewer than 5% implausible values in Min/Max/Std.\n\nThese features can generally be cleaned and used after appropriate quality filtering.\n\n\n\n3.2 Wind Farm B\n\n\n\nFeatures with constant zero statistics (Issue 4) For the following sensors, Min, Max and Std are equal to 0 for all datapoints: \n\n\n\nsensor_0, sensor_1, sensor_2, sensor_3, sensor_5, sensor_9\n\n\nFeatures with localized inconsistencies (Issues 1, 2, 3) The following sensors show Issues 1, 2 and 3 for about 5% of datapoints on average across all events: \n\n\n\nsensor_6, sensor_54, sensor_55, sensor_56, wind_speed_60\n\n\nAll other features with Min/Max/Std in Wind Farm B \n\n\n\nA large proportion (typically &gt;50%) of datapoints per feature is affected by Issue 1.\n\nFor many signals, the share of datapoints with implausible Min/Max/Std values is close to 100%.\n\n\n\nRecommendation for Wind Farm B:Use Avg signals only for most analyses. Treat all Min, Max and Std statistics as unreliable unless you perform additional, feature-specific validation.\n\n \n\n3.3 Wind Farm C\n\nIn Wind Farm C, Min/Max/Std statistics exhibit varying levels of contamination by Issues 1, 2 and 3. The percentages refer to the average fraction of affected datapoints across all events of Wind Farm C.\n\n3.3.1 High Contamination (≈20–30% of datapoints affected)\n\nThe following 17 sensors have a high proportion (20–30%) of datapoints affected by Issues 1, 2 and 3:\n\n\n\nsensor_11, sensor_15, sensor_40, sensor_61, sensor_62, sensor_63, sensor_64, sensor_74, sensor_194, sensor_195, sensor_197, sensor_198, sensor_205, sensor_206, sensor_207,sensor_217, sensor_218\n\n\nThese features should be treated with particular caution when using Min/Max/Std.\n\n3.3.2 Medium to High Contamination (≈10–15% of datapoints affected)\n\nThe following 90 sensors show a medium to high proportion (mostly 10–15%) of datapoints affected by Issues 1, 2 and 3:\n\n\n\npower_5, power_6, sensor_7, sensor_9, sensor_10, sensor_12, sensor_13, sensor_14, sensor_18, sensor_19, sensor_20, sensor_21, sensor_23, sensor_24, sensor_26, sensor_39,sensor_41, sensor_44, sensor_45, sensor_65, sensor_71, sensor_72, sensor_73, sensor_77,sensor_78, sensor_79, sensor_80, sensor_87, sensor_88, sensor_89, sensor_95, sensor_96,sensor_104, sensor_105, sensor_106, sensor_149, sensor_150, sensor_151, sensor_152,sensor_153, sensor_154, sensor_155, sensor_156, sensor_157, sensor_158, sensor_159,sensor_160, sensor_161, sensor_162, sensor_163, sensor_164, sensor_165, sensor_166,sensor_167, sensor_168, sensor_169, sensor_170, sensor_171, sensor_176, sensor_178,sensor_179, sensor_180, sensor_181, sensor_182, sensor_183, sensor_184, sensor_185,sensor_186, sensor_187, sensor_188, sensor_189, sensor_190, sensor_191, sensor_192,sensor_193, sensor_196, sensor_199, sensor_200, sensor_201, sensor_202, sensor_203,sensor_204, sensor_210, sensor_212, sensor_213, sensor_225, sensor_231, sensor_232,sensor_233, sensor_234\n\n\n3.3.3 Low Contamination (&lt;5% of datapoints affected)\n\nThe following 131 sensors show a low contamination level (below 5% of datapoints affected by Issues 1, 2 and 3):\n\nsensor_0, sensor_1, power_2, sensor_3, sensor_4, sensor_8, sensor_16, power_17, sensor_22, sensor_25, sensor_27, sensor_28, sensor_29, sensor_30, sensor_31, sensor_32,sensor_33, sensor_34, sensor_35, sensor_36, sensor_37, sensor_38, sensor_42, sensor_43,sensor_46, sensor_47, sensor_48, sensor_49, sensor_50, sensor_51, sensor_52, sensor_53,sensor_54, sensor_55, sensor_56, sensor_57, sensor_58, sensor_59, sensor_60, sensor_66,sensor_67, sensor_68, sensor_69, sensor_70, sensor_75, sensor_76, sensor_81, sensor_82,sensor_83, sensor_84, sensor_85, sensor_86, sensor_90, sensor_91, sensor_92, sensor_93,sensor_94, sensor_97, sensor_98, sensor_99, sensor_100, sensor_101, sensor_102, sensor_103,sensor_108, sensor_107, sensor_109, sensor_110, sensor_111, sensor_112, sensor_113, sensor_114,sensor_115, sensor_116, sensor_117, sensor_118, reactive_power_119, reactive_power_120,reactive_power_121, reactive_power_122, sensor_123, sensor_124, sensor_125, sensor_126,sensor_127, sensor_128, sensor_129, sensor_130, sensor_131, sensor_132, sensor_133,sensor_134, sensor_135, sensor_136, sensor_137, sensor_138, sensor_139, sensor_140,sensor_141, sensor_142, sensor_143, sensor_144, sensor_145, sensor_146, sensor_147,sensor_148, sensor_172, sensor_173, sensor_174, sensor_175, sensor_177, sensor_208,sensor_209, sensor_211, sensor_214, sensor_215, sensor_216, sensor_219, sensor_220,sensor_221, sensor_222, sensor_223, sensor_224, sensor_226, sensor_227, sensor_228,sensor_229, sensor_230, wind_speed_236, wind_speed_235, wind_speed_237\n\nVersion Changes:\n\nVersion 5 -&gt; 6:\n\n\n\nChanged unit of sensor_40 and sensor_61 for wind farm C to hPa instead of bar. This unit error became obvious when looking at the data and comparing it to the standard air pressure.\n\nEdited event_description of events 34, 7 and 19 to high temperature in transformer cell.\n\nChanged date in event description of event 44 since it was not affected by the change in the date anonymization procedure from version 2.\n\nChanged date in event description of event 47 since it was not affected by the change in the date anonymization procedure from version 2 and edited the description text\n\n Changed date format in event_info files to match the date format in the dataset files.\n\nFixed typo in Readme\n\nRe-added Readme files\n\n\nVersion 4-&gt;5:\n\nCorrections to labels were made:\n\n\n\nPreviously missing status_type_id 4 labels were added to datasets in Wind Farm A. \n\nEvent 51 from Wind Farm A was wrongly labeled as a normal event. With the newly added status_type_id 4 occurences, it is to be considered an anomaly event due to a gearbox bearing damage within the prediction data.\n\nWind Farm A no longer contains status_type_id 5. All occurences of status_type_id 5 have been changed to 0 and are considered normal time stamps. This change is done, because status_type_id 5 was set as a result of a wind speed and power analysis, flagging potential anomalous data. This is not based on a fixed ground truth, so status_type_id 5 was removed. For Wind Farms B and C status_type_id 5 is still valid since it is based on real SCADA-status codes.\n\nThe event_info.csv files now contain an additional column 'asset_id'.\n\n\nVersion 3-&gt;4:\n\n\n\nThe change of the timestamp anonymization lead to duplicate timestamps when transitioning from a leap year to 2022. This is now fixed in Version 4.\n\n\nVersion 2-&gt;3:\n\n\n\nIn version 2 timestamp changes were not consistent with the timestamps in the event-info-files. Version 3 fixes this.\n\n\nVersion 1-&gt;2:\n\n\n\nVersion 2 contains one deviation from version 1 regarding the anonymization procedure. Instead of shifting the timestamps of each sub-dataset by a random number of years, the size of the time shift is now determined to be the number of years so that each sub-dataset starts in 2022. This change is made to make the timestamp anonymization more consistent and to avoid future timestamps being present within the data.","DOI":"10.5281/ZENODO.10958774","language":"en","license":"Creative Commons Attribution Share Alike 4.0 International","publisher":"Zenodo","source":"DOI.org (Datacite)","title":"Wind Turbine SCADA Data For Early Fault Detection","URL":"https://zenodo.org/doi/10.5281/zenodo.10958774","version":"v1.0","author":[{"family":"Gück","given":"Christian"},{"family":"Roelofs","given":"Cyriana"}],"accessed":{"date-parts":[["2026",8,20]]},"issued":{"date-parts":[["2025",7,9]]}}}],"schema":"https://github.com/citation-style-language/schema/raw/master/csl-citation.json"} </w:instrText>
+      </w:r>
+      <w:r>
+        <w:rPr>
+          <w:rFonts w:ascii="Arial" w:hAnsi="Arial" w:cs="Arial"/>
+          <w:bCs/>
+          <w:lang w:val="en-GB"/>
+        </w:rPr>
+        <w:fldChar w:fldCharType="separate"/>
+      </w:r>
+      <w:r>
+        <w:rPr>
+          <w:rFonts w:ascii="Arial" w:hAnsi="Arial" w:cs="Arial"/>
+          <w:lang w:val="en-GB"/>
+        </w:rPr>
+        <w:t>[1]</w:t>
+      </w:r>
+      <w:r>
+        <w:rPr>
+          <w:rFonts w:ascii="Arial" w:hAnsi="Arial" w:cs="Arial"/>
+          <w:bCs/>
+          <w:lang w:val="en-GB"/>
+        </w:rPr>
+        <w:fldChar w:fldCharType="end"/>
+      </w:r>
+      <w:r>
+        <w:rPr>
+          <w:rFonts w:ascii="Arial" w:hAnsi="Arial" w:cs="Arial"/>
+          <w:bCs/>
+          <w:lang w:val="en-GB"/>
+        </w:rPr>
+        <w:t xml:space="preserve"> was selected as the most s</w:t>
+      </w:r>
+      <w:r>
+        <w:rPr>
+          <w:rFonts w:ascii="Arial" w:hAnsi="Arial" w:cs="Arial"/>
+          <w:bCs/>
+          <w:lang w:val="en-GB"/>
+        </w:rPr>
+        <w:t>uitable dataset for this topic.</w:t>
+      </w:r>
+      <w:r>
+        <w:rPr>
+          <w:rFonts w:ascii="Arial" w:hAnsi="Arial" w:cs="Arial"/>
+          <w:bCs/>
+          <w:lang w:val="en-GB"/>
+        </w:rPr>
+        <w:t xml:space="preserve"> The decision was based on data av</w:t>
+      </w:r>
+      <w:r>
+        <w:rPr>
+          <w:rFonts w:ascii="Arial" w:hAnsi="Arial" w:cs="Arial"/>
+          <w:bCs/>
+          <w:lang w:val="en-GB"/>
+        </w:rPr>
+        <w:t>ailability</w:t>
+      </w:r>
+      <w:r>
+        <w:rPr>
+          <w:rFonts w:ascii="Arial" w:hAnsi="Arial" w:cs="Arial"/>
+          <w:bCs/>
+          <w:lang w:val="en-GB"/>
+        </w:rPr>
+        <w:t xml:space="preserve">, documentation quality, and relevance to the research goal. </w:t>
+      </w:r>
+      <w:r>
+        <w:rPr>
+          <w:rFonts w:ascii="Arial" w:hAnsi="Arial" w:cs="Arial"/>
+          <w:bCs/>
+          <w:lang w:val="en-GB"/>
+        </w:rPr>
+        <w:t xml:space="preserve">Before starting with the </w:t>
+      </w:r>
+      <w:r>
+        <w:rPr>
+          <w:rFonts w:ascii="Arial" w:hAnsi="Arial" w:cs="Arial"/>
+          <w:bCs/>
+          <w:lang w:val="en-GB"/>
+        </w:rPr>
+        <w:t>technical work, it was important to</w:t>
+      </w:r>
+      <w:r>
+        <w:rPr>
+          <w:rFonts w:ascii="Arial" w:hAnsi="Arial" w:cs="Arial"/>
+          <w:bCs/>
+          <w:lang w:val="en-GB"/>
+        </w:rPr>
+        <w:t xml:space="preserve"> review the documentation like the README</w:t>
+      </w:r>
+      <w:r>
+        <w:rPr>
+          <w:rFonts w:ascii="Arial" w:hAnsi="Arial" w:cs="Arial"/>
+          <w:bCs/>
+          <w:lang w:val="en-GB"/>
+        </w:rPr>
+        <w:t xml:space="preserve"> and</w:t>
+      </w:r>
+      <w:r>
+        <w:rPr>
+          <w:rFonts w:ascii="Arial" w:hAnsi="Arial" w:cs="Arial"/>
+          <w:bCs/>
+          <w:lang w:val="en-GB"/>
+        </w:rPr>
+        <w:t xml:space="preserve"> </w:t>
+      </w:r>
+      <w:r>
+        <w:rPr>
+          <w:rFonts w:ascii="Arial" w:hAnsi="Arial" w:cs="Arial"/>
+          <w:bCs/>
+          <w:lang w:val="en-GB"/>
+        </w:rPr>
+        <w:t xml:space="preserve">the </w:t>
+      </w:r>
+      <w:r>
+        <w:rPr>
+          <w:rFonts w:ascii="Arial" w:hAnsi="Arial" w:cs="Arial"/>
+          <w:bCs/>
+          <w:lang w:val="en-GB"/>
+        </w:rPr>
+        <w:t>known data issues</w:t>
+      </w:r>
+      <w:r>
+        <w:rPr>
+          <w:rFonts w:ascii="Arial" w:hAnsi="Arial" w:cs="Arial"/>
+          <w:bCs/>
+          <w:lang w:val="en-GB"/>
+        </w:rPr>
+        <w:t xml:space="preserve"> to understand the dataset structure and limitations.</w:t>
+      </w:r>
+    </w:p>
+    <w:p>
+      <w:pPr>
+        <w:spacing w:line="360" w:lineRule="auto"/>
+        <w:jc w:val="both"/>
+        <w:rPr>
+          <w:rFonts w:ascii="Arial" w:hAnsi="Arial" w:cs="Arial"/>
+          <w:bCs/>
+          <w:lang w:val="en-GB"/>
+        </w:rPr>
+      </w:pPr>
+      <w:r>
+        <w:rPr>
+          <w:rFonts w:ascii="Arial" w:hAnsi="Arial" w:cs="Arial"/>
+          <w:bCs/>
+          <w:lang w:val="en-GB"/>
+        </w:rPr>
+        <w:t>As a next step, the project infrastructure was created</w:t>
+      </w:r>
+      <w:r>
+        <w:rPr>
+          <w:rFonts w:ascii="Arial" w:hAnsi="Arial" w:cs="Arial"/>
+          <w:bCs/>
+          <w:lang w:val="en-GB"/>
+        </w:rPr>
+        <w:t xml:space="preserve">. </w:t>
+      </w:r>
+      <w:r>
+        <w:rPr>
+          <w:rFonts w:ascii="Arial" w:hAnsi="Arial" w:cs="Arial"/>
+          <w:bCs/>
+          <w:lang w:val="en-GB"/>
+        </w:rPr>
+        <w:t xml:space="preserve">For this, Visual Studio Code was prepared as the </w:t>
+      </w:r>
+      <w:r>
+        <w:rPr>
+          <w:rFonts w:ascii="Arial" w:hAnsi="Arial" w:cs="Arial"/>
+          <w:bCs/>
+          <w:lang w:val="en-GB"/>
+        </w:rPr>
+        <w:t xml:space="preserve">main software for </w:t>
+      </w:r>
+      <w:r>
+        <w:rPr>
+          <w:rFonts w:ascii="Arial" w:hAnsi="Arial" w:cs="Arial"/>
+          <w:bCs/>
+          <w:lang w:val="en-GB"/>
+        </w:rPr>
+        <w:t>programming</w:t>
+      </w:r>
+      <w:r>
+        <w:rPr>
+          <w:rFonts w:ascii="Arial" w:hAnsi="Arial" w:cs="Arial"/>
+          <w:bCs/>
+          <w:lang w:val="en-GB"/>
+        </w:rPr>
+        <w:t xml:space="preserve">. In addition, </w:t>
+      </w:r>
+      <w:r>
+        <w:rPr>
+          <w:rFonts w:ascii="Arial" w:hAnsi="Arial" w:cs="Arial"/>
+          <w:bCs/>
+          <w:lang w:val="en-GB"/>
+        </w:rPr>
+        <w:t xml:space="preserve">a GitHub repository was created </w:t>
+      </w:r>
+      <w:r>
+        <w:rPr>
+          <w:rFonts w:ascii="Arial" w:hAnsi="Arial" w:cs="Arial"/>
+          <w:bCs/>
+          <w:lang w:val="en-GB"/>
+        </w:rPr>
+        <w:t>to enable</w:t>
+      </w:r>
+      <w:r>
+        <w:rPr>
+          <w:rFonts w:ascii="Arial" w:hAnsi="Arial" w:cs="Arial"/>
+          <w:bCs/>
+          <w:lang w:val="en-GB"/>
+        </w:rPr>
+        <w:t xml:space="preserve"> </w:t>
+      </w:r>
+      <w:r>
+        <w:rPr>
+          <w:rFonts w:ascii="Arial" w:hAnsi="Arial" w:cs="Arial"/>
+          <w:bCs/>
+          <w:lang w:val="en-GB"/>
+        </w:rPr>
+        <w:t>backu</w:t>
+      </w:r>
+      <w:r>
+        <w:rPr>
+          <w:rFonts w:ascii="Arial" w:hAnsi="Arial" w:cs="Arial"/>
+          <w:bCs/>
+          <w:lang w:val="en-GB"/>
+        </w:rPr>
+        <w:t>p</w:t>
+      </w:r>
+      <w:r>
+        <w:rPr>
+          <w:rFonts w:ascii="Arial" w:hAnsi="Arial" w:cs="Arial"/>
+          <w:bCs/>
+          <w:lang w:val="en-GB"/>
+        </w:rPr>
+        <w:t>, documentation</w:t>
+      </w:r>
+      <w:r>
+        <w:rPr>
+          <w:rFonts w:ascii="Arial" w:hAnsi="Arial" w:cs="Arial"/>
+          <w:bCs/>
+          <w:lang w:val="en-GB"/>
+        </w:rPr>
+        <w:t>, and collaborative work between both project partners</w:t>
+      </w:r>
+      <w:r>
+        <w:rPr>
+          <w:rFonts w:ascii="Arial" w:hAnsi="Arial" w:cs="Arial"/>
+          <w:bCs/>
+          <w:lang w:val="en-GB"/>
+        </w:rPr>
+        <w:t xml:space="preserve">. </w:t>
+      </w:r>
+      <w:r>
+        <w:rPr>
+          <w:rFonts w:ascii="Arial" w:hAnsi="Arial" w:cs="Arial"/>
+          <w:bCs/>
+          <w:lang w:val="en-GB"/>
+        </w:rPr>
+        <w:t xml:space="preserve">A structured local project folder </w:t>
+      </w:r>
+      <w:r>
+        <w:rPr>
+          <w:rFonts w:ascii="Arial" w:hAnsi="Arial" w:cs="Arial"/>
+          <w:bCs/>
+          <w:lang w:val="en-GB"/>
+        </w:rPr>
+        <w:t>was then created, along with a .gitignore file to exclude</w:t>
+      </w:r>
+      <w:r>
+        <w:rPr>
+          <w:rFonts w:ascii="Arial" w:hAnsi="Arial" w:cs="Arial"/>
+          <w:bCs/>
+          <w:lang w:val="en-GB"/>
+        </w:rPr>
+        <w:t xml:space="preserve"> </w:t>
+      </w:r>
+      <w:r>
+        <w:rPr>
+          <w:rFonts w:ascii="Arial" w:hAnsi="Arial" w:cs="Arial"/>
+          <w:bCs/>
+          <w:lang w:val="en-GB"/>
+        </w:rPr>
+        <w:t xml:space="preserve">large data files </w:t>
+      </w:r>
+      <w:r>
+        <w:rPr>
+          <w:rFonts w:ascii="Arial" w:hAnsi="Arial" w:cs="Arial"/>
+          <w:bCs/>
+          <w:lang w:val="en-GB"/>
+        </w:rPr>
+        <w:t xml:space="preserve">from version control, since </w:t>
+      </w:r>
+      <w:r>
+        <w:rPr>
+          <w:rFonts w:ascii="Arial" w:hAnsi="Arial" w:cs="Arial"/>
+          <w:bCs/>
+          <w:lang w:val="en-GB"/>
+        </w:rPr>
+        <w:t>GitHub imposes file size</w:t>
+      </w:r>
+      <w:r>
+        <w:rPr>
+          <w:rFonts w:ascii="Arial" w:hAnsi="Arial" w:cs="Arial"/>
+          <w:bCs/>
+          <w:lang w:val="en-GB"/>
+        </w:rPr>
+        <w:t xml:space="preserve"> limits unsuitable for SCADA datasets.</w:t>
+      </w:r>
+      <w:r>
+        <w:rPr>
+          <w:rFonts w:ascii="Arial" w:hAnsi="Arial" w:cs="Arial"/>
+          <w:bCs/>
+          <w:lang w:val="en-GB"/>
+        </w:rPr>
+        <w:t xml:space="preserve"> During the initial set</w:t>
+      </w:r>
+      <w:r>
+        <w:rPr>
+          <w:rFonts w:ascii="Arial" w:hAnsi="Arial" w:cs="Arial"/>
+          <w:bCs/>
+          <w:lang w:val="en-GB"/>
+        </w:rPr>
+        <w:t xml:space="preserve">up, Git-related issues, such as push rejections due to file </w:t>
+      </w:r>
+      <w:r>
+        <w:rPr>
+          <w:rFonts w:ascii="Arial" w:hAnsi="Arial" w:cs="Arial"/>
+          <w:bCs/>
+          <w:lang w:val="en-GB"/>
+        </w:rPr>
+        <w:t xml:space="preserve">size limitations, were resolved to establish a stable version-control setup </w:t>
+      </w:r>
+      <w:r>
+        <w:rPr>
+          <w:rFonts w:ascii="Arial" w:hAnsi="Arial" w:cs="Arial"/>
+          <w:bCs/>
+          <w:lang w:val="en-GB"/>
+        </w:rPr>
+        <w:t>for the remainder of the project.</w:t>
+      </w:r>
+    </w:p>
+    <w:p>
+      <w:pPr>
+        <w:spacing w:line="360" w:lineRule="auto"/>
+        <w:jc w:val="both"/>
+        <w:rPr>
+          <w:rFonts w:ascii="Arial" w:hAnsi="Arial" w:cs="Arial"/>
+          <w:bCs/>
+          <w:lang w:val="en-GB"/>
+        </w:rPr>
+      </w:pPr>
+    </w:p>
+    <w:p>
+      <w:pPr>
+        <w:pStyle w:val="Listenabsatz"/>
+        <w:numPr>
+          <w:ilvl w:val="1"/>
+          <w:numId w:val="31"/>
+        </w:numPr>
+        <w:spacing w:after="240" w:line="360" w:lineRule="auto"/>
+        <w:jc w:val="both"/>
+        <w:outlineLvl w:val="0"/>
+        <w:rPr>
+          <w:rFonts w:ascii="Arial" w:hAnsi="Arial" w:cs="Arial"/>
+          <w:b/>
+          <w:lang w:val="en-GB"/>
+        </w:rPr>
+      </w:pPr>
+      <w:bookmarkStart w:id="4" w:name="_Toc238146700"/>
+      <w:r>
+        <w:rPr>
+          <w:rFonts w:ascii="Arial" w:hAnsi="Arial" w:cs="Arial"/>
+          <w:b/>
+          <w:lang w:val="en-GB"/>
+        </w:rPr>
+        <w:t>Data source</w:t>
+      </w:r>
+      <w:bookmarkEnd w:id="4"/>
+    </w:p>
+    <w:p>
+      <w:pPr>
+        <w:spacing w:line="360" w:lineRule="auto"/>
+        <w:rPr>
+          <w:rFonts w:ascii="Arial" w:hAnsi="Arial" w:cs="Arial"/>
+          <w:bCs/>
+          <w:lang w:val="en-GB"/>
+        </w:rPr>
+      </w:pPr>
+      <w:r>
+        <w:rPr>
+          <w:rFonts w:ascii="Arial" w:hAnsi="Arial" w:cs="Arial"/>
+          <w:bCs/>
+          <w:lang w:val="en-GB"/>
+        </w:rPr>
+        <w:t>Scada data</w:t>
+      </w:r>
+    </w:p>
+    <w:p>
+      <w:pPr>
+        <w:pStyle w:val="Listenabsatz"/>
+        <w:numPr>
+          <w:ilvl w:val="1"/>
+          <w:numId w:val="31"/>
+        </w:numPr>
+        <w:spacing w:after="240" w:line="360" w:lineRule="auto"/>
+        <w:jc w:val="both"/>
+        <w:outlineLvl w:val="0"/>
+        <w:rPr>
+          <w:rFonts w:ascii="Arial" w:hAnsi="Arial" w:cs="Arial"/>
+          <w:b/>
+          <w:lang w:val="en-GB"/>
+        </w:rPr>
+      </w:pPr>
+      <w:bookmarkStart w:id="5" w:name="_Toc238146701"/>
+      <w:r>
+        <w:rPr>
+          <w:rFonts w:ascii="Arial" w:hAnsi="Arial" w:cs="Arial"/>
+          <w:b/>
+          <w:lang w:val="en-GB"/>
+        </w:rPr>
+        <w:t>Combining datasets</w:t>
+      </w:r>
+      <w:bookmarkEnd w:id="5"/>
+    </w:p>
+    <w:p>
+      <w:pPr>
+        <w:spacing w:line="360" w:lineRule="auto"/>
+        <w:rPr>
+          <w:rFonts w:ascii="Arial" w:hAnsi="Arial" w:cs="Arial"/>
+          <w:bCs/>
+          <w:lang w:val="en-GB"/>
+        </w:rPr>
+      </w:pPr>
+      <w:r>
+        <w:rPr>
+          <w:rFonts w:ascii="Arial" w:hAnsi="Arial" w:cs="Arial"/>
+          <w:bCs/>
+          <w:lang w:val="en-GB"/>
+        </w:rPr>
+        <w:t>Wind Farm A consists of multiple individual</w:t>
+      </w:r>
+      <w:r>
+        <w:rPr>
+          <w:rFonts w:ascii="Arial" w:hAnsi="Arial" w:cs="Arial"/>
+          <w:bCs/>
+          <w:lang w:val="en-GB"/>
+        </w:rPr>
+        <w:t xml:space="preserve"> SCADA CSV files, each representing a different event. </w:t>
+      </w:r>
+      <w:r>
+        <w:rPr>
+          <w:rFonts w:ascii="Arial" w:hAnsi="Arial" w:cs="Arial"/>
+          <w:bCs/>
+          <w:lang w:val="en-GB"/>
+        </w:rPr>
+        <w:t>Each of the events fit</w:t>
+      </w:r>
+      <w:r>
+        <w:rPr>
+          <w:rFonts w:ascii="Arial" w:hAnsi="Arial" w:cs="Arial"/>
+          <w:bCs/>
+          <w:lang w:val="en-GB"/>
+        </w:rPr>
+        <w:t>s</w:t>
+      </w:r>
+      <w:r>
+        <w:rPr>
+          <w:rFonts w:ascii="Arial" w:hAnsi="Arial" w:cs="Arial"/>
+          <w:bCs/>
+          <w:lang w:val="en-GB"/>
+        </w:rPr>
+        <w:t xml:space="preserve"> </w:t>
+      </w:r>
+      <w:r>
+        <w:rPr>
+          <w:rFonts w:ascii="Arial" w:hAnsi="Arial" w:cs="Arial"/>
+          <w:bCs/>
+          <w:lang w:val="en-GB"/>
+        </w:rPr>
+        <w:t>to one turbine, which is shown as the asset</w:t>
+      </w:r>
+      <w:r>
+        <w:rPr>
+          <w:rFonts w:ascii="Arial" w:hAnsi="Arial" w:cs="Arial"/>
+          <w:bCs/>
+          <w:lang w:val="en-GB"/>
+        </w:rPr>
+        <w:t xml:space="preserve"> </w:t>
+      </w:r>
+      <w:r>
+        <w:rPr>
+          <w:rFonts w:ascii="Arial" w:hAnsi="Arial" w:cs="Arial"/>
+          <w:bCs/>
+          <w:lang w:val="en-GB"/>
+        </w:rPr>
+        <w:t xml:space="preserve">ID. </w:t>
+      </w:r>
+      <w:r>
+        <w:rPr>
+          <w:rFonts w:ascii="Arial" w:hAnsi="Arial" w:cs="Arial"/>
+          <w:bCs/>
+          <w:lang w:val="en-GB"/>
+        </w:rPr>
+        <w:t xml:space="preserve">For having a better overview of all </w:t>
+      </w:r>
+      <w:r>
+        <w:rPr>
+          <w:rFonts w:ascii="Arial" w:hAnsi="Arial" w:cs="Arial"/>
+          <w:bCs/>
+          <w:lang w:val="en-GB"/>
+        </w:rPr>
+        <w:t xml:space="preserve">events happening with one specific </w:t>
+      </w:r>
+      <w:r>
+        <w:rPr>
+          <w:rFonts w:ascii="Arial" w:hAnsi="Arial" w:cs="Arial"/>
+          <w:bCs/>
+          <w:lang w:val="en-GB"/>
+        </w:rPr>
+        <w:t>turbine</w:t>
+      </w:r>
+      <w:r>
+        <w:rPr>
+          <w:rFonts w:ascii="Arial" w:hAnsi="Arial" w:cs="Arial"/>
+          <w:bCs/>
+          <w:lang w:val="en-GB"/>
+        </w:rPr>
+        <w:t xml:space="preserve">, it was decided to merge </w:t>
+      </w:r>
+      <w:r>
+        <w:rPr>
+          <w:rFonts w:ascii="Arial" w:hAnsi="Arial" w:cs="Arial"/>
+          <w:bCs/>
+          <w:lang w:val="en-GB"/>
+        </w:rPr>
+        <w:t xml:space="preserve">the different datasets </w:t>
+      </w:r>
+      <w:r>
+        <w:rPr>
+          <w:rFonts w:ascii="Arial" w:hAnsi="Arial" w:cs="Arial"/>
+          <w:bCs/>
+          <w:lang w:val="en-GB"/>
+        </w:rPr>
+        <w:t xml:space="preserve">into one dataset per turbine, which contains </w:t>
+      </w:r>
+      <w:r>
+        <w:rPr>
+          <w:rFonts w:ascii="Arial" w:hAnsi="Arial" w:cs="Arial"/>
+          <w:bCs/>
+          <w:lang w:val="en-GB"/>
+        </w:rPr>
+        <w:t xml:space="preserve">the different events in one data. </w:t>
+      </w:r>
+    </w:p>
+    <w:p>
+      <w:pPr>
+        <w:spacing w:line="360" w:lineRule="auto"/>
+        <w:rPr>
+          <w:rFonts w:ascii="Arial" w:hAnsi="Arial" w:cs="Arial"/>
+          <w:bCs/>
+          <w:lang w:val="en-GB"/>
+        </w:rPr>
+      </w:pPr>
+      <w:r>
+        <w:rPr>
+          <w:rFonts w:ascii="Arial" w:hAnsi="Arial" w:cs="Arial"/>
+          <w:bCs/>
+          <w:lang w:val="en-GB"/>
+        </w:rPr>
+        <w:t xml:space="preserve">For each </w:t>
+      </w:r>
+      <w:r>
+        <w:rPr>
+          <w:rFonts w:ascii="Arial" w:hAnsi="Arial" w:cs="Arial"/>
+          <w:bCs/>
+          <w:lang w:val="en-GB"/>
+        </w:rPr>
+        <w:t>turbine, the corresponding event-based CSV files were</w:t>
+      </w:r>
+      <w:r>
+        <w:rPr>
+          <w:rFonts w:ascii="Arial" w:hAnsi="Arial" w:cs="Arial"/>
+          <w:bCs/>
+          <w:lang w:val="en-GB"/>
+        </w:rPr>
+        <w:t xml:space="preserve"> manually</w:t>
+      </w:r>
+      <w:r>
+        <w:rPr>
+          <w:rFonts w:ascii="Arial" w:hAnsi="Arial" w:cs="Arial"/>
+          <w:bCs/>
+          <w:lang w:val="en-GB"/>
+        </w:rPr>
+        <w:t xml:space="preserve"> identified </w:t>
+      </w:r>
+      <w:r>
+        <w:rPr>
+          <w:rFonts w:ascii="Arial" w:hAnsi="Arial" w:cs="Arial"/>
+          <w:bCs/>
+          <w:lang w:val="en-GB"/>
+        </w:rPr>
+        <w:t xml:space="preserve">by </w:t>
+      </w:r>
+      <w:r>
+        <w:rPr>
+          <w:rFonts w:ascii="Arial" w:hAnsi="Arial" w:cs="Arial"/>
+          <w:bCs/>
+          <w:lang w:val="en-GB"/>
+        </w:rPr>
+        <w:t>inspecting the asset IDs in</w:t>
+      </w:r>
+      <w:r>
+        <w:rPr>
+          <w:rFonts w:ascii="Arial" w:hAnsi="Arial" w:cs="Arial"/>
+          <w:bCs/>
+          <w:lang w:val="en-GB"/>
+        </w:rPr>
+        <w:t xml:space="preserve"> each </w:t>
+      </w:r>
+      <w:r>
+        <w:rPr>
+          <w:rFonts w:ascii="Arial" w:hAnsi="Arial" w:cs="Arial"/>
+          <w:bCs/>
+          <w:lang w:val="en-GB"/>
+        </w:rPr>
+        <w:t>event</w:t>
+      </w:r>
+      <w:r>
+        <w:rPr>
+          <w:rFonts w:ascii="Arial" w:hAnsi="Arial" w:cs="Arial"/>
+          <w:bCs/>
+          <w:lang w:val="en-GB"/>
+        </w:rPr>
+        <w:t>’</w:t>
+      </w:r>
+      <w:r>
+        <w:rPr>
+          <w:rFonts w:ascii="Arial" w:hAnsi="Arial" w:cs="Arial"/>
+          <w:bCs/>
+          <w:lang w:val="en-GB"/>
+        </w:rPr>
+        <w:t xml:space="preserve">s dataset. </w:t>
+      </w:r>
+      <w:r>
+        <w:rPr>
+          <w:rFonts w:ascii="Arial" w:hAnsi="Arial" w:cs="Arial"/>
+          <w:bCs/>
+          <w:lang w:val="en-GB"/>
+        </w:rPr>
+        <w:t xml:space="preserve">The event files </w:t>
+      </w:r>
+      <w:r>
+        <w:rPr>
+          <w:rFonts w:ascii="Arial" w:hAnsi="Arial" w:cs="Arial"/>
+          <w:bCs/>
+          <w:lang w:val="en-GB"/>
+        </w:rPr>
+        <w:t xml:space="preserve">were read using pandas, with semicolon used </w:t>
+      </w:r>
+      <w:r>
+        <w:rPr>
+          <w:rFonts w:ascii="Arial" w:hAnsi="Arial" w:cs="Arial"/>
+          <w:bCs/>
+          <w:lang w:val="en-GB"/>
+        </w:rPr>
+        <w:t xml:space="preserve">consistently as the delimiter. </w:t>
+      </w:r>
+      <w:r>
+        <w:rPr>
+          <w:rFonts w:ascii="Arial" w:hAnsi="Arial" w:cs="Arial"/>
+          <w:bCs/>
+          <w:lang w:val="en-GB"/>
+        </w:rPr>
+        <w:t xml:space="preserve">Each file was labelled with </w:t>
+      </w:r>
+      <w:r>
+        <w:rPr>
+          <w:rFonts w:ascii="Arial" w:hAnsi="Arial" w:cs="Arial"/>
+          <w:bCs/>
+          <w:lang w:val="en-GB"/>
+        </w:rPr>
+        <w:lastRenderedPageBreak/>
+        <w:t xml:space="preserve">its </w:t>
+      </w:r>
+      <w:r>
+        <w:rPr>
+          <w:rFonts w:ascii="Arial" w:hAnsi="Arial" w:cs="Arial"/>
+          <w:bCs/>
+          <w:lang w:val="en-GB"/>
+        </w:rPr>
+        <w:t>respective event</w:t>
+      </w:r>
+      <w:r>
+        <w:rPr>
+          <w:rFonts w:ascii="Arial" w:hAnsi="Arial" w:cs="Arial"/>
+          <w:bCs/>
+          <w:lang w:val="en-GB"/>
+        </w:rPr>
+        <w:t xml:space="preserve"> </w:t>
+      </w:r>
+      <w:r>
+        <w:rPr>
+          <w:rFonts w:ascii="Arial" w:hAnsi="Arial" w:cs="Arial"/>
+          <w:bCs/>
+          <w:lang w:val="en-GB"/>
+        </w:rPr>
+        <w:t xml:space="preserve">ID before </w:t>
+      </w:r>
+      <w:r>
+        <w:rPr>
+          <w:rFonts w:ascii="Arial" w:hAnsi="Arial" w:cs="Arial"/>
+          <w:bCs/>
+          <w:lang w:val="en-GB"/>
+        </w:rPr>
+        <w:t>merging, to preserve traceabilit</w:t>
+      </w:r>
+      <w:r>
+        <w:rPr>
+          <w:rFonts w:ascii="Arial" w:hAnsi="Arial" w:cs="Arial"/>
+          <w:bCs/>
+          <w:lang w:val="en-GB"/>
+        </w:rPr>
+        <w:t>y of which rows originated from which</w:t>
+      </w:r>
+      <w:r>
+        <w:rPr>
+          <w:rFonts w:ascii="Arial" w:hAnsi="Arial" w:cs="Arial"/>
+          <w:bCs/>
+          <w:lang w:val="en-GB"/>
+        </w:rPr>
+        <w:t xml:space="preserve"> original file. </w:t>
+      </w:r>
+      <w:r>
+        <w:rPr>
+          <w:rFonts w:ascii="Arial" w:hAnsi="Arial" w:cs="Arial"/>
+          <w:bCs/>
+          <w:lang w:val="en-GB"/>
+        </w:rPr>
+        <w:t xml:space="preserve">The labelled files were then </w:t>
+      </w:r>
+      <w:r>
+        <w:rPr>
+          <w:rFonts w:ascii="Arial" w:hAnsi="Arial" w:cs="Arial"/>
+          <w:bCs/>
+          <w:lang w:val="en-GB"/>
+        </w:rPr>
+        <w:t xml:space="preserve">combined </w:t>
+      </w:r>
+      <w:r>
+        <w:rPr>
+          <w:rFonts w:ascii="Arial" w:hAnsi="Arial" w:cs="Arial"/>
+          <w:bCs/>
+          <w:lang w:val="en-GB"/>
+        </w:rPr>
+        <w:t>into a single dataset per turbine using “pd.</w:t>
+      </w:r>
+      <w:r>
+        <w:rPr>
+          <w:rFonts w:ascii="Arial" w:hAnsi="Arial" w:cs="Arial"/>
+          <w:bCs/>
+          <w:lang w:val="en-GB"/>
+        </w:rPr>
+        <w:t>concat()”.</w:t>
+      </w:r>
+    </w:p>
+    <w:p>
+      <w:pPr>
+        <w:spacing w:line="360" w:lineRule="auto"/>
+        <w:rPr>
+          <w:rFonts w:ascii="Arial" w:hAnsi="Arial" w:cs="Arial"/>
+          <w:bCs/>
+          <w:lang w:val="en-GB"/>
+        </w:rPr>
+      </w:pPr>
+      <w:r>
+        <w:rPr>
+          <w:rFonts w:ascii="Arial" w:hAnsi="Arial" w:cs="Arial"/>
+          <w:bCs/>
+          <w:lang w:val="en-GB"/>
+        </w:rPr>
+        <w:t xml:space="preserve">The combined </w:t>
+      </w:r>
+      <w:r>
+        <w:rPr>
+          <w:rFonts w:ascii="Arial" w:hAnsi="Arial" w:cs="Arial"/>
+          <w:bCs/>
+          <w:lang w:val="en-GB"/>
+        </w:rPr>
+        <w:t>per-turbine dataset was saved as a new CSV file for further processing</w:t>
+      </w:r>
+      <w:r>
+        <w:rPr>
+          <w:rFonts w:ascii="Arial" w:hAnsi="Arial" w:cs="Arial"/>
+          <w:bCs/>
+          <w:lang w:val="en-GB"/>
+        </w:rPr>
+        <w:t>. To v</w:t>
+      </w:r>
+      <w:r>
+        <w:rPr>
+          <w:rFonts w:ascii="Arial" w:hAnsi="Arial" w:cs="Arial"/>
+          <w:bCs/>
+          <w:lang w:val="en-GB"/>
+        </w:rPr>
+        <w:t>erify that the combination was carried out correctly</w:t>
+      </w:r>
+      <w:r>
+        <w:rPr>
+          <w:rFonts w:ascii="Arial" w:hAnsi="Arial" w:cs="Arial"/>
+          <w:bCs/>
+          <w:lang w:val="en-GB"/>
+        </w:rPr>
+        <w:t xml:space="preserve">, basic checks were performed, including </w:t>
+      </w:r>
+      <w:r>
+        <w:rPr>
+          <w:rFonts w:ascii="Arial" w:hAnsi="Arial" w:cs="Arial"/>
+          <w:bCs/>
+          <w:lang w:val="en-GB"/>
+        </w:rPr>
+        <w:t>the shape of the resulting dataset as well as its first and last rows</w:t>
+      </w:r>
+      <w:r>
+        <w:rPr>
+          <w:rFonts w:ascii="Arial" w:hAnsi="Arial" w:cs="Arial"/>
+          <w:bCs/>
+          <w:lang w:val="en-GB"/>
+        </w:rPr>
+        <w:t>.</w:t>
+      </w:r>
+    </w:p>
+    <w:p>
+      <w:pPr>
+        <w:spacing w:line="360" w:lineRule="auto"/>
+        <w:rPr>
+          <w:rFonts w:ascii="Arial" w:hAnsi="Arial" w:cs="Arial"/>
+          <w:bCs/>
+          <w:lang w:val="en-GB"/>
+        </w:rPr>
+      </w:pPr>
+    </w:p>
+    <w:p>
+      <w:pPr>
+        <w:pStyle w:val="Listenabsatz"/>
+        <w:numPr>
+          <w:ilvl w:val="1"/>
+          <w:numId w:val="31"/>
+        </w:numPr>
+        <w:spacing w:after="240" w:line="360" w:lineRule="auto"/>
+        <w:jc w:val="both"/>
+        <w:outlineLvl w:val="0"/>
+        <w:rPr>
+          <w:rFonts w:ascii="Arial" w:hAnsi="Arial" w:cs="Arial"/>
+          <w:b/>
+          <w:lang w:val="en-GB"/>
+        </w:rPr>
+      </w:pPr>
+      <w:bookmarkStart w:id="6" w:name="_Toc238146702"/>
+      <w:r>
+        <w:rPr>
+          <w:rFonts w:ascii="Arial" w:hAnsi="Arial" w:cs="Arial"/>
+          <w:b/>
+          <w:lang w:val="en-GB"/>
+        </w:rPr>
+        <w:t>Cleaning the data</w:t>
+      </w:r>
+      <w:bookmarkEnd w:id="6"/>
+    </w:p>
+    <w:p>
+      <w:pPr>
+        <w:spacing w:line="360" w:lineRule="auto"/>
+        <w:jc w:val="both"/>
+        <w:rPr>
+          <w:rFonts w:ascii="Arial" w:hAnsi="Arial" w:cs="Arial"/>
+          <w:bCs/>
+          <w:lang w:val="en-GB"/>
+        </w:rPr>
+      </w:pPr>
+      <w:r>
+        <w:rPr>
+          <w:rFonts w:ascii="Arial" w:hAnsi="Arial" w:cs="Arial"/>
+          <w:bCs/>
+          <w:lang w:val="en-GB"/>
+        </w:rPr>
+        <w:t xml:space="preserve">For preparing the </w:t>
+      </w:r>
+      <w:r>
+        <w:rPr>
+          <w:rFonts w:ascii="Arial" w:hAnsi="Arial" w:cs="Arial"/>
+          <w:bCs/>
+          <w:lang w:val="en-GB"/>
+        </w:rPr>
+        <w:t>data to make further analyses</w:t>
+      </w:r>
+      <w:r>
+        <w:rPr>
+          <w:rFonts w:ascii="Arial" w:hAnsi="Arial" w:cs="Arial"/>
+          <w:bCs/>
+          <w:lang w:val="en-GB"/>
+        </w:rPr>
+        <w:t xml:space="preserve">, it is important to clean the data. </w:t>
+      </w:r>
+      <w:r>
+        <w:rPr>
+          <w:rFonts w:ascii="Arial" w:hAnsi="Arial" w:cs="Arial"/>
+          <w:bCs/>
+          <w:lang w:val="en-GB"/>
+        </w:rPr>
+        <w:t>In this project, the data cleaning wor</w:t>
+      </w:r>
+      <w:r>
+        <w:rPr>
+          <w:rFonts w:ascii="Arial" w:hAnsi="Arial" w:cs="Arial"/>
+          <w:bCs/>
+          <w:lang w:val="en-GB"/>
+        </w:rPr>
+        <w:t>k</w:t>
+      </w:r>
+      <w:r>
+        <w:rPr>
+          <w:rFonts w:ascii="Arial" w:hAnsi="Arial" w:cs="Arial"/>
+          <w:bCs/>
+          <w:lang w:val="en-GB"/>
+        </w:rPr>
+        <w:t>ed</w:t>
+      </w:r>
+      <w:r>
+        <w:rPr>
+          <w:rFonts w:ascii="Arial" w:hAnsi="Arial" w:cs="Arial"/>
+          <w:bCs/>
+          <w:lang w:val="en-GB"/>
+        </w:rPr>
+        <w:t xml:space="preserve"> in different steps.</w:t>
+      </w:r>
+      <w:r>
+        <w:rPr>
+          <w:rFonts w:ascii="Arial" w:hAnsi="Arial" w:cs="Arial"/>
+          <w:bCs/>
+          <w:lang w:val="en-GB"/>
+        </w:rPr>
+        <w:t xml:space="preserve"> </w:t>
+      </w:r>
+    </w:p>
+    <w:p>
+      <w:pPr>
+        <w:spacing w:line="360" w:lineRule="auto"/>
+        <w:jc w:val="both"/>
+        <w:rPr>
+          <w:rFonts w:ascii="Arial" w:hAnsi="Arial" w:cs="Arial"/>
+          <w:bCs/>
+          <w:lang w:val="en-GB"/>
+        </w:rPr>
+      </w:pPr>
+      <w:r>
+        <w:rPr>
+          <w:rFonts w:ascii="Arial" w:hAnsi="Arial" w:cs="Arial"/>
+          <w:bCs/>
+          <w:lang w:val="en-GB"/>
+        </w:rPr>
+        <w:t xml:space="preserve">One of those is to standardize </w:t>
+      </w:r>
+      <w:r>
+        <w:rPr>
+          <w:rFonts w:ascii="Arial" w:hAnsi="Arial" w:cs="Arial"/>
+          <w:bCs/>
+          <w:lang w:val="en-GB"/>
+        </w:rPr>
+        <w:t xml:space="preserve">the column names. The column names </w:t>
+      </w:r>
+      <w:r>
+        <w:rPr>
+          <w:rFonts w:ascii="Arial" w:hAnsi="Arial" w:cs="Arial"/>
+          <w:bCs/>
+          <w:lang w:val="en-GB"/>
+        </w:rPr>
+        <w:t>were</w:t>
+      </w:r>
+      <w:r>
+        <w:rPr>
+          <w:rFonts w:ascii="Arial" w:hAnsi="Arial" w:cs="Arial"/>
+          <w:bCs/>
+          <w:lang w:val="en-GB"/>
+        </w:rPr>
+        <w:t xml:space="preserve"> </w:t>
+      </w:r>
+      <w:r>
+        <w:rPr>
+          <w:rFonts w:ascii="Arial" w:hAnsi="Arial" w:cs="Arial"/>
+          <w:bCs/>
+          <w:lang w:val="en-GB"/>
+        </w:rPr>
+        <w:t>converted to lowercase</w:t>
+      </w:r>
+      <w:r>
+        <w:rPr>
+          <w:rFonts w:ascii="Arial" w:hAnsi="Arial" w:cs="Arial"/>
+          <w:bCs/>
+          <w:lang w:val="en-GB"/>
+        </w:rPr>
+        <w:t xml:space="preserve">, special characters </w:t>
+      </w:r>
+      <w:r>
+        <w:rPr>
+          <w:rFonts w:ascii="Arial" w:hAnsi="Arial" w:cs="Arial"/>
+          <w:bCs/>
+          <w:lang w:val="en-GB"/>
+        </w:rPr>
+        <w:t>were</w:t>
+      </w:r>
+      <w:r>
+        <w:rPr>
+          <w:rFonts w:ascii="Arial" w:hAnsi="Arial" w:cs="Arial"/>
+          <w:bCs/>
+          <w:lang w:val="en-GB"/>
+        </w:rPr>
+        <w:t xml:space="preserve"> </w:t>
+      </w:r>
+      <w:r>
+        <w:rPr>
+          <w:rFonts w:ascii="Arial" w:hAnsi="Arial" w:cs="Arial"/>
+          <w:bCs/>
+          <w:lang w:val="en-GB"/>
+        </w:rPr>
+        <w:t>removed,</w:t>
+      </w:r>
+      <w:r>
+        <w:rPr>
+          <w:rFonts w:ascii="Arial" w:hAnsi="Arial" w:cs="Arial"/>
+          <w:bCs/>
+          <w:lang w:val="en-GB"/>
+        </w:rPr>
+        <w:t xml:space="preserve"> and spaces </w:t>
+      </w:r>
+      <w:r>
+        <w:rPr>
+          <w:rFonts w:ascii="Arial" w:hAnsi="Arial" w:cs="Arial"/>
+          <w:bCs/>
+          <w:lang w:val="en-GB"/>
+        </w:rPr>
+        <w:t>were</w:t>
+      </w:r>
+      <w:r>
+        <w:rPr>
+          <w:rFonts w:ascii="Arial" w:hAnsi="Arial" w:cs="Arial"/>
+          <w:bCs/>
+          <w:lang w:val="en-GB"/>
+        </w:rPr>
+        <w:t xml:space="preserve"> replaced with underscores</w:t>
+      </w:r>
+      <w:r>
+        <w:rPr>
+          <w:rFonts w:ascii="Arial" w:hAnsi="Arial" w:cs="Arial"/>
+          <w:bCs/>
+          <w:lang w:val="en-GB"/>
+        </w:rPr>
+        <w:t xml:space="preserve"> to ensure consistent naming across all files.</w:t>
+      </w:r>
+    </w:p>
+    <w:p>
+      <w:pPr>
+        <w:spacing w:line="360" w:lineRule="auto"/>
+        <w:jc w:val="both"/>
+        <w:rPr>
+          <w:rFonts w:ascii="Arial" w:hAnsi="Arial" w:cs="Arial"/>
+          <w:bCs/>
+          <w:lang w:val="en-GB"/>
+        </w:rPr>
+      </w:pPr>
+      <w:r>
+        <w:rPr>
+          <w:rFonts w:ascii="Arial" w:hAnsi="Arial" w:cs="Arial"/>
+          <w:bCs/>
+          <w:lang w:val="en-GB"/>
+        </w:rPr>
+        <w:t xml:space="preserve">As well, </w:t>
+      </w:r>
+      <w:r>
+        <w:rPr>
+          <w:rFonts w:ascii="Arial" w:hAnsi="Arial" w:cs="Arial"/>
+          <w:bCs/>
+          <w:lang w:val="en-GB"/>
+        </w:rPr>
+        <w:t xml:space="preserve">rows that </w:t>
+      </w:r>
+      <w:r>
+        <w:rPr>
+          <w:rFonts w:ascii="Arial" w:hAnsi="Arial" w:cs="Arial"/>
+          <w:bCs/>
+          <w:lang w:val="en-GB"/>
+        </w:rPr>
+        <w:t>were comple</w:t>
+      </w:r>
+      <w:r>
+        <w:rPr>
+          <w:rFonts w:ascii="Arial" w:hAnsi="Arial" w:cs="Arial"/>
+          <w:bCs/>
+          <w:lang w:val="en-GB"/>
+        </w:rPr>
+        <w:t xml:space="preserve">tely empty were removed from each dataset. </w:t>
+      </w:r>
+    </w:p>
+    <w:p>
+      <w:pPr>
+        <w:spacing w:line="360" w:lineRule="auto"/>
+        <w:jc w:val="both"/>
+        <w:rPr>
+          <w:rFonts w:ascii="Arial" w:hAnsi="Arial" w:cs="Arial"/>
+          <w:bCs/>
+          <w:lang w:val="en-GB"/>
+        </w:rPr>
+      </w:pPr>
+      <w:r>
+        <w:rPr>
+          <w:rFonts w:ascii="Arial" w:hAnsi="Arial" w:cs="Arial"/>
+          <w:bCs/>
+          <w:lang w:val="en-GB"/>
+        </w:rPr>
+        <w:t>Based on th</w:t>
+      </w:r>
+      <w:r>
+        <w:rPr>
+          <w:rFonts w:ascii="Arial" w:hAnsi="Arial" w:cs="Arial"/>
+          <w:bCs/>
+          <w:lang w:val="en-GB"/>
+        </w:rPr>
+        <w:t>e known data quality issues documented for Wind Farm A, each sensor</w:t>
+      </w:r>
+      <w:r>
+        <w:rPr>
+          <w:rFonts w:ascii="Arial" w:hAnsi="Arial" w:cs="Arial"/>
+          <w:bCs/>
+          <w:lang w:val="en-GB"/>
+        </w:rPr>
+        <w:t xml:space="preserve">’s Min and Max values were checked against its corresponding Avg value for every timestamp. </w:t>
+      </w:r>
+      <w:r>
+        <w:rPr>
+          <w:rFonts w:ascii="Arial" w:hAnsi="Arial" w:cs="Arial"/>
+          <w:bCs/>
+          <w:lang w:val="en-GB"/>
+        </w:rPr>
+        <w:t xml:space="preserve">A Min value exceeding the Avg value, or a Max value </w:t>
+      </w:r>
+      <w:r>
+        <w:rPr>
+          <w:rFonts w:ascii="Arial" w:hAnsi="Arial" w:cs="Arial"/>
+          <w:bCs/>
+          <w:lang w:val="en-GB"/>
+        </w:rPr>
+        <w:t xml:space="preserve">falling below the Avg value, was flagged as </w:t>
+      </w:r>
+      <w:r>
+        <w:rPr>
+          <w:rFonts w:ascii="Arial" w:hAnsi="Arial" w:cs="Arial"/>
+          <w:bCs/>
+          <w:lang w:val="en-GB"/>
+        </w:rPr>
+        <w:t xml:space="preserve">implausible, since both cases are physically impossible. </w:t>
+      </w:r>
+      <w:r>
+        <w:rPr>
+          <w:rFonts w:ascii="Arial" w:hAnsi="Arial" w:cs="Arial"/>
+          <w:bCs/>
+          <w:lang w:val="en-GB"/>
+        </w:rPr>
+        <w:t xml:space="preserve">Identified implausible Min or Max values were individually </w:t>
+      </w:r>
+      <w:r>
+        <w:rPr>
+          <w:rFonts w:ascii="Arial" w:hAnsi="Arial" w:cs="Arial"/>
+          <w:bCs/>
+          <w:lang w:val="en-GB"/>
+        </w:rPr>
+        <w:t xml:space="preserve">replaced with </w:t>
+      </w:r>
+      <w:r>
+        <w:rPr>
+          <w:rFonts w:ascii="Arial" w:hAnsi="Arial" w:cs="Arial"/>
+          <w:bCs/>
+          <w:lang w:val="en-GB"/>
+        </w:rPr>
+        <w:t>missing values (NaN), while the Avg value was left unchanged</w:t>
+      </w:r>
+      <w:r>
+        <w:rPr>
+          <w:rFonts w:ascii="Arial" w:hAnsi="Arial" w:cs="Arial"/>
+          <w:bCs/>
+          <w:lang w:val="en-GB"/>
+        </w:rPr>
+        <w:t xml:space="preserve">, since Avg </w:t>
+      </w:r>
+      <w:r>
+        <w:rPr>
+          <w:rFonts w:ascii="Arial" w:hAnsi="Arial" w:cs="Arial"/>
+          <w:bCs/>
+          <w:lang w:val="en-GB"/>
+        </w:rPr>
+        <w:t>values are generally considered reliable according to the dataset documentation.</w:t>
+      </w:r>
+    </w:p>
+    <w:p>
+      <w:pPr>
+        <w:spacing w:line="360" w:lineRule="auto"/>
+        <w:rPr>
+          <w:rFonts w:ascii="Arial" w:hAnsi="Arial" w:cs="Arial"/>
+          <w:bCs/>
+          <w:lang w:val="en-GB"/>
+        </w:rPr>
+      </w:pPr>
+      <w:r>
+        <w:rPr>
+          <w:rFonts w:ascii="Arial" w:hAnsi="Arial" w:cs="Arial"/>
+          <w:bCs/>
+          <w:lang w:val="en-GB"/>
+        </w:rPr>
+        <w:t>More than</w:t>
+      </w:r>
+      <w:r>
+        <w:rPr>
+          <w:rFonts w:ascii="Arial" w:hAnsi="Arial" w:cs="Arial"/>
+          <w:bCs/>
+          <w:lang w:val="en-GB"/>
+        </w:rPr>
+        <w:t xml:space="preserve"> 50%</w:t>
+      </w:r>
+      <w:r>
+        <w:rPr>
+          <w:rFonts w:ascii="Arial" w:hAnsi="Arial" w:cs="Arial"/>
+          <w:bCs/>
+          <w:lang w:val="en-GB"/>
+        </w:rPr>
+        <w:t xml:space="preserve"> implausible values</w:t>
+      </w:r>
+      <w:r>
+        <w:rPr>
+          <w:rFonts w:ascii="Arial" w:hAnsi="Arial" w:cs="Arial"/>
+          <w:bCs/>
+          <w:lang w:val="en-GB"/>
+        </w:rPr>
+        <w:t xml:space="preserve"> were identified</w:t>
+      </w:r>
+      <w:r>
+        <w:rPr>
+          <w:rFonts w:ascii="Arial" w:hAnsi="Arial" w:cs="Arial"/>
+          <w:bCs/>
+          <w:lang w:val="en-GB"/>
+        </w:rPr>
+        <w:t xml:space="preserve"> </w:t>
+      </w:r>
+      <w:r>
+        <w:rPr>
+          <w:rFonts w:ascii="Arial" w:hAnsi="Arial" w:cs="Arial"/>
+          <w:bCs/>
+          <w:lang w:val="en-GB"/>
+        </w:rPr>
+        <w:t>at sensor 31</w:t>
+      </w:r>
+      <w:r>
+        <w:rPr>
+          <w:rFonts w:ascii="Arial" w:hAnsi="Arial" w:cs="Arial"/>
+          <w:bCs/>
+          <w:lang w:val="en-GB"/>
+        </w:rPr>
+        <w:t>,</w:t>
+      </w:r>
+      <w:r>
+        <w:rPr>
+          <w:rFonts w:ascii="Arial" w:hAnsi="Arial" w:cs="Arial"/>
+          <w:bCs/>
+          <w:lang w:val="en-GB"/>
+        </w:rPr>
+        <w:t xml:space="preserve"> which </w:t>
+      </w:r>
+      <w:r>
+        <w:rPr>
+          <w:rFonts w:ascii="Arial" w:hAnsi="Arial" w:cs="Arial"/>
+          <w:bCs/>
+          <w:lang w:val="en-GB"/>
+        </w:rPr>
+        <w:t>made</w:t>
+      </w:r>
+      <w:r>
+        <w:rPr>
+          <w:rFonts w:ascii="Arial" w:hAnsi="Arial" w:cs="Arial"/>
+          <w:bCs/>
+          <w:lang w:val="en-GB"/>
+        </w:rPr>
+        <w:t xml:space="preserve"> th</w:t>
+      </w:r>
+      <w:r>
+        <w:rPr>
+          <w:rFonts w:ascii="Arial" w:hAnsi="Arial" w:cs="Arial"/>
+          <w:bCs/>
+          <w:lang w:val="en-GB"/>
+        </w:rPr>
+        <w:t>e sensor unsuitable for reliable</w:t>
+      </w:r>
+      <w:r>
+        <w:rPr>
+          <w:rFonts w:ascii="Arial" w:hAnsi="Arial" w:cs="Arial"/>
+          <w:bCs/>
+          <w:lang w:val="en-GB"/>
+        </w:rPr>
+        <w:t xml:space="preserve"> analysis even after cleaning. </w:t>
+      </w:r>
+      <w:r>
+        <w:rPr>
+          <w:rFonts w:ascii="Arial" w:hAnsi="Arial" w:cs="Arial"/>
+          <w:bCs/>
+          <w:lang w:val="en-GB"/>
+        </w:rPr>
+        <w:t xml:space="preserve">For that </w:t>
+      </w:r>
+      <w:r>
+        <w:rPr>
+          <w:rFonts w:ascii="Arial" w:hAnsi="Arial" w:cs="Arial"/>
+          <w:bCs/>
+          <w:lang w:val="en-GB"/>
+        </w:rPr>
+        <w:t>reason,</w:t>
+      </w:r>
+      <w:r>
+        <w:rPr>
+          <w:rFonts w:ascii="Arial" w:hAnsi="Arial" w:cs="Arial"/>
+          <w:bCs/>
+          <w:lang w:val="en-GB"/>
+        </w:rPr>
+        <w:t xml:space="preserve"> the entire</w:t>
+      </w:r>
+      <w:r>
+        <w:rPr>
+          <w:rFonts w:ascii="Arial" w:hAnsi="Arial" w:cs="Arial"/>
+          <w:bCs/>
+          <w:lang w:val="en-GB"/>
+        </w:rPr>
+        <w:t xml:space="preserve"> Avg,</w:t>
+      </w:r>
+      <w:r>
+        <w:rPr>
+          <w:rFonts w:ascii="Arial" w:hAnsi="Arial" w:cs="Arial"/>
+          <w:bCs/>
+          <w:lang w:val="en-GB"/>
+        </w:rPr>
+        <w:t xml:space="preserve"> Min, and Max columns of this sensor </w:t>
+      </w:r>
+      <w:r>
+        <w:rPr>
+          <w:rFonts w:ascii="Arial" w:hAnsi="Arial" w:cs="Arial"/>
+          <w:bCs/>
+          <w:lang w:val="en-GB"/>
+        </w:rPr>
+        <w:t>were removed</w:t>
+      </w:r>
+      <w:r>
+        <w:rPr>
+          <w:rFonts w:ascii="Arial" w:hAnsi="Arial" w:cs="Arial"/>
+          <w:bCs/>
+          <w:lang w:val="en-GB"/>
+        </w:rPr>
+        <w:t>.</w:t>
+      </w:r>
+    </w:p>
+    <w:p>
+      <w:pPr>
+        <w:spacing w:line="360" w:lineRule="auto"/>
+        <w:rPr>
+          <w:rFonts w:ascii="Arial" w:hAnsi="Arial" w:cs="Arial"/>
+          <w:bCs/>
+          <w:lang w:val="en-GB"/>
+        </w:rPr>
+      </w:pPr>
+      <w:r>
+        <w:rPr>
+          <w:rFonts w:ascii="Arial" w:hAnsi="Arial" w:cs="Arial"/>
+          <w:bCs/>
+          <w:lang w:val="en-GB"/>
+        </w:rPr>
+        <w:t xml:space="preserve">The cleaning script </w:t>
+      </w:r>
+      <w:r>
+        <w:rPr>
+          <w:rFonts w:ascii="Arial" w:hAnsi="Arial" w:cs="Arial"/>
+          <w:bCs/>
+          <w:lang w:val="en-GB"/>
+        </w:rPr>
+        <w:t xml:space="preserve">was also designed to allow the removal of additional columns, in case </w:t>
+      </w:r>
+      <w:r>
+        <w:rPr>
+          <w:rFonts w:ascii="Arial" w:hAnsi="Arial" w:cs="Arial"/>
+          <w:bCs/>
+          <w:lang w:val="en-GB"/>
+        </w:rPr>
+        <w:t>further sensors to be unsuitable for analysis.</w:t>
+      </w:r>
+    </w:p>
+    <w:p>
+      <w:pPr>
+        <w:spacing w:line="360" w:lineRule="auto"/>
+        <w:rPr>
+          <w:rFonts w:ascii="Arial" w:hAnsi="Arial" w:cs="Arial"/>
+          <w:bCs/>
+          <w:lang w:val="en-GB"/>
+        </w:rPr>
+      </w:pPr>
+      <w:r>
+        <w:rPr>
+          <w:rFonts w:ascii="Arial" w:hAnsi="Arial" w:cs="Arial"/>
+          <w:bCs/>
+          <w:lang w:val="en-GB"/>
+        </w:rPr>
+        <w:t>To ensure</w:t>
+      </w:r>
+      <w:r>
+        <w:rPr>
+          <w:rFonts w:ascii="Arial" w:hAnsi="Arial" w:cs="Arial"/>
+          <w:bCs/>
+          <w:lang w:val="en-GB"/>
+        </w:rPr>
+        <w:t xml:space="preserve"> good documentation and transparency</w:t>
+      </w:r>
+      <w:r>
+        <w:rPr>
+          <w:rFonts w:ascii="Arial" w:hAnsi="Arial" w:cs="Arial"/>
+          <w:bCs/>
+          <w:lang w:val="en-GB"/>
+        </w:rPr>
+        <w:t xml:space="preserve">, there was a summary report generated </w:t>
+      </w:r>
+      <w:r>
+        <w:rPr>
+          <w:rFonts w:ascii="Arial" w:hAnsi="Arial" w:cs="Arial"/>
+          <w:bCs/>
+          <w:lang w:val="en-GB"/>
+        </w:rPr>
+        <w:t xml:space="preserve">for each processed file. This report includes </w:t>
+      </w:r>
+      <w:r>
+        <w:rPr>
+          <w:rFonts w:ascii="Arial" w:hAnsi="Arial" w:cs="Arial"/>
+          <w:bCs/>
+          <w:lang w:val="en-GB"/>
+        </w:rPr>
+        <w:t xml:space="preserve">the number of columns, </w:t>
+      </w:r>
+      <w:r>
+        <w:rPr>
+          <w:rFonts w:ascii="Arial" w:hAnsi="Arial" w:cs="Arial"/>
+          <w:bCs/>
+          <w:lang w:val="en-GB"/>
+        </w:rPr>
+        <w:t xml:space="preserve">time range, </w:t>
+      </w:r>
+      <w:r>
+        <w:rPr>
+          <w:rFonts w:ascii="Arial" w:hAnsi="Arial" w:cs="Arial"/>
+          <w:bCs/>
+          <w:lang w:val="en-GB"/>
+        </w:rPr>
+        <w:t>the distribution of status</w:t>
+      </w:r>
+      <w:r>
+        <w:rPr>
+          <w:rFonts w:ascii="Arial" w:hAnsi="Arial" w:cs="Arial"/>
+          <w:bCs/>
+          <w:lang w:val="en-GB"/>
+        </w:rPr>
+        <w:t xml:space="preserve"> </w:t>
+      </w:r>
+      <w:r>
+        <w:rPr>
+          <w:rFonts w:ascii="Arial" w:hAnsi="Arial" w:cs="Arial"/>
+          <w:bCs/>
+          <w:lang w:val="en-GB"/>
+        </w:rPr>
+        <w:t>type</w:t>
+      </w:r>
+      <w:r>
+        <w:rPr>
+          <w:rFonts w:ascii="Arial" w:hAnsi="Arial" w:cs="Arial"/>
+          <w:bCs/>
+          <w:lang w:val="en-GB"/>
+        </w:rPr>
+        <w:t xml:space="preserve"> </w:t>
+      </w:r>
+      <w:r>
+        <w:rPr>
+          <w:rFonts w:ascii="Arial" w:hAnsi="Arial" w:cs="Arial"/>
+          <w:bCs/>
+          <w:lang w:val="en-GB"/>
+        </w:rPr>
+        <w:t>id, constant columns, de</w:t>
+      </w:r>
+      <w:r>
+        <w:rPr>
+          <w:rFonts w:ascii="Arial" w:hAnsi="Arial" w:cs="Arial"/>
+          <w:bCs/>
+          <w:lang w:val="en-GB"/>
+        </w:rPr>
+        <w:t xml:space="preserve">scriptive statistics, and </w:t>
+      </w:r>
+      <w:r>
+        <w:rPr>
+          <w:rFonts w:ascii="Arial" w:hAnsi="Arial" w:cs="Arial"/>
+          <w:bCs/>
+          <w:lang w:val="en-GB"/>
+        </w:rPr>
+        <w:t xml:space="preserve">the percentage of missing values per column. </w:t>
+      </w:r>
+      <w:r>
+        <w:rPr>
+          <w:rFonts w:ascii="Arial" w:hAnsi="Arial" w:cs="Arial"/>
+          <w:bCs/>
+          <w:lang w:val="en-GB"/>
+        </w:rPr>
+        <w:t xml:space="preserve">In addition, the </w:t>
+      </w:r>
+      <w:r>
+        <w:rPr>
+          <w:rFonts w:ascii="Arial" w:hAnsi="Arial" w:cs="Arial"/>
+          <w:bCs/>
+          <w:lang w:val="en-GB"/>
+        </w:rPr>
+        <w:t>eve</w:t>
+      </w:r>
+      <w:r>
+        <w:rPr>
+          <w:rFonts w:ascii="Arial" w:hAnsi="Arial" w:cs="Arial"/>
+          <w:bCs/>
+          <w:lang w:val="en-GB"/>
+        </w:rPr>
+        <w:t>nt information file</w:t>
+      </w:r>
+      <w:r>
+        <w:rPr>
+          <w:rFonts w:ascii="Arial" w:hAnsi="Arial" w:cs="Arial"/>
+          <w:bCs/>
+          <w:lang w:val="en-GB"/>
+        </w:rPr>
+        <w:t xml:space="preserve"> was linked to the report for showing the </w:t>
+      </w:r>
+      <w:r>
+        <w:rPr>
+          <w:rFonts w:ascii="Arial" w:hAnsi="Arial" w:cs="Arial"/>
+          <w:bCs/>
+          <w:lang w:val="en-GB"/>
+        </w:rPr>
+        <w:t>matched event metadata (label, start, end, description)</w:t>
+      </w:r>
+      <w:r>
+        <w:rPr>
+          <w:rFonts w:ascii="Arial" w:hAnsi="Arial" w:cs="Arial"/>
+          <w:bCs/>
+          <w:lang w:val="en-GB"/>
+        </w:rPr>
+        <w:t xml:space="preserve"> for each event. The number of flagged implausible values and the number of </w:t>
+      </w:r>
+      <w:r>
+        <w:rPr>
+          <w:rFonts w:ascii="Arial" w:hAnsi="Arial" w:cs="Arial"/>
+          <w:bCs/>
+          <w:lang w:val="en-GB"/>
+        </w:rPr>
+        <w:t xml:space="preserve">values actually replaced were logged separately per sensor, allowing </w:t>
+      </w:r>
+      <w:r>
+        <w:rPr>
+          <w:rFonts w:ascii="Arial" w:hAnsi="Arial" w:cs="Arial"/>
+          <w:bCs/>
+          <w:lang w:val="en-GB"/>
+        </w:rPr>
+        <w:t>the extent of data quality issues to be quantified.</w:t>
+      </w:r>
+    </w:p>
+    <w:p>
+      <w:pPr>
+        <w:spacing w:line="360" w:lineRule="auto"/>
+        <w:rPr>
+          <w:rFonts w:ascii="Arial" w:hAnsi="Arial" w:cs="Arial"/>
+          <w:bCs/>
+          <w:lang w:val="en-GB"/>
+        </w:rPr>
+      </w:pPr>
+      <w:r>
+        <w:rPr>
+          <w:rFonts w:ascii="Arial" w:hAnsi="Arial" w:cs="Arial"/>
+          <w:bCs/>
+          <w:lang w:val="en-GB"/>
+        </w:rPr>
+        <w:t>The cleaned datasets as CSV files</w:t>
+      </w:r>
+      <w:r>
+        <w:rPr>
+          <w:rFonts w:ascii="Arial" w:hAnsi="Arial" w:cs="Arial"/>
+          <w:bCs/>
+          <w:lang w:val="en-GB"/>
+        </w:rPr>
+        <w:t xml:space="preserve"> and the report</w:t>
+      </w:r>
+      <w:r>
+        <w:rPr>
+          <w:rFonts w:ascii="Arial" w:hAnsi="Arial" w:cs="Arial"/>
+          <w:bCs/>
+          <w:lang w:val="en-GB"/>
+        </w:rPr>
+        <w:t>s of each event were saved in a new folder</w:t>
+      </w:r>
+      <w:r>
+        <w:rPr>
+          <w:rFonts w:ascii="Arial" w:hAnsi="Arial" w:cs="Arial"/>
+          <w:bCs/>
+          <w:lang w:val="en-GB"/>
+        </w:rPr>
+        <w:t>, which can be used for further analysis.</w:t>
+      </w:r>
+    </w:p>
+    <w:p>
+      <w:pPr>
+        <w:spacing w:line="360" w:lineRule="auto"/>
+        <w:rPr>
+          <w:rFonts w:ascii="Arial" w:hAnsi="Arial" w:cs="Arial"/>
+          <w:bCs/>
+          <w:lang w:val="en-GB"/>
+        </w:rPr>
+      </w:pPr>
+    </w:p>
+    <w:p>
+      <w:pPr>
+        <w:pStyle w:val="Listenabsatz"/>
+        <w:numPr>
+          <w:ilvl w:val="1"/>
+          <w:numId w:val="31"/>
+        </w:numPr>
+        <w:spacing w:after="240" w:line="360" w:lineRule="auto"/>
+        <w:jc w:val="both"/>
+        <w:outlineLvl w:val="0"/>
+        <w:rPr>
+          <w:rFonts w:ascii="Arial" w:hAnsi="Arial" w:cs="Arial"/>
+          <w:b/>
+          <w:lang w:val="en-GB"/>
+        </w:rPr>
+      </w:pPr>
+      <w:bookmarkStart w:id="7" w:name="_Toc238146703"/>
+      <w:r>
+        <w:rPr>
+          <w:rFonts w:ascii="Arial" w:hAnsi="Arial" w:cs="Arial"/>
+          <w:b/>
+          <w:lang w:val="en-GB"/>
+        </w:rPr>
+        <w:lastRenderedPageBreak/>
+        <w:t>Data analysis</w:t>
+      </w:r>
+      <w:bookmarkEnd w:id="7"/>
+    </w:p>
+    <w:p>
+      <w:pPr>
+        <w:spacing w:line="360" w:lineRule="auto"/>
+        <w:jc w:val="both"/>
+        <w:rPr>
+          <w:rFonts w:ascii="Arial" w:hAnsi="Arial" w:cs="Arial"/>
+          <w:bCs/>
+          <w:lang w:val="en-GB"/>
+        </w:rPr>
+      </w:pPr>
+      <w:r>
+        <w:rPr>
+          <w:rFonts w:ascii="Arial" w:hAnsi="Arial" w:cs="Arial"/>
+          <w:bCs/>
+          <w:lang w:val="en-GB"/>
+        </w:rPr>
         <w:t>Text</w:t>
+      </w:r>
+    </w:p>
+    <w:p>
+      <w:pPr>
+        <w:spacing w:line="360" w:lineRule="auto"/>
+        <w:jc w:val="both"/>
+        <w:rPr>
+          <w:rFonts w:ascii="Arial" w:hAnsi="Arial" w:cs="Arial"/>
+          <w:bCs/>
+          <w:lang w:val="en-GB"/>
+        </w:rPr>
+      </w:pPr>
+      <w:r>
+        <w:rPr>
+          <w:rFonts w:ascii="Arial" w:hAnsi="Arial" w:cs="Arial"/>
+          <w:bCs/>
+          <w:lang w:val="en-GB"/>
+        </w:rPr>
+        <w:t xml:space="preserve">Sensor 31 am besten entfernen, </w:t>
+      </w:r>
+      <w:r>
+        <w:rPr>
+          <w:rFonts w:ascii="Arial" w:hAnsi="Arial" w:cs="Arial"/>
+          <w:bCs/>
+          <w:lang w:val="en-GB"/>
+        </w:rPr>
+        <w:t>da die werte dort beim cleaning bzw bei den flags häufig als unplausibel gewertet wurden</w:t>
       </w:r>
     </w:p>
     <w:p>
@@ -1792,19 +4518,125 @@
           <w:lang w:val="en-GB"/>
         </w:rPr>
       </w:pPr>
-      <w:bookmarkStart w:id="3" w:name="_Toc237947570"/>
+      <w:bookmarkStart w:id="8" w:name="_Toc238146704"/>
       <w:r>
         <w:rPr>
           <w:rFonts w:ascii="Arial" w:hAnsi="Arial" w:cs="Arial"/>
           <w:b/>
           <w:lang w:val="en-GB"/>
         </w:rPr>
-        <w:t>Discussion</w:t>
-      </w:r>
-      <w:bookmarkEnd w:id="3"/>
+        <w:t>Results</w:t>
+      </w:r>
+      <w:bookmarkEnd w:id="8"/>
     </w:p>
     <w:p>
       <w:pPr>
+        <w:pStyle w:val="Listenabsatz"/>
+        <w:numPr>
+          <w:ilvl w:val="1"/>
+          <w:numId w:val="32"/>
+        </w:numPr>
+        <w:spacing w:after="240" w:line="360" w:lineRule="auto"/>
+        <w:jc w:val="both"/>
+        <w:outlineLvl w:val="0"/>
+        <w:rPr>
+          <w:rFonts w:ascii="Arial" w:hAnsi="Arial" w:cs="Arial"/>
+          <w:b/>
+          <w:lang w:val="en-GB"/>
+        </w:rPr>
+      </w:pPr>
+      <w:bookmarkStart w:id="9" w:name="_Toc238146705"/>
+      <w:r>
+        <w:rPr>
+          <w:rFonts w:ascii="Arial" w:hAnsi="Arial" w:cs="Arial"/>
+          <w:b/>
+          <w:lang w:val="en-GB"/>
+        </w:rPr>
+        <w:t>Combining Datasets</w:t>
+      </w:r>
+      <w:bookmarkEnd w:id="9"/>
+    </w:p>
+    <w:p>
+      <w:pPr>
+        <w:spacing w:line="360" w:lineRule="auto"/>
+        <w:rPr>
+          <w:rFonts w:ascii="Arial" w:hAnsi="Arial" w:cs="Arial"/>
+          <w:bCs/>
+        </w:rPr>
+      </w:pPr>
+      <w:r>
+        <w:rPr>
+          <w:rFonts w:ascii="Arial" w:hAnsi="Arial" w:cs="Arial"/>
+          <w:bCs/>
+        </w:rPr>
+        <w:t>Turbinen und die jeweiligen events als tabelle</w:t>
+      </w:r>
+    </w:p>
+    <w:p>
+      <w:pPr>
+        <w:spacing w:line="360" w:lineRule="auto"/>
+        <w:rPr>
+          <w:rFonts w:ascii="Arial" w:hAnsi="Arial" w:cs="Arial"/>
+          <w:bCs/>
+        </w:rPr>
+      </w:pPr>
+    </w:p>
+    <w:p>
+      <w:pPr>
+        <w:pStyle w:val="Listenabsatz"/>
+        <w:numPr>
+          <w:ilvl w:val="1"/>
+          <w:numId w:val="32"/>
+        </w:numPr>
+        <w:spacing w:after="240" w:line="360" w:lineRule="auto"/>
+        <w:jc w:val="both"/>
+        <w:outlineLvl w:val="0"/>
+        <w:rPr>
+          <w:rFonts w:ascii="Arial" w:hAnsi="Arial" w:cs="Arial"/>
+          <w:b/>
+          <w:lang w:val="en-GB"/>
+        </w:rPr>
+      </w:pPr>
+      <w:bookmarkStart w:id="10" w:name="_Toc238146706"/>
+      <w:r>
+        <w:rPr>
+          <w:rFonts w:ascii="Arial" w:hAnsi="Arial" w:cs="Arial"/>
+          <w:b/>
+          <w:lang w:val="en-GB"/>
+        </w:rPr>
+        <w:t>Cleaning the data</w:t>
+      </w:r>
+      <w:bookmarkEnd w:id="10"/>
+    </w:p>
+    <w:p>
+      <w:pPr>
+        <w:pStyle w:val="Listenabsatz"/>
+        <w:numPr>
+          <w:ilvl w:val="1"/>
+          <w:numId w:val="32"/>
+        </w:numPr>
+        <w:spacing w:after="240" w:line="360" w:lineRule="auto"/>
+        <w:jc w:val="both"/>
+        <w:outlineLvl w:val="0"/>
+        <w:rPr>
+          <w:rFonts w:ascii="Arial" w:hAnsi="Arial" w:cs="Arial"/>
+          <w:b/>
+          <w:lang w:val="en-GB"/>
+        </w:rPr>
+      </w:pPr>
+      <w:bookmarkStart w:id="11" w:name="_Toc238146707"/>
+      <w:r>
+        <w:rPr>
+          <w:rFonts w:ascii="Arial" w:hAnsi="Arial" w:cs="Arial"/>
+          <w:b/>
+          <w:lang w:val="en-GB"/>
+        </w:rPr>
+        <w:t>Data analysis</w:t>
+      </w:r>
+      <w:bookmarkEnd w:id="11"/>
+    </w:p>
+    <w:p>
+      <w:pPr>
         <w:spacing w:line="360" w:lineRule="auto"/>
         <w:jc w:val="both"/>
         <w:rPr>
@@ -1828,7 +4660,7 @@
         <w:jc w:val="both"/>
         <w:rPr>
           <w:rFonts w:ascii="Arial" w:hAnsi="Arial" w:cs="Arial"/>
-          <w:b/>
+          <w:bCs/>
           <w:lang w:val="en-GB"/>
         </w:rPr>
       </w:pPr>
@@ -1849,16 +4681,73 @@
           <w:lang w:val="en-GB"/>
         </w:rPr>
       </w:pPr>
-      <w:bookmarkStart w:id="4" w:name="_Toc237947571"/>
+      <w:bookmarkStart w:id="12" w:name="_Toc238146708"/>
       <w:r>
         <w:rPr>
           <w:rFonts w:ascii="Arial" w:hAnsi="Arial" w:cs="Arial"/>
           <w:b/>
           <w:lang w:val="en-GB"/>
         </w:rPr>
+        <w:t>Discussion</w:t>
+      </w:r>
+      <w:bookmarkEnd w:id="12"/>
+    </w:p>
+    <w:p>
+      <w:pPr>
+        <w:spacing w:line="360" w:lineRule="auto"/>
+        <w:jc w:val="both"/>
+        <w:rPr>
+          <w:rFonts w:ascii="Arial" w:hAnsi="Arial" w:cs="Arial"/>
+          <w:bCs/>
+          <w:lang w:val="en-GB"/>
+        </w:rPr>
+      </w:pPr>
+      <w:r>
+        <w:rPr>
+          <w:rFonts w:ascii="Arial" w:hAnsi="Arial" w:cs="Arial"/>
+          <w:bCs/>
+          <w:lang w:val="en-GB"/>
+        </w:rPr>
+        <w:t>Limitations</w:t>
+      </w:r>
+    </w:p>
+    <w:p>
+      <w:pPr>
+        <w:spacing w:line="360" w:lineRule="auto"/>
+        <w:jc w:val="both"/>
+        <w:rPr>
+          <w:rFonts w:ascii="Arial" w:hAnsi="Arial" w:cs="Arial"/>
+          <w:b/>
+          <w:lang w:val="en-GB"/>
+        </w:rPr>
+      </w:pPr>
+    </w:p>
+    <w:p>
+      <w:pPr>
+        <w:pStyle w:val="Listenabsatz"/>
+        <w:numPr>
+          <w:ilvl w:val="0"/>
+          <w:numId w:val="25"/>
+        </w:numPr>
+        <w:spacing w:after="240" w:line="360" w:lineRule="auto"/>
+        <w:jc w:val="both"/>
+        <w:outlineLvl w:val="0"/>
+        <w:rPr>
+          <w:rFonts w:ascii="Arial" w:hAnsi="Arial" w:cs="Arial"/>
+          <w:b/>
+          <w:lang w:val="en-GB"/>
+        </w:rPr>
+      </w:pPr>
+      <w:bookmarkStart w:id="13" w:name="_Toc238146709"/>
+      <w:r>
+        <w:rPr>
+          <w:rFonts w:ascii="Arial" w:hAnsi="Arial" w:cs="Arial"/>
+          <w:b/>
+          <w:lang w:val="en-GB"/>
+        </w:rPr>
         <w:t>Conclusion</w:t>
       </w:r>
-      <w:bookmarkEnd w:id="4"/>
+      <w:bookmarkEnd w:id="13"/>
     </w:p>
     <w:p>
       <w:pPr>
@@ -1935,7 +4824,7 @@
           <w:lang w:val="en-GB"/>
         </w:rPr>
       </w:pPr>
-      <w:bookmarkStart w:id="5" w:name="_Toc237947572"/>
+      <w:bookmarkStart w:id="14" w:name="_Toc238146710"/>
       <w:r>
         <w:rPr>
           <w:rFonts w:ascii="Arial" w:hAnsi="Arial" w:cs="Arial"/>
@@ -1945,7 +4834,7 @@
         <w:lastRenderedPageBreak/>
         <w:t>References</w:t>
       </w:r>
-      <w:bookmarkEnd w:id="5"/>
+      <w:bookmarkEnd w:id="14"/>
     </w:p>
     <w:p>
       <w:pPr>
@@ -3347,6 +6236,232 @@
     </w:lvl>
   </w:abstractNum>
   <w:abstractNum w:abstractNumId="12" w15:restartNumberingAfterBreak="0">
+    <w:nsid w:val="2FA33533"/>
+    <w:multiLevelType w:val="multilevel"/>
+    <w:tmpl w:val="56F08BE8"/>
+    <w:lvl w:ilvl="0">
+      <w:start w:val="2"/>
+      <w:numFmt w:val="decimal"/>
+      <w:lvlText w:val="%1."/>
+      <w:lvlJc w:val="left"/>
+      <w:pPr>
+        <w:ind w:left="360" w:hanging="360"/>
+      </w:pPr>
+      <w:rPr>
+        <w:rFonts w:hint="default"/>
+      </w:rPr>
+    </w:lvl>
+    <w:lvl w:ilvl="1">
+      <w:start w:val="1"/>
+      <w:numFmt w:val="decimal"/>
+      <w:lvlText w:val="%1.%2."/>
+      <w:lvlJc w:val="left"/>
+      <w:pPr>
+        <w:ind w:left="1800" w:hanging="720"/>
+      </w:pPr>
+      <w:rPr>
+        <w:rFonts w:hint="default"/>
+      </w:rPr>
+    </w:lvl>
+    <w:lvl w:ilvl="2">
+      <w:start w:val="1"/>
+      <w:numFmt w:val="decimal"/>
+      <w:lvlText w:val="%1.%2.%3."/>
+      <w:lvlJc w:val="left"/>
+      <w:pPr>
+        <w:ind w:left="2880" w:hanging="720"/>
+      </w:pPr>
+      <w:rPr>
+        <w:rFonts w:hint="default"/>
+      </w:rPr>
+    </w:lvl>
+    <w:lvl w:ilvl="3">
+      <w:start w:val="1"/>
+      <w:numFmt w:val="decimal"/>
+      <w:lvlText w:val="%1.%2.%3.%4."/>
+      <w:lvlJc w:val="left"/>
+      <w:pPr>
+        <w:ind w:left="4320" w:hanging="1080"/>
+      </w:pPr>
+      <w:rPr>
+        <w:rFonts w:hint="default"/>
+      </w:rPr>
+    </w:lvl>
+    <w:lvl w:ilvl="4">
+      <w:start w:val="1"/>
+      <w:numFmt w:val="decimal"/>
+      <w:lvlText w:val="%1.%2.%3.%4.%5."/>
+      <w:lvlJc w:val="left"/>
+      <w:pPr>
+        <w:ind w:left="5400" w:hanging="1080"/>
+      </w:pPr>
+      <w:rPr>
+        <w:rFonts w:hint="default"/>
+      </w:rPr>
+    </w:lvl>
+    <w:lvl w:ilvl="5">
+      <w:start w:val="1"/>
+      <w:numFmt w:val="decimal"/>
+      <w:lvlText w:val="%1.%2.%3.%4.%5.%6."/>
+      <w:lvlJc w:val="left"/>
+      <w:pPr>
+        <w:ind w:left="6840" w:hanging="1440"/>
+      </w:pPr>
+      <w:rPr>
+        <w:rFonts w:hint="default"/>
+      </w:rPr>
+    </w:lvl>
+    <w:lvl w:ilvl="6">
+      <w:start w:val="1"/>
+      <w:numFmt w:val="decimal"/>
+      <w:lvlText w:val="%1.%2.%3.%4.%5.%6.%7."/>
+      <w:lvlJc w:val="left"/>
+      <w:pPr>
+        <w:ind w:left="7920" w:hanging="1440"/>
+      </w:pPr>
+      <w:rPr>
+        <w:rFonts w:hint="default"/>
+      </w:rPr>
+    </w:lvl>
+    <w:lvl w:ilvl="7">
+      <w:start w:val="1"/>
+      <w:numFmt w:val="decimal"/>
+      <w:lvlText w:val="%1.%2.%3.%4.%5.%6.%7.%8."/>
+      <w:lvlJc w:val="left"/>
+      <w:pPr>
+        <w:ind w:left="9360" w:hanging="1800"/>
+      </w:pPr>
+      <w:rPr>
+        <w:rFonts w:hint="default"/>
+      </w:rPr>
+    </w:lvl>
+    <w:lvl w:ilvl="8">
+      <w:start w:val="1"/>
+      <w:numFmt w:val="decimal"/>
+      <w:lvlText w:val="%1.%2.%3.%4.%5.%6.%7.%8.%9."/>
+      <w:lvlJc w:val="left"/>
+      <w:pPr>
+        <w:ind w:left="10440" w:hanging="1800"/>
+      </w:pPr>
+      <w:rPr>
+        <w:rFonts w:hint="default"/>
+      </w:rPr>
+    </w:lvl>
+  </w:abstractNum>
+  <w:abstractNum w:abstractNumId="13" w15:restartNumberingAfterBreak="0">
+    <w:nsid w:val="3287218D"/>
+    <w:multiLevelType w:val="multilevel"/>
+    <w:tmpl w:val="B88E903A"/>
+    <w:lvl w:ilvl="0">
+      <w:start w:val="4"/>
+      <w:numFmt w:val="decimal"/>
+      <w:lvlText w:val="%1"/>
+      <w:lvlJc w:val="left"/>
+      <w:pPr>
+        <w:ind w:left="360" w:hanging="360"/>
+      </w:pPr>
+      <w:rPr>
+        <w:rFonts w:hint="default"/>
+      </w:rPr>
+    </w:lvl>
+    <w:lvl w:ilvl="1">
+      <w:start w:val="1"/>
+      <w:numFmt w:val="decimal"/>
+      <w:lvlText w:val="%1.%2"/>
+      <w:lvlJc w:val="left"/>
+      <w:pPr>
+        <w:ind w:left="1440" w:hanging="360"/>
+      </w:pPr>
+      <w:rPr>
+        <w:rFonts w:hint="default"/>
+      </w:rPr>
+    </w:lvl>
+    <w:lvl w:ilvl="2">
+      <w:start w:val="1"/>
+      <w:numFmt w:val="decimal"/>
+      <w:lvlText w:val="%1.%2.%3"/>
+      <w:lvlJc w:val="left"/>
+      <w:pPr>
+        <w:ind w:left="2880" w:hanging="720"/>
+      </w:pPr>
+      <w:rPr>
+        <w:rFonts w:hint="default"/>
+      </w:rPr>
+    </w:lvl>
+    <w:lvl w:ilvl="3">
+      <w:start w:val="1"/>
+      <w:numFmt w:val="decimal"/>
+      <w:lvlText w:val="%1.%2.%3.%4"/>
+      <w:lvlJc w:val="left"/>
+      <w:pPr>
+        <w:ind w:left="3960" w:hanging="720"/>
+      </w:pPr>
+      <w:rPr>
+        <w:rFonts w:hint="default"/>
+      </w:rPr>
+    </w:lvl>
+    <w:lvl w:ilvl="4">
+      <w:start w:val="1"/>
+      <w:numFmt w:val="decimal"/>
+      <w:lvlText w:val="%1.%2.%3.%4.%5"/>
+      <w:lvlJc w:val="left"/>
+      <w:pPr>
+        <w:ind w:left="5400" w:hanging="1080"/>
+      </w:pPr>
+      <w:rPr>
+        <w:rFonts w:hint="default"/>
+      </w:rPr>
+    </w:lvl>
+    <w:lvl w:ilvl="5">
+      <w:start w:val="1"/>
+      <w:numFmt w:val="decimal"/>
+      <w:lvlText w:val="%1.%2.%3.%4.%5.%6"/>
+      <w:lvlJc w:val="left"/>
+      <w:pPr>
+        <w:ind w:left="6480" w:hanging="1080"/>
+      </w:pPr>
+      <w:rPr>
+        <w:rFonts w:hint="default"/>
+      </w:rPr>
+    </w:lvl>
+    <w:lvl w:ilvl="6">
+      <w:start w:val="1"/>
+      <w:numFmt w:val="decimal"/>
+      <w:lvlText w:val="%1.%2.%3.%4.%5.%6.%7"/>
+      <w:lvlJc w:val="left"/>
+      <w:pPr>
+        <w:ind w:left="7920" w:hanging="1440"/>
+      </w:pPr>
+      <w:rPr>
+        <w:rFonts w:hint="default"/>
+      </w:rPr>
+    </w:lvl>
+    <w:lvl w:ilvl="7">
+      <w:start w:val="1"/>
+      <w:numFmt w:val="decimal"/>
+      <w:lvlText w:val="%1.%2.%3.%4.%5.%6.%7.%8"/>
+      <w:lvlJc w:val="left"/>
+      <w:pPr>
+        <w:ind w:left="9000" w:hanging="1440"/>
+      </w:pPr>
+      <w:rPr>
+        <w:rFonts w:hint="default"/>
+      </w:rPr>
+    </w:lvl>
+    <w:lvl w:ilvl="8">
+      <w:start w:val="1"/>
+      <w:numFmt w:val="decimal"/>
+      <w:lvlText w:val="%1.%2.%3.%4.%5.%6.%7.%8.%9"/>
+      <w:lvlJc w:val="left"/>
+      <w:pPr>
+        <w:ind w:left="10440" w:hanging="1800"/>
+      </w:pPr>
+      <w:rPr>
+        <w:rFonts w:hint="default"/>
+      </w:rPr>
+    </w:lvl>
+  </w:abstractNum>
+  <w:abstractNum w:abstractNumId="14" w15:restartNumberingAfterBreak="0">
     <w:nsid w:val="33BF6E1C"/>
     <w:multiLevelType w:val="multilevel"/>
     <w:tmpl w:val="FFFFFFFF"/>
@@ -3459,7 +6574,7 @@
       </w:rPr>
     </w:lvl>
   </w:abstractNum>
-  <w:abstractNum w:abstractNumId="13" w15:restartNumberingAfterBreak="0">
+  <w:abstractNum w:abstractNumId="15" w15:restartNumberingAfterBreak="0">
     <w:nsid w:val="3689651E"/>
     <w:multiLevelType w:val="multilevel"/>
     <w:tmpl w:val="162C1056"/>
@@ -3580,7 +6695,7 @@
       </w:rPr>
     </w:lvl>
   </w:abstractNum>
-  <w:abstractNum w:abstractNumId="14" w15:restartNumberingAfterBreak="0">
+  <w:abstractNum w:abstractNumId="16" w15:restartNumberingAfterBreak="0">
     <w:nsid w:val="37FD21B2"/>
     <w:multiLevelType w:val="multilevel"/>
     <w:tmpl w:val="AC14096C"/>
@@ -3693,7 +6808,7 @@
       </w:rPr>
     </w:lvl>
   </w:abstractNum>
-  <w:abstractNum w:abstractNumId="15" w15:restartNumberingAfterBreak="0">
+  <w:abstractNum w:abstractNumId="17" w15:restartNumberingAfterBreak="0">
     <w:nsid w:val="38195D78"/>
     <w:multiLevelType w:val="hybridMultilevel"/>
     <w:tmpl w:val="2C52BC90"/>
@@ -3806,7 +6921,7 @@
       </w:rPr>
     </w:lvl>
   </w:abstractNum>
-  <w:abstractNum w:abstractNumId="16" w15:restartNumberingAfterBreak="0">
+  <w:abstractNum w:abstractNumId="18" w15:restartNumberingAfterBreak="0">
     <w:nsid w:val="39A7764F"/>
     <w:multiLevelType w:val="hybridMultilevel"/>
     <w:tmpl w:val="FC24934A"/>
@@ -3895,7 +7010,7 @@
       </w:pPr>
     </w:lvl>
   </w:abstractNum>
-  <w:abstractNum w:abstractNumId="17" w15:restartNumberingAfterBreak="0">
+  <w:abstractNum w:abstractNumId="19" w15:restartNumberingAfterBreak="0">
     <w:nsid w:val="39ED7F43"/>
     <w:multiLevelType w:val="hybridMultilevel"/>
     <w:tmpl w:val="11C65DF0"/>
@@ -3984,7 +7099,7 @@
       </w:pPr>
     </w:lvl>
   </w:abstractNum>
-  <w:abstractNum w:abstractNumId="18" w15:restartNumberingAfterBreak="0">
+  <w:abstractNum w:abstractNumId="20" w15:restartNumberingAfterBreak="0">
     <w:nsid w:val="3C6813A7"/>
     <w:multiLevelType w:val="hybridMultilevel"/>
     <w:tmpl w:val="4EB6F1CA"/>
@@ -4073,7 +7188,7 @@
       </w:pPr>
     </w:lvl>
   </w:abstractNum>
-  <w:abstractNum w:abstractNumId="19" w15:restartNumberingAfterBreak="0">
+  <w:abstractNum w:abstractNumId="21" w15:restartNumberingAfterBreak="0">
     <w:nsid w:val="3D8C5AB3"/>
     <w:multiLevelType w:val="hybridMultilevel"/>
     <w:tmpl w:val="D22207FA"/>
@@ -4162,7 +7277,7 @@
       </w:pPr>
     </w:lvl>
   </w:abstractNum>
-  <w:abstractNum w:abstractNumId="20" w15:restartNumberingAfterBreak="0">
+  <w:abstractNum w:abstractNumId="22" w15:restartNumberingAfterBreak="0">
     <w:nsid w:val="4AA13F2C"/>
     <w:multiLevelType w:val="hybridMultilevel"/>
     <w:tmpl w:val="3294CD76"/>
@@ -4251,7 +7366,7 @@
       </w:pPr>
     </w:lvl>
   </w:abstractNum>
-  <w:abstractNum w:abstractNumId="21" w15:restartNumberingAfterBreak="0">
+  <w:abstractNum w:abstractNumId="23" w15:restartNumberingAfterBreak="0">
     <w:nsid w:val="4AFE298D"/>
     <w:multiLevelType w:val="hybridMultilevel"/>
     <w:tmpl w:val="4EB6F1CA"/>
@@ -4267,7 +7382,7 @@
         <w:rFonts w:hint="default"/>
       </w:rPr>
     </w:lvl>
-    <w:lvl w:ilvl="1" w:tplc="04070019" w:tentative="1">
+    <w:lvl w:ilvl="1" w:tplc="04070019">
       <w:start w:val="1"/>
       <w:numFmt w:val="lowerLetter"/>
       <w:lvlText w:val="%2."/>
@@ -4340,7 +7455,7 @@
       </w:pPr>
     </w:lvl>
   </w:abstractNum>
-  <w:abstractNum w:abstractNumId="22" w15:restartNumberingAfterBreak="0">
+  <w:abstractNum w:abstractNumId="24" w15:restartNumberingAfterBreak="0">
     <w:nsid w:val="4B7C1F8D"/>
     <w:multiLevelType w:val="hybridMultilevel"/>
     <w:tmpl w:val="1620065E"/>
@@ -4429,7 +7544,7 @@
       </w:pPr>
     </w:lvl>
   </w:abstractNum>
-  <w:abstractNum w:abstractNumId="23" w15:restartNumberingAfterBreak="0">
+  <w:abstractNum w:abstractNumId="25" w15:restartNumberingAfterBreak="0">
     <w:nsid w:val="5ACA483E"/>
     <w:multiLevelType w:val="hybridMultilevel"/>
     <w:tmpl w:val="16F65970"/>
@@ -4542,7 +7657,7 @@
       </w:rPr>
     </w:lvl>
   </w:abstractNum>
-  <w:abstractNum w:abstractNumId="24" w15:restartNumberingAfterBreak="0">
+  <w:abstractNum w:abstractNumId="26" w15:restartNumberingAfterBreak="0">
     <w:nsid w:val="5B6F04DB"/>
     <w:multiLevelType w:val="hybridMultilevel"/>
     <w:tmpl w:val="807A3EFE"/>
@@ -4631,7 +7746,120 @@
       </w:pPr>
     </w:lvl>
   </w:abstractNum>
-  <w:abstractNum w:abstractNumId="25" w15:restartNumberingAfterBreak="0">
+  <w:abstractNum w:abstractNumId="27" w15:restartNumberingAfterBreak="0">
+    <w:nsid w:val="66063E80"/>
+    <w:multiLevelType w:val="multilevel"/>
+    <w:tmpl w:val="EA3A6804"/>
+    <w:lvl w:ilvl="0">
+      <w:start w:val="3"/>
+      <w:numFmt w:val="decimal"/>
+      <w:lvlText w:val="%1"/>
+      <w:lvlJc w:val="left"/>
+      <w:pPr>
+        <w:ind w:left="360" w:hanging="360"/>
+      </w:pPr>
+      <w:rPr>
+        <w:rFonts w:hint="default"/>
+      </w:rPr>
+    </w:lvl>
+    <w:lvl w:ilvl="1">
+      <w:start w:val="1"/>
+      <w:numFmt w:val="decimal"/>
+      <w:lvlText w:val="%1.%2"/>
+      <w:lvlJc w:val="left"/>
+      <w:pPr>
+        <w:ind w:left="1440" w:hanging="360"/>
+      </w:pPr>
+      <w:rPr>
+        <w:rFonts w:hint="default"/>
+      </w:rPr>
+    </w:lvl>
+    <w:lvl w:ilvl="2">
+      <w:start w:val="1"/>
+      <w:numFmt w:val="decimal"/>
+      <w:lvlText w:val="%1.%2.%3"/>
+      <w:lvlJc w:val="left"/>
+      <w:pPr>
+        <w:ind w:left="2880" w:hanging="720"/>
+      </w:pPr>
+      <w:rPr>
+        <w:rFonts w:hint="default"/>
+      </w:rPr>
+    </w:lvl>
+    <w:lvl w:ilvl="3">
+      <w:start w:val="1"/>
+      <w:numFmt w:val="decimal"/>
+      <w:lvlText w:val="%1.%2.%3.%4"/>
+      <w:lvlJc w:val="left"/>
+      <w:pPr>
+        <w:ind w:left="3960" w:hanging="720"/>
+      </w:pPr>
+      <w:rPr>
+        <w:rFonts w:hint="default"/>
+      </w:rPr>
+    </w:lvl>
+    <w:lvl w:ilvl="4">
+      <w:start w:val="1"/>
+      <w:numFmt w:val="decimal"/>
+      <w:lvlText w:val="%1.%2.%3.%4.%5"/>
+      <w:lvlJc w:val="left"/>
+      <w:pPr>
+        <w:ind w:left="5400" w:hanging="1080"/>
+      </w:pPr>
+      <w:rPr>
+        <w:rFonts w:hint="default"/>
+      </w:rPr>
+    </w:lvl>
+    <w:lvl w:ilvl="5">
+      <w:start w:val="1"/>
+      <w:numFmt w:val="decimal"/>
+      <w:lvlText w:val="%1.%2.%3.%4.%5.%6"/>
+      <w:lvlJc w:val="left"/>
+      <w:pPr>
+        <w:ind w:left="6480" w:hanging="1080"/>
+      </w:pPr>
+      <w:rPr>
+        <w:rFonts w:hint="default"/>
+      </w:rPr>
+    </w:lvl>
+    <w:lvl w:ilvl="6">
+      <w:start w:val="1"/>
+      <w:numFmt w:val="decimal"/>
+      <w:lvlText w:val="%1.%2.%3.%4.%5.%6.%7"/>
+      <w:lvlJc w:val="left"/>
+      <w:pPr>
+        <w:ind w:left="7920" w:hanging="1440"/>
+      </w:pPr>
+      <w:rPr>
+        <w:rFonts w:hint="default"/>
+      </w:rPr>
+    </w:lvl>
+    <w:lvl w:ilvl="7">
+      <w:start w:val="1"/>
+      <w:numFmt w:val="decimal"/>
+      <w:lvlText w:val="%1.%2.%3.%4.%5.%6.%7.%8"/>
+      <w:lvlJc w:val="left"/>
+      <w:pPr>
+        <w:ind w:left="9000" w:hanging="1440"/>
+      </w:pPr>
+      <w:rPr>
+        <w:rFonts w:hint="default"/>
+      </w:rPr>
+    </w:lvl>
+    <w:lvl w:ilvl="8">
+      <w:start w:val="1"/>
+      <w:numFmt w:val="decimal"/>
+      <w:lvlText w:val="%1.%2.%3.%4.%5.%6.%7.%8.%9"/>
+      <w:lvlJc w:val="left"/>
+      <w:pPr>
+        <w:ind w:left="10440" w:hanging="1800"/>
+      </w:pPr>
+      <w:rPr>
+        <w:rFonts w:hint="default"/>
+      </w:rPr>
+    </w:lvl>
+  </w:abstractNum>
+  <w:abstractNum w:abstractNumId="28" w15:restartNumberingAfterBreak="0">
     <w:nsid w:val="6E7C5C03"/>
     <w:multiLevelType w:val="multilevel"/>
     <w:tmpl w:val="0407001F"/>
@@ -4717,7 +7945,7 @@
       </w:pPr>
     </w:lvl>
   </w:abstractNum>
-  <w:abstractNum w:abstractNumId="26" w15:restartNumberingAfterBreak="0">
+  <w:abstractNum w:abstractNumId="29" w15:restartNumberingAfterBreak="0">
     <w:nsid w:val="72434D10"/>
     <w:multiLevelType w:val="hybridMultilevel"/>
     <w:tmpl w:val="4EB6F1CA"/>
@@ -4806,7 +8034,7 @@
       </w:pPr>
     </w:lvl>
   </w:abstractNum>
-  <w:abstractNum w:abstractNumId="27" w15:restartNumberingAfterBreak="0">
+  <w:abstractNum w:abstractNumId="30" w15:restartNumberingAfterBreak="0">
     <w:nsid w:val="788E3A0A"/>
     <w:multiLevelType w:val="hybridMultilevel"/>
     <w:tmpl w:val="4EB6F1CA"/>
@@ -4895,7 +8123,7 @@
       </w:pPr>
     </w:lvl>
   </w:abstractNum>
-  <w:abstractNum w:abstractNumId="28" w15:restartNumberingAfterBreak="0">
+  <w:abstractNum w:abstractNumId="31" w15:restartNumberingAfterBreak="0">
     <w:nsid w:val="7EBA6E12"/>
     <w:multiLevelType w:val="hybridMultilevel"/>
     <w:tmpl w:val="8CDA28CE"/>
@@ -4985,40 +8213,40 @@
     </w:lvl>
   </w:abstractNum>
   <w:num w:numId="1" w16cid:durableId="862092310">
-    <w:abstractNumId w:val="17"/>
+    <w:abstractNumId w:val="19"/>
   </w:num>
   <w:num w:numId="2" w16cid:durableId="1239368899">
     <w:abstractNumId w:val="4"/>
   </w:num>
   <w:num w:numId="3" w16cid:durableId="464396724">
-    <w:abstractNumId w:val="22"/>
+    <w:abstractNumId w:val="24"/>
   </w:num>
   <w:num w:numId="4" w16cid:durableId="50157486">
-    <w:abstractNumId w:val="15"/>
+    <w:abstractNumId w:val="17"/>
   </w:num>
   <w:num w:numId="5" w16cid:durableId="1857231664">
-    <w:abstractNumId w:val="19"/>
+    <w:abstractNumId w:val="21"/>
   </w:num>
   <w:num w:numId="6" w16cid:durableId="1832479498">
     <w:abstractNumId w:val="1"/>
   </w:num>
   <w:num w:numId="7" w16cid:durableId="670379589">
-    <w:abstractNumId w:val="13"/>
+    <w:abstractNumId w:val="15"/>
   </w:num>
   <w:num w:numId="8" w16cid:durableId="1504860571">
     <w:abstractNumId w:val="3"/>
   </w:num>
   <w:num w:numId="9" w16cid:durableId="1889026938">
-    <w:abstractNumId w:val="14"/>
+    <w:abstractNumId w:val="16"/>
   </w:num>
   <w:num w:numId="10" w16cid:durableId="1311405057">
     <w:abstractNumId w:val="7"/>
   </w:num>
   <w:num w:numId="11" w16cid:durableId="1093549403">
-    <w:abstractNumId w:val="12"/>
+    <w:abstractNumId w:val="14"/>
   </w:num>
   <w:num w:numId="12" w16cid:durableId="486750079">
-    <w:abstractNumId w:val="25"/>
+    <w:abstractNumId w:val="28"/>
   </w:num>
   <w:num w:numId="13" w16cid:durableId="1169521507">
     <w:abstractNumId w:val="11"/>
@@ -5027,22 +8255,22 @@
     <w:abstractNumId w:val="6"/>
   </w:num>
   <w:num w:numId="15" w16cid:durableId="378743820">
-    <w:abstractNumId w:val="16"/>
+    <w:abstractNumId w:val="18"/>
   </w:num>
   <w:num w:numId="16" w16cid:durableId="1845243581">
-    <w:abstractNumId w:val="28"/>
+    <w:abstractNumId w:val="31"/>
   </w:num>
   <w:num w:numId="17" w16cid:durableId="1571886910">
     <w:abstractNumId w:val="8"/>
   </w:num>
   <w:num w:numId="18" w16cid:durableId="1910311730">
-    <w:abstractNumId w:val="24"/>
+    <w:abstractNumId w:val="26"/>
   </w:num>
   <w:num w:numId="19" w16cid:durableId="323361880">
     <w:abstractNumId w:val="5"/>
   </w:num>
   <w:num w:numId="20" w16cid:durableId="810755531">
-    <w:abstractNumId w:val="20"/>
+    <w:abstractNumId w:val="22"/>
   </w:num>
   <w:num w:numId="21" w16cid:durableId="1223835780">
     <w:abstractNumId w:val="10"/>
@@ -5057,19 +8285,28 @@
     <w:abstractNumId w:val="2"/>
   </w:num>
   <w:num w:numId="25" w16cid:durableId="362830350">
-    <w:abstractNumId w:val="21"/>
+    <w:abstractNumId w:val="23"/>
   </w:num>
   <w:num w:numId="26" w16cid:durableId="279915987">
-    <w:abstractNumId w:val="18"/>
+    <w:abstractNumId w:val="20"/>
   </w:num>
   <w:num w:numId="27" w16cid:durableId="588079459">
-    <w:abstractNumId w:val="26"/>
+    <w:abstractNumId w:val="29"/>
   </w:num>
   <w:num w:numId="28" w16cid:durableId="1582331816">
+    <w:abstractNumId w:val="30"/>
+  </w:num>
+  <w:num w:numId="29" w16cid:durableId="2033920228">
+    <w:abstractNumId w:val="25"/>
+  </w:num>
+  <w:num w:numId="30" w16cid:durableId="1790775727">
+    <w:abstractNumId w:val="12"/>
+  </w:num>
+  <w:num w:numId="31" w16cid:durableId="2052218252">
     <w:abstractNumId w:val="27"/>
   </w:num>
-  <w:num w:numId="29" w16cid:durableId="2033920228">
-    <w:abstractNumId w:val="23"/>
+  <w:num w:numId="32" w16cid:durableId="882331413">
+    <w:abstractNumId w:val="13"/>
   </w:num>
 </w:numbering>
 </file>
@@ -5495,7 +8732,6 @@
   <w:style w:type="character" w:default="1" w:styleId="Absatz-Standardschriftart">
     <w:name w:val="Default Paragraph Font"/>
     <w:uiPriority w:val="1"/>
-    <w:semiHidden/>
     <w:unhideWhenUsed/>
   </w:style>
   <w:style w:type="table" w:default="1" w:styleId="NormaleTabelle">

</xml_diff>